<commit_message>
FInal results per Lara
</commit_message>
<xml_diff>
--- a/output/table01.docx
+++ b/output/table01.docx
@@ -665,139 +665,139 @@
                 <w:szCs w:val="22"/>
                 <w:color w:val="000000"/>
               </w:rPr>
-              <w:t xml:space="preserve">524 (100%)</w:t>
-            </w:r>
-          </w:p>
-        </w:tc>
-        <w:tc>
-          <w:tcPr>
-            <w:tcBorders>
-              <w:bottom w:val="none" w:sz="0" w:space="0" w:color="000000"/>
-              <w:top w:val="none" w:sz="0" w:space="0" w:color="000000"/>
-              <w:left w:val="none" w:sz="0" w:space="0" w:color="000000"/>
-              <w:right w:val="none" w:sz="0" w:space="0" w:color="000000"/>
-            </w:tcBorders>
-            <w:shd w:val="clear" w:color="auto" w:fill="FFFFFF"/>
-            <w:tcMar>
-              <w:top w:w="0" w:type="dxa"/>
-              <w:bottom w:w="0" w:type="dxa"/>
-              <w:left w:w="0" w:type="dxa"/>
-              <w:right w:w="0" w:type="dxa"/>
-            </w:tcMar>
-            <w:vAlign w:val="top"/>
-          </w:tcPr>
-          <w:p>
-            <w:pPr>
-              <w:pStyle w:val="Normal"/>
-              <w:jc w:val="center"/>
-              <w:pBdr>
-                <w:bottom w:val="none" w:sz="0" w:space="0" w:color="000000"/>
-                <w:top w:val="none" w:sz="0" w:space="0" w:color="000000"/>
-                <w:left w:val="none" w:sz="0" w:space="0" w:color="000000"/>
-                <w:right w:val="none" w:sz="0" w:space="0" w:color="000000"/>
-              </w:pBdr>
-              <w:spacing w:after="100" w:before="100" w:line="240"/>
-              <w:ind w:left="100" w:right="100" w:firstLine="0" w:firstLineChars="0"/>
-            </w:pPr>
-            <w:r>
-              <w:rPr>
-                <w:rFonts w:ascii="Helvetica" w:hAnsi="Helvetica" w:eastAsia="Helvetica" w:cs="Helvetica"/>
-                <w:i w:val="false"/>
-                <w:b w:val="false"/>
-                <w:u w:val="none"/>
-                <w:sz w:val="22"/>
-                <w:szCs w:val="22"/>
-                <w:color w:val="000000"/>
-              </w:rPr>
-              <w:t xml:space="preserve">14 (2.7%)</w:t>
-            </w:r>
-          </w:p>
-        </w:tc>
-        <w:tc>
-          <w:tcPr>
-            <w:tcBorders>
-              <w:bottom w:val="none" w:sz="0" w:space="0" w:color="000000"/>
-              <w:top w:val="none" w:sz="0" w:space="0" w:color="000000"/>
-              <w:left w:val="none" w:sz="0" w:space="0" w:color="000000"/>
-              <w:right w:val="none" w:sz="0" w:space="0" w:color="000000"/>
-            </w:tcBorders>
-            <w:shd w:val="clear" w:color="auto" w:fill="FFFFFF"/>
-            <w:tcMar>
-              <w:top w:w="0" w:type="dxa"/>
-              <w:bottom w:w="0" w:type="dxa"/>
-              <w:left w:w="0" w:type="dxa"/>
-              <w:right w:w="0" w:type="dxa"/>
-            </w:tcMar>
-            <w:vAlign w:val="top"/>
-          </w:tcPr>
-          <w:p>
-            <w:pPr>
-              <w:pStyle w:val="Normal"/>
-              <w:jc w:val="center"/>
-              <w:pBdr>
-                <w:bottom w:val="none" w:sz="0" w:space="0" w:color="000000"/>
-                <w:top w:val="none" w:sz="0" w:space="0" w:color="000000"/>
-                <w:left w:val="none" w:sz="0" w:space="0" w:color="000000"/>
-                <w:right w:val="none" w:sz="0" w:space="0" w:color="000000"/>
-              </w:pBdr>
-              <w:spacing w:after="100" w:before="100" w:line="240"/>
-              <w:ind w:left="100" w:right="100" w:firstLine="0" w:firstLineChars="0"/>
-            </w:pPr>
-            <w:r>
-              <w:rPr>
-                <w:rFonts w:ascii="Helvetica" w:hAnsi="Helvetica" w:eastAsia="Helvetica" w:cs="Helvetica"/>
-                <w:i w:val="false"/>
-                <w:b w:val="false"/>
-                <w:u w:val="none"/>
-                <w:sz w:val="22"/>
-                <w:szCs w:val="22"/>
-                <w:color w:val="000000"/>
-              </w:rPr>
-              <w:t xml:space="preserve">407 (78%)</w:t>
-            </w:r>
-          </w:p>
-        </w:tc>
-        <w:tc>
-          <w:tcPr>
-            <w:tcBorders>
-              <w:bottom w:val="none" w:sz="0" w:space="0" w:color="000000"/>
-              <w:top w:val="none" w:sz="0" w:space="0" w:color="000000"/>
-              <w:left w:val="none" w:sz="0" w:space="0" w:color="000000"/>
-              <w:right w:val="none" w:sz="0" w:space="0" w:color="000000"/>
-            </w:tcBorders>
-            <w:shd w:val="clear" w:color="auto" w:fill="FFFFFF"/>
-            <w:tcMar>
-              <w:top w:w="0" w:type="dxa"/>
-              <w:bottom w:w="0" w:type="dxa"/>
-              <w:left w:w="0" w:type="dxa"/>
-              <w:right w:w="0" w:type="dxa"/>
-            </w:tcMar>
-            <w:vAlign w:val="top"/>
-          </w:tcPr>
-          <w:p>
-            <w:pPr>
-              <w:pStyle w:val="Normal"/>
-              <w:jc w:val="center"/>
-              <w:pBdr>
-                <w:bottom w:val="none" w:sz="0" w:space="0" w:color="000000"/>
-                <w:top w:val="none" w:sz="0" w:space="0" w:color="000000"/>
-                <w:left w:val="none" w:sz="0" w:space="0" w:color="000000"/>
-                <w:right w:val="none" w:sz="0" w:space="0" w:color="000000"/>
-              </w:pBdr>
-              <w:spacing w:after="100" w:before="100" w:line="240"/>
-              <w:ind w:left="100" w:right="100" w:firstLine="0" w:firstLineChars="0"/>
-            </w:pPr>
-            <w:r>
-              <w:rPr>
-                <w:rFonts w:ascii="Helvetica" w:hAnsi="Helvetica" w:eastAsia="Helvetica" w:cs="Helvetica"/>
-                <w:i w:val="false"/>
-                <w:b w:val="false"/>
-                <w:u w:val="none"/>
-                <w:sz w:val="22"/>
-                <w:szCs w:val="22"/>
-                <w:color w:val="000000"/>
-              </w:rPr>
-              <w:t xml:space="preserve">103 (20%)</w:t>
+              <w:t xml:space="preserve">524 (44%)</w:t>
+            </w:r>
+          </w:p>
+        </w:tc>
+        <w:tc>
+          <w:tcPr>
+            <w:tcBorders>
+              <w:bottom w:val="none" w:sz="0" w:space="0" w:color="000000"/>
+              <w:top w:val="none" w:sz="0" w:space="0" w:color="000000"/>
+              <w:left w:val="none" w:sz="0" w:space="0" w:color="000000"/>
+              <w:right w:val="none" w:sz="0" w:space="0" w:color="000000"/>
+            </w:tcBorders>
+            <w:shd w:val="clear" w:color="auto" w:fill="FFFFFF"/>
+            <w:tcMar>
+              <w:top w:w="0" w:type="dxa"/>
+              <w:bottom w:w="0" w:type="dxa"/>
+              <w:left w:w="0" w:type="dxa"/>
+              <w:right w:w="0" w:type="dxa"/>
+            </w:tcMar>
+            <w:vAlign w:val="top"/>
+          </w:tcPr>
+          <w:p>
+            <w:pPr>
+              <w:pStyle w:val="Normal"/>
+              <w:jc w:val="center"/>
+              <w:pBdr>
+                <w:bottom w:val="none" w:sz="0" w:space="0" w:color="000000"/>
+                <w:top w:val="none" w:sz="0" w:space="0" w:color="000000"/>
+                <w:left w:val="none" w:sz="0" w:space="0" w:color="000000"/>
+                <w:right w:val="none" w:sz="0" w:space="0" w:color="000000"/>
+              </w:pBdr>
+              <w:spacing w:after="100" w:before="100" w:line="240"/>
+              <w:ind w:left="100" w:right="100" w:firstLine="0" w:firstLineChars="0"/>
+            </w:pPr>
+            <w:r>
+              <w:rPr>
+                <w:rFonts w:ascii="Helvetica" w:hAnsi="Helvetica" w:eastAsia="Helvetica" w:cs="Helvetica"/>
+                <w:i w:val="false"/>
+                <w:b w:val="false"/>
+                <w:u w:val="none"/>
+                <w:sz w:val="22"/>
+                <w:szCs w:val="22"/>
+                <w:color w:val="000000"/>
+              </w:rPr>
+              <w:t xml:space="preserve">14 (34%)</w:t>
+            </w:r>
+          </w:p>
+        </w:tc>
+        <w:tc>
+          <w:tcPr>
+            <w:tcBorders>
+              <w:bottom w:val="none" w:sz="0" w:space="0" w:color="000000"/>
+              <w:top w:val="none" w:sz="0" w:space="0" w:color="000000"/>
+              <w:left w:val="none" w:sz="0" w:space="0" w:color="000000"/>
+              <w:right w:val="none" w:sz="0" w:space="0" w:color="000000"/>
+            </w:tcBorders>
+            <w:shd w:val="clear" w:color="auto" w:fill="FFFFFF"/>
+            <w:tcMar>
+              <w:top w:w="0" w:type="dxa"/>
+              <w:bottom w:w="0" w:type="dxa"/>
+              <w:left w:w="0" w:type="dxa"/>
+              <w:right w:w="0" w:type="dxa"/>
+            </w:tcMar>
+            <w:vAlign w:val="top"/>
+          </w:tcPr>
+          <w:p>
+            <w:pPr>
+              <w:pStyle w:val="Normal"/>
+              <w:jc w:val="center"/>
+              <w:pBdr>
+                <w:bottom w:val="none" w:sz="0" w:space="0" w:color="000000"/>
+                <w:top w:val="none" w:sz="0" w:space="0" w:color="000000"/>
+                <w:left w:val="none" w:sz="0" w:space="0" w:color="000000"/>
+                <w:right w:val="none" w:sz="0" w:space="0" w:color="000000"/>
+              </w:pBdr>
+              <w:spacing w:after="100" w:before="100" w:line="240"/>
+              <w:ind w:left="100" w:right="100" w:firstLine="0" w:firstLineChars="0"/>
+            </w:pPr>
+            <w:r>
+              <w:rPr>
+                <w:rFonts w:ascii="Helvetica" w:hAnsi="Helvetica" w:eastAsia="Helvetica" w:cs="Helvetica"/>
+                <w:i w:val="false"/>
+                <w:b w:val="false"/>
+                <w:u w:val="none"/>
+                <w:sz w:val="22"/>
+                <w:szCs w:val="22"/>
+                <w:color w:val="000000"/>
+              </w:rPr>
+              <w:t xml:space="preserve">407 (44%)</w:t>
+            </w:r>
+          </w:p>
+        </w:tc>
+        <w:tc>
+          <w:tcPr>
+            <w:tcBorders>
+              <w:bottom w:val="none" w:sz="0" w:space="0" w:color="000000"/>
+              <w:top w:val="none" w:sz="0" w:space="0" w:color="000000"/>
+              <w:left w:val="none" w:sz="0" w:space="0" w:color="000000"/>
+              <w:right w:val="none" w:sz="0" w:space="0" w:color="000000"/>
+            </w:tcBorders>
+            <w:shd w:val="clear" w:color="auto" w:fill="FFFFFF"/>
+            <w:tcMar>
+              <w:top w:w="0" w:type="dxa"/>
+              <w:bottom w:w="0" w:type="dxa"/>
+              <w:left w:w="0" w:type="dxa"/>
+              <w:right w:w="0" w:type="dxa"/>
+            </w:tcMar>
+            <w:vAlign w:val="top"/>
+          </w:tcPr>
+          <w:p>
+            <w:pPr>
+              <w:pStyle w:val="Normal"/>
+              <w:jc w:val="center"/>
+              <w:pBdr>
+                <w:bottom w:val="none" w:sz="0" w:space="0" w:color="000000"/>
+                <w:top w:val="none" w:sz="0" w:space="0" w:color="000000"/>
+                <w:left w:val="none" w:sz="0" w:space="0" w:color="000000"/>
+                <w:right w:val="none" w:sz="0" w:space="0" w:color="000000"/>
+              </w:pBdr>
+              <w:spacing w:after="100" w:before="100" w:line="240"/>
+              <w:ind w:left="100" w:right="100" w:firstLine="0" w:firstLineChars="0"/>
+            </w:pPr>
+            <w:r>
+              <w:rPr>
+                <w:rFonts w:ascii="Helvetica" w:hAnsi="Helvetica" w:eastAsia="Helvetica" w:cs="Helvetica"/>
+                <w:i w:val="false"/>
+                <w:b w:val="false"/>
+                <w:u w:val="none"/>
+                <w:sz w:val="22"/>
+                <w:szCs w:val="22"/>
+                <w:color w:val="000000"/>
+              </w:rPr>
+              <w:t xml:space="preserve">103 (42%)</w:t>
             </w:r>
           </w:p>
         </w:tc>
@@ -891,139 +891,139 @@
                 <w:szCs w:val="22"/>
                 <w:color w:val="000000"/>
               </w:rPr>
-              <w:t xml:space="preserve">677 (100%)</w:t>
-            </w:r>
-          </w:p>
-        </w:tc>
-        <w:tc>
-          <w:tcPr>
-            <w:tcBorders>
-              <w:bottom w:val="none" w:sz="0" w:space="0" w:color="000000"/>
-              <w:top w:val="none" w:sz="0" w:space="0" w:color="000000"/>
-              <w:left w:val="none" w:sz="0" w:space="0" w:color="000000"/>
-              <w:right w:val="none" w:sz="0" w:space="0" w:color="000000"/>
-            </w:tcBorders>
-            <w:shd w:val="clear" w:color="auto" w:fill="FFFFFF"/>
-            <w:tcMar>
-              <w:top w:w="0" w:type="dxa"/>
-              <w:bottom w:w="0" w:type="dxa"/>
-              <w:left w:w="0" w:type="dxa"/>
-              <w:right w:w="0" w:type="dxa"/>
-            </w:tcMar>
-            <w:vAlign w:val="top"/>
-          </w:tcPr>
-          <w:p>
-            <w:pPr>
-              <w:pStyle w:val="Normal"/>
-              <w:jc w:val="center"/>
-              <w:pBdr>
-                <w:bottom w:val="none" w:sz="0" w:space="0" w:color="000000"/>
-                <w:top w:val="none" w:sz="0" w:space="0" w:color="000000"/>
-                <w:left w:val="none" w:sz="0" w:space="0" w:color="000000"/>
-                <w:right w:val="none" w:sz="0" w:space="0" w:color="000000"/>
-              </w:pBdr>
-              <w:spacing w:after="100" w:before="100" w:line="240"/>
-              <w:ind w:left="100" w:right="100" w:firstLine="0" w:firstLineChars="0"/>
-            </w:pPr>
-            <w:r>
-              <w:rPr>
-                <w:rFonts w:ascii="Helvetica" w:hAnsi="Helvetica" w:eastAsia="Helvetica" w:cs="Helvetica"/>
-                <w:i w:val="false"/>
-                <w:b w:val="false"/>
-                <w:u w:val="none"/>
-                <w:sz w:val="22"/>
-                <w:szCs w:val="22"/>
-                <w:color w:val="000000"/>
-              </w:rPr>
-              <w:t xml:space="preserve">27 (4.0%)</w:t>
-            </w:r>
-          </w:p>
-        </w:tc>
-        <w:tc>
-          <w:tcPr>
-            <w:tcBorders>
-              <w:bottom w:val="none" w:sz="0" w:space="0" w:color="000000"/>
-              <w:top w:val="none" w:sz="0" w:space="0" w:color="000000"/>
-              <w:left w:val="none" w:sz="0" w:space="0" w:color="000000"/>
-              <w:right w:val="none" w:sz="0" w:space="0" w:color="000000"/>
-            </w:tcBorders>
-            <w:shd w:val="clear" w:color="auto" w:fill="FFFFFF"/>
-            <w:tcMar>
-              <w:top w:w="0" w:type="dxa"/>
-              <w:bottom w:w="0" w:type="dxa"/>
-              <w:left w:w="0" w:type="dxa"/>
-              <w:right w:w="0" w:type="dxa"/>
-            </w:tcMar>
-            <w:vAlign w:val="top"/>
-          </w:tcPr>
-          <w:p>
-            <w:pPr>
-              <w:pStyle w:val="Normal"/>
-              <w:jc w:val="center"/>
-              <w:pBdr>
-                <w:bottom w:val="none" w:sz="0" w:space="0" w:color="000000"/>
-                <w:top w:val="none" w:sz="0" w:space="0" w:color="000000"/>
-                <w:left w:val="none" w:sz="0" w:space="0" w:color="000000"/>
-                <w:right w:val="none" w:sz="0" w:space="0" w:color="000000"/>
-              </w:pBdr>
-              <w:spacing w:after="100" w:before="100" w:line="240"/>
-              <w:ind w:left="100" w:right="100" w:firstLine="0" w:firstLineChars="0"/>
-            </w:pPr>
-            <w:r>
-              <w:rPr>
-                <w:rFonts w:ascii="Helvetica" w:hAnsi="Helvetica" w:eastAsia="Helvetica" w:cs="Helvetica"/>
-                <w:i w:val="false"/>
-                <w:b w:val="false"/>
-                <w:u w:val="none"/>
-                <w:sz w:val="22"/>
-                <w:szCs w:val="22"/>
-                <w:color w:val="000000"/>
-              </w:rPr>
-              <w:t xml:space="preserve">509 (75%)</w:t>
-            </w:r>
-          </w:p>
-        </w:tc>
-        <w:tc>
-          <w:tcPr>
-            <w:tcBorders>
-              <w:bottom w:val="none" w:sz="0" w:space="0" w:color="000000"/>
-              <w:top w:val="none" w:sz="0" w:space="0" w:color="000000"/>
-              <w:left w:val="none" w:sz="0" w:space="0" w:color="000000"/>
-              <w:right w:val="none" w:sz="0" w:space="0" w:color="000000"/>
-            </w:tcBorders>
-            <w:shd w:val="clear" w:color="auto" w:fill="FFFFFF"/>
-            <w:tcMar>
-              <w:top w:w="0" w:type="dxa"/>
-              <w:bottom w:w="0" w:type="dxa"/>
-              <w:left w:w="0" w:type="dxa"/>
-              <w:right w:w="0" w:type="dxa"/>
-            </w:tcMar>
-            <w:vAlign w:val="top"/>
-          </w:tcPr>
-          <w:p>
-            <w:pPr>
-              <w:pStyle w:val="Normal"/>
-              <w:jc w:val="center"/>
-              <w:pBdr>
-                <w:bottom w:val="none" w:sz="0" w:space="0" w:color="000000"/>
-                <w:top w:val="none" w:sz="0" w:space="0" w:color="000000"/>
-                <w:left w:val="none" w:sz="0" w:space="0" w:color="000000"/>
-                <w:right w:val="none" w:sz="0" w:space="0" w:color="000000"/>
-              </w:pBdr>
-              <w:spacing w:after="100" w:before="100" w:line="240"/>
-              <w:ind w:left="100" w:right="100" w:firstLine="0" w:firstLineChars="0"/>
-            </w:pPr>
-            <w:r>
-              <w:rPr>
-                <w:rFonts w:ascii="Helvetica" w:hAnsi="Helvetica" w:eastAsia="Helvetica" w:cs="Helvetica"/>
-                <w:i w:val="false"/>
-                <w:b w:val="false"/>
-                <w:u w:val="none"/>
-                <w:sz w:val="22"/>
-                <w:szCs w:val="22"/>
-                <w:color w:val="000000"/>
-              </w:rPr>
-              <w:t xml:space="preserve">141 (21%)</w:t>
+              <w:t xml:space="preserve">677 (56%)</w:t>
+            </w:r>
+          </w:p>
+        </w:tc>
+        <w:tc>
+          <w:tcPr>
+            <w:tcBorders>
+              <w:bottom w:val="none" w:sz="0" w:space="0" w:color="000000"/>
+              <w:top w:val="none" w:sz="0" w:space="0" w:color="000000"/>
+              <w:left w:val="none" w:sz="0" w:space="0" w:color="000000"/>
+              <w:right w:val="none" w:sz="0" w:space="0" w:color="000000"/>
+            </w:tcBorders>
+            <w:shd w:val="clear" w:color="auto" w:fill="FFFFFF"/>
+            <w:tcMar>
+              <w:top w:w="0" w:type="dxa"/>
+              <w:bottom w:w="0" w:type="dxa"/>
+              <w:left w:w="0" w:type="dxa"/>
+              <w:right w:w="0" w:type="dxa"/>
+            </w:tcMar>
+            <w:vAlign w:val="top"/>
+          </w:tcPr>
+          <w:p>
+            <w:pPr>
+              <w:pStyle w:val="Normal"/>
+              <w:jc w:val="center"/>
+              <w:pBdr>
+                <w:bottom w:val="none" w:sz="0" w:space="0" w:color="000000"/>
+                <w:top w:val="none" w:sz="0" w:space="0" w:color="000000"/>
+                <w:left w:val="none" w:sz="0" w:space="0" w:color="000000"/>
+                <w:right w:val="none" w:sz="0" w:space="0" w:color="000000"/>
+              </w:pBdr>
+              <w:spacing w:after="100" w:before="100" w:line="240"/>
+              <w:ind w:left="100" w:right="100" w:firstLine="0" w:firstLineChars="0"/>
+            </w:pPr>
+            <w:r>
+              <w:rPr>
+                <w:rFonts w:ascii="Helvetica" w:hAnsi="Helvetica" w:eastAsia="Helvetica" w:cs="Helvetica"/>
+                <w:i w:val="false"/>
+                <w:b w:val="false"/>
+                <w:u w:val="none"/>
+                <w:sz w:val="22"/>
+                <w:szCs w:val="22"/>
+                <w:color w:val="000000"/>
+              </w:rPr>
+              <w:t xml:space="preserve">27 (66%)</w:t>
+            </w:r>
+          </w:p>
+        </w:tc>
+        <w:tc>
+          <w:tcPr>
+            <w:tcBorders>
+              <w:bottom w:val="none" w:sz="0" w:space="0" w:color="000000"/>
+              <w:top w:val="none" w:sz="0" w:space="0" w:color="000000"/>
+              <w:left w:val="none" w:sz="0" w:space="0" w:color="000000"/>
+              <w:right w:val="none" w:sz="0" w:space="0" w:color="000000"/>
+            </w:tcBorders>
+            <w:shd w:val="clear" w:color="auto" w:fill="FFFFFF"/>
+            <w:tcMar>
+              <w:top w:w="0" w:type="dxa"/>
+              <w:bottom w:w="0" w:type="dxa"/>
+              <w:left w:w="0" w:type="dxa"/>
+              <w:right w:w="0" w:type="dxa"/>
+            </w:tcMar>
+            <w:vAlign w:val="top"/>
+          </w:tcPr>
+          <w:p>
+            <w:pPr>
+              <w:pStyle w:val="Normal"/>
+              <w:jc w:val="center"/>
+              <w:pBdr>
+                <w:bottom w:val="none" w:sz="0" w:space="0" w:color="000000"/>
+                <w:top w:val="none" w:sz="0" w:space="0" w:color="000000"/>
+                <w:left w:val="none" w:sz="0" w:space="0" w:color="000000"/>
+                <w:right w:val="none" w:sz="0" w:space="0" w:color="000000"/>
+              </w:pBdr>
+              <w:spacing w:after="100" w:before="100" w:line="240"/>
+              <w:ind w:left="100" w:right="100" w:firstLine="0" w:firstLineChars="0"/>
+            </w:pPr>
+            <w:r>
+              <w:rPr>
+                <w:rFonts w:ascii="Helvetica" w:hAnsi="Helvetica" w:eastAsia="Helvetica" w:cs="Helvetica"/>
+                <w:i w:val="false"/>
+                <w:b w:val="false"/>
+                <w:u w:val="none"/>
+                <w:sz w:val="22"/>
+                <w:szCs w:val="22"/>
+                <w:color w:val="000000"/>
+              </w:rPr>
+              <w:t xml:space="preserve">509 (56%)</w:t>
+            </w:r>
+          </w:p>
+        </w:tc>
+        <w:tc>
+          <w:tcPr>
+            <w:tcBorders>
+              <w:bottom w:val="none" w:sz="0" w:space="0" w:color="000000"/>
+              <w:top w:val="none" w:sz="0" w:space="0" w:color="000000"/>
+              <w:left w:val="none" w:sz="0" w:space="0" w:color="000000"/>
+              <w:right w:val="none" w:sz="0" w:space="0" w:color="000000"/>
+            </w:tcBorders>
+            <w:shd w:val="clear" w:color="auto" w:fill="FFFFFF"/>
+            <w:tcMar>
+              <w:top w:w="0" w:type="dxa"/>
+              <w:bottom w:w="0" w:type="dxa"/>
+              <w:left w:w="0" w:type="dxa"/>
+              <w:right w:w="0" w:type="dxa"/>
+            </w:tcMar>
+            <w:vAlign w:val="top"/>
+          </w:tcPr>
+          <w:p>
+            <w:pPr>
+              <w:pStyle w:val="Normal"/>
+              <w:jc w:val="center"/>
+              <w:pBdr>
+                <w:bottom w:val="none" w:sz="0" w:space="0" w:color="000000"/>
+                <w:top w:val="none" w:sz="0" w:space="0" w:color="000000"/>
+                <w:left w:val="none" w:sz="0" w:space="0" w:color="000000"/>
+                <w:right w:val="none" w:sz="0" w:space="0" w:color="000000"/>
+              </w:pBdr>
+              <w:spacing w:after="100" w:before="100" w:line="240"/>
+              <w:ind w:left="100" w:right="100" w:firstLine="0" w:firstLineChars="0"/>
+            </w:pPr>
+            <w:r>
+              <w:rPr>
+                <w:rFonts w:ascii="Helvetica" w:hAnsi="Helvetica" w:eastAsia="Helvetica" w:cs="Helvetica"/>
+                <w:i w:val="false"/>
+                <w:b w:val="false"/>
+                <w:u w:val="none"/>
+                <w:sz w:val="22"/>
+                <w:szCs w:val="22"/>
+                <w:color w:val="000000"/>
+              </w:rPr>
+              <w:t xml:space="preserve">141 (58%)</w:t>
             </w:r>
           </w:p>
         </w:tc>
@@ -1343,139 +1343,139 @@
                 <w:szCs w:val="22"/>
                 <w:color w:val="000000"/>
               </w:rPr>
-              <w:t xml:space="preserve">641 (100%)</w:t>
-            </w:r>
-          </w:p>
-        </w:tc>
-        <w:tc>
-          <w:tcPr>
-            <w:tcBorders>
-              <w:bottom w:val="none" w:sz="0" w:space="0" w:color="000000"/>
-              <w:top w:val="none" w:sz="0" w:space="0" w:color="000000"/>
-              <w:left w:val="none" w:sz="0" w:space="0" w:color="000000"/>
-              <w:right w:val="none" w:sz="0" w:space="0" w:color="000000"/>
-            </w:tcBorders>
-            <w:shd w:val="clear" w:color="auto" w:fill="FFFFFF"/>
-            <w:tcMar>
-              <w:top w:w="0" w:type="dxa"/>
-              <w:bottom w:w="0" w:type="dxa"/>
-              <w:left w:w="0" w:type="dxa"/>
-              <w:right w:w="0" w:type="dxa"/>
-            </w:tcMar>
-            <w:vAlign w:val="top"/>
-          </w:tcPr>
-          <w:p>
-            <w:pPr>
-              <w:pStyle w:val="Normal"/>
-              <w:jc w:val="center"/>
-              <w:pBdr>
-                <w:bottom w:val="none" w:sz="0" w:space="0" w:color="000000"/>
-                <w:top w:val="none" w:sz="0" w:space="0" w:color="000000"/>
-                <w:left w:val="none" w:sz="0" w:space="0" w:color="000000"/>
-                <w:right w:val="none" w:sz="0" w:space="0" w:color="000000"/>
-              </w:pBdr>
-              <w:spacing w:after="100" w:before="100" w:line="240"/>
-              <w:ind w:left="100" w:right="100" w:firstLine="0" w:firstLineChars="0"/>
-            </w:pPr>
-            <w:r>
-              <w:rPr>
-                <w:rFonts w:ascii="Helvetica" w:hAnsi="Helvetica" w:eastAsia="Helvetica" w:cs="Helvetica"/>
-                <w:i w:val="false"/>
-                <w:b w:val="false"/>
-                <w:u w:val="none"/>
-                <w:sz w:val="22"/>
-                <w:szCs w:val="22"/>
-                <w:color w:val="000000"/>
-              </w:rPr>
-              <w:t xml:space="preserve">33 (5.1%)</w:t>
-            </w:r>
-          </w:p>
-        </w:tc>
-        <w:tc>
-          <w:tcPr>
-            <w:tcBorders>
-              <w:bottom w:val="none" w:sz="0" w:space="0" w:color="000000"/>
-              <w:top w:val="none" w:sz="0" w:space="0" w:color="000000"/>
-              <w:left w:val="none" w:sz="0" w:space="0" w:color="000000"/>
-              <w:right w:val="none" w:sz="0" w:space="0" w:color="000000"/>
-            </w:tcBorders>
-            <w:shd w:val="clear" w:color="auto" w:fill="FFFFFF"/>
-            <w:tcMar>
-              <w:top w:w="0" w:type="dxa"/>
-              <w:bottom w:w="0" w:type="dxa"/>
-              <w:left w:w="0" w:type="dxa"/>
-              <w:right w:w="0" w:type="dxa"/>
-            </w:tcMar>
-            <w:vAlign w:val="top"/>
-          </w:tcPr>
-          <w:p>
-            <w:pPr>
-              <w:pStyle w:val="Normal"/>
-              <w:jc w:val="center"/>
-              <w:pBdr>
-                <w:bottom w:val="none" w:sz="0" w:space="0" w:color="000000"/>
-                <w:top w:val="none" w:sz="0" w:space="0" w:color="000000"/>
-                <w:left w:val="none" w:sz="0" w:space="0" w:color="000000"/>
-                <w:right w:val="none" w:sz="0" w:space="0" w:color="000000"/>
-              </w:pBdr>
-              <w:spacing w:after="100" w:before="100" w:line="240"/>
-              <w:ind w:left="100" w:right="100" w:firstLine="0" w:firstLineChars="0"/>
-            </w:pPr>
-            <w:r>
-              <w:rPr>
-                <w:rFonts w:ascii="Helvetica" w:hAnsi="Helvetica" w:eastAsia="Helvetica" w:cs="Helvetica"/>
-                <w:i w:val="false"/>
-                <w:b w:val="false"/>
-                <w:u w:val="none"/>
-                <w:sz w:val="22"/>
-                <w:szCs w:val="22"/>
-                <w:color w:val="000000"/>
-              </w:rPr>
-              <w:t xml:space="preserve">491 (77%)</w:t>
-            </w:r>
-          </w:p>
-        </w:tc>
-        <w:tc>
-          <w:tcPr>
-            <w:tcBorders>
-              <w:bottom w:val="none" w:sz="0" w:space="0" w:color="000000"/>
-              <w:top w:val="none" w:sz="0" w:space="0" w:color="000000"/>
-              <w:left w:val="none" w:sz="0" w:space="0" w:color="000000"/>
-              <w:right w:val="none" w:sz="0" w:space="0" w:color="000000"/>
-            </w:tcBorders>
-            <w:shd w:val="clear" w:color="auto" w:fill="FFFFFF"/>
-            <w:tcMar>
-              <w:top w:w="0" w:type="dxa"/>
-              <w:bottom w:w="0" w:type="dxa"/>
-              <w:left w:w="0" w:type="dxa"/>
-              <w:right w:w="0" w:type="dxa"/>
-            </w:tcMar>
-            <w:vAlign w:val="top"/>
-          </w:tcPr>
-          <w:p>
-            <w:pPr>
-              <w:pStyle w:val="Normal"/>
-              <w:jc w:val="center"/>
-              <w:pBdr>
-                <w:bottom w:val="none" w:sz="0" w:space="0" w:color="000000"/>
-                <w:top w:val="none" w:sz="0" w:space="0" w:color="000000"/>
-                <w:left w:val="none" w:sz="0" w:space="0" w:color="000000"/>
-                <w:right w:val="none" w:sz="0" w:space="0" w:color="000000"/>
-              </w:pBdr>
-              <w:spacing w:after="100" w:before="100" w:line="240"/>
-              <w:ind w:left="100" w:right="100" w:firstLine="0" w:firstLineChars="0"/>
-            </w:pPr>
-            <w:r>
-              <w:rPr>
-                <w:rFonts w:ascii="Helvetica" w:hAnsi="Helvetica" w:eastAsia="Helvetica" w:cs="Helvetica"/>
-                <w:i w:val="false"/>
-                <w:b w:val="false"/>
-                <w:u w:val="none"/>
-                <w:sz w:val="22"/>
-                <w:szCs w:val="22"/>
-                <w:color w:val="000000"/>
-              </w:rPr>
-              <w:t xml:space="preserve">117 (18%)</w:t>
+              <w:t xml:space="preserve">641 (53%)</w:t>
+            </w:r>
+          </w:p>
+        </w:tc>
+        <w:tc>
+          <w:tcPr>
+            <w:tcBorders>
+              <w:bottom w:val="none" w:sz="0" w:space="0" w:color="000000"/>
+              <w:top w:val="none" w:sz="0" w:space="0" w:color="000000"/>
+              <w:left w:val="none" w:sz="0" w:space="0" w:color="000000"/>
+              <w:right w:val="none" w:sz="0" w:space="0" w:color="000000"/>
+            </w:tcBorders>
+            <w:shd w:val="clear" w:color="auto" w:fill="FFFFFF"/>
+            <w:tcMar>
+              <w:top w:w="0" w:type="dxa"/>
+              <w:bottom w:w="0" w:type="dxa"/>
+              <w:left w:w="0" w:type="dxa"/>
+              <w:right w:w="0" w:type="dxa"/>
+            </w:tcMar>
+            <w:vAlign w:val="top"/>
+          </w:tcPr>
+          <w:p>
+            <w:pPr>
+              <w:pStyle w:val="Normal"/>
+              <w:jc w:val="center"/>
+              <w:pBdr>
+                <w:bottom w:val="none" w:sz="0" w:space="0" w:color="000000"/>
+                <w:top w:val="none" w:sz="0" w:space="0" w:color="000000"/>
+                <w:left w:val="none" w:sz="0" w:space="0" w:color="000000"/>
+                <w:right w:val="none" w:sz="0" w:space="0" w:color="000000"/>
+              </w:pBdr>
+              <w:spacing w:after="100" w:before="100" w:line="240"/>
+              <w:ind w:left="100" w:right="100" w:firstLine="0" w:firstLineChars="0"/>
+            </w:pPr>
+            <w:r>
+              <w:rPr>
+                <w:rFonts w:ascii="Helvetica" w:hAnsi="Helvetica" w:eastAsia="Helvetica" w:cs="Helvetica"/>
+                <w:i w:val="false"/>
+                <w:b w:val="false"/>
+                <w:u w:val="none"/>
+                <w:sz w:val="22"/>
+                <w:szCs w:val="22"/>
+                <w:color w:val="000000"/>
+              </w:rPr>
+              <w:t xml:space="preserve">33 (80%)</w:t>
+            </w:r>
+          </w:p>
+        </w:tc>
+        <w:tc>
+          <w:tcPr>
+            <w:tcBorders>
+              <w:bottom w:val="none" w:sz="0" w:space="0" w:color="000000"/>
+              <w:top w:val="none" w:sz="0" w:space="0" w:color="000000"/>
+              <w:left w:val="none" w:sz="0" w:space="0" w:color="000000"/>
+              <w:right w:val="none" w:sz="0" w:space="0" w:color="000000"/>
+            </w:tcBorders>
+            <w:shd w:val="clear" w:color="auto" w:fill="FFFFFF"/>
+            <w:tcMar>
+              <w:top w:w="0" w:type="dxa"/>
+              <w:bottom w:w="0" w:type="dxa"/>
+              <w:left w:w="0" w:type="dxa"/>
+              <w:right w:w="0" w:type="dxa"/>
+            </w:tcMar>
+            <w:vAlign w:val="top"/>
+          </w:tcPr>
+          <w:p>
+            <w:pPr>
+              <w:pStyle w:val="Normal"/>
+              <w:jc w:val="center"/>
+              <w:pBdr>
+                <w:bottom w:val="none" w:sz="0" w:space="0" w:color="000000"/>
+                <w:top w:val="none" w:sz="0" w:space="0" w:color="000000"/>
+                <w:left w:val="none" w:sz="0" w:space="0" w:color="000000"/>
+                <w:right w:val="none" w:sz="0" w:space="0" w:color="000000"/>
+              </w:pBdr>
+              <w:spacing w:after="100" w:before="100" w:line="240"/>
+              <w:ind w:left="100" w:right="100" w:firstLine="0" w:firstLineChars="0"/>
+            </w:pPr>
+            <w:r>
+              <w:rPr>
+                <w:rFonts w:ascii="Helvetica" w:hAnsi="Helvetica" w:eastAsia="Helvetica" w:cs="Helvetica"/>
+                <w:i w:val="false"/>
+                <w:b w:val="false"/>
+                <w:u w:val="none"/>
+                <w:sz w:val="22"/>
+                <w:szCs w:val="22"/>
+                <w:color w:val="000000"/>
+              </w:rPr>
+              <w:t xml:space="preserve">491 (54%)</w:t>
+            </w:r>
+          </w:p>
+        </w:tc>
+        <w:tc>
+          <w:tcPr>
+            <w:tcBorders>
+              <w:bottom w:val="none" w:sz="0" w:space="0" w:color="000000"/>
+              <w:top w:val="none" w:sz="0" w:space="0" w:color="000000"/>
+              <w:left w:val="none" w:sz="0" w:space="0" w:color="000000"/>
+              <w:right w:val="none" w:sz="0" w:space="0" w:color="000000"/>
+            </w:tcBorders>
+            <w:shd w:val="clear" w:color="auto" w:fill="FFFFFF"/>
+            <w:tcMar>
+              <w:top w:w="0" w:type="dxa"/>
+              <w:bottom w:w="0" w:type="dxa"/>
+              <w:left w:w="0" w:type="dxa"/>
+              <w:right w:w="0" w:type="dxa"/>
+            </w:tcMar>
+            <w:vAlign w:val="top"/>
+          </w:tcPr>
+          <w:p>
+            <w:pPr>
+              <w:pStyle w:val="Normal"/>
+              <w:jc w:val="center"/>
+              <w:pBdr>
+                <w:bottom w:val="none" w:sz="0" w:space="0" w:color="000000"/>
+                <w:top w:val="none" w:sz="0" w:space="0" w:color="000000"/>
+                <w:left w:val="none" w:sz="0" w:space="0" w:color="000000"/>
+                <w:right w:val="none" w:sz="0" w:space="0" w:color="000000"/>
+              </w:pBdr>
+              <w:spacing w:after="100" w:before="100" w:line="240"/>
+              <w:ind w:left="100" w:right="100" w:firstLine="0" w:firstLineChars="0"/>
+            </w:pPr>
+            <w:r>
+              <w:rPr>
+                <w:rFonts w:ascii="Helvetica" w:hAnsi="Helvetica" w:eastAsia="Helvetica" w:cs="Helvetica"/>
+                <w:i w:val="false"/>
+                <w:b w:val="false"/>
+                <w:u w:val="none"/>
+                <w:sz w:val="22"/>
+                <w:szCs w:val="22"/>
+                <w:color w:val="000000"/>
+              </w:rPr>
+              <w:t xml:space="preserve">117 (48%)</w:t>
             </w:r>
           </w:p>
         </w:tc>
@@ -1569,139 +1569,139 @@
                 <w:szCs w:val="22"/>
                 <w:color w:val="000000"/>
               </w:rPr>
-              <w:t xml:space="preserve">560 (100%)</w:t>
-            </w:r>
-          </w:p>
-        </w:tc>
-        <w:tc>
-          <w:tcPr>
-            <w:tcBorders>
-              <w:bottom w:val="none" w:sz="0" w:space="0" w:color="000000"/>
-              <w:top w:val="none" w:sz="0" w:space="0" w:color="000000"/>
-              <w:left w:val="none" w:sz="0" w:space="0" w:color="000000"/>
-              <w:right w:val="none" w:sz="0" w:space="0" w:color="000000"/>
-            </w:tcBorders>
-            <w:shd w:val="clear" w:color="auto" w:fill="FFFFFF"/>
-            <w:tcMar>
-              <w:top w:w="0" w:type="dxa"/>
-              <w:bottom w:w="0" w:type="dxa"/>
-              <w:left w:w="0" w:type="dxa"/>
-              <w:right w:w="0" w:type="dxa"/>
-            </w:tcMar>
-            <w:vAlign w:val="top"/>
-          </w:tcPr>
-          <w:p>
-            <w:pPr>
-              <w:pStyle w:val="Normal"/>
-              <w:jc w:val="center"/>
-              <w:pBdr>
-                <w:bottom w:val="none" w:sz="0" w:space="0" w:color="000000"/>
-                <w:top w:val="none" w:sz="0" w:space="0" w:color="000000"/>
-                <w:left w:val="none" w:sz="0" w:space="0" w:color="000000"/>
-                <w:right w:val="none" w:sz="0" w:space="0" w:color="000000"/>
-              </w:pBdr>
-              <w:spacing w:after="100" w:before="100" w:line="240"/>
-              <w:ind w:left="100" w:right="100" w:firstLine="0" w:firstLineChars="0"/>
-            </w:pPr>
-            <w:r>
-              <w:rPr>
-                <w:rFonts w:ascii="Helvetica" w:hAnsi="Helvetica" w:eastAsia="Helvetica" w:cs="Helvetica"/>
-                <w:i w:val="false"/>
-                <w:b w:val="false"/>
-                <w:u w:val="none"/>
-                <w:sz w:val="22"/>
-                <w:szCs w:val="22"/>
-                <w:color w:val="000000"/>
-              </w:rPr>
-              <w:t xml:space="preserve">8 (1.4%)</w:t>
-            </w:r>
-          </w:p>
-        </w:tc>
-        <w:tc>
-          <w:tcPr>
-            <w:tcBorders>
-              <w:bottom w:val="none" w:sz="0" w:space="0" w:color="000000"/>
-              <w:top w:val="none" w:sz="0" w:space="0" w:color="000000"/>
-              <w:left w:val="none" w:sz="0" w:space="0" w:color="000000"/>
-              <w:right w:val="none" w:sz="0" w:space="0" w:color="000000"/>
-            </w:tcBorders>
-            <w:shd w:val="clear" w:color="auto" w:fill="FFFFFF"/>
-            <w:tcMar>
-              <w:top w:w="0" w:type="dxa"/>
-              <w:bottom w:w="0" w:type="dxa"/>
-              <w:left w:w="0" w:type="dxa"/>
-              <w:right w:w="0" w:type="dxa"/>
-            </w:tcMar>
-            <w:vAlign w:val="top"/>
-          </w:tcPr>
-          <w:p>
-            <w:pPr>
-              <w:pStyle w:val="Normal"/>
-              <w:jc w:val="center"/>
-              <w:pBdr>
-                <w:bottom w:val="none" w:sz="0" w:space="0" w:color="000000"/>
-                <w:top w:val="none" w:sz="0" w:space="0" w:color="000000"/>
-                <w:left w:val="none" w:sz="0" w:space="0" w:color="000000"/>
-                <w:right w:val="none" w:sz="0" w:space="0" w:color="000000"/>
-              </w:pBdr>
-              <w:spacing w:after="100" w:before="100" w:line="240"/>
-              <w:ind w:left="100" w:right="100" w:firstLine="0" w:firstLineChars="0"/>
-            </w:pPr>
-            <w:r>
-              <w:rPr>
-                <w:rFonts w:ascii="Helvetica" w:hAnsi="Helvetica" w:eastAsia="Helvetica" w:cs="Helvetica"/>
-                <w:i w:val="false"/>
-                <w:b w:val="false"/>
-                <w:u w:val="none"/>
-                <w:sz w:val="22"/>
-                <w:szCs w:val="22"/>
-                <w:color w:val="000000"/>
-              </w:rPr>
-              <w:t xml:space="preserve">425 (76%)</w:t>
-            </w:r>
-          </w:p>
-        </w:tc>
-        <w:tc>
-          <w:tcPr>
-            <w:tcBorders>
-              <w:bottom w:val="none" w:sz="0" w:space="0" w:color="000000"/>
-              <w:top w:val="none" w:sz="0" w:space="0" w:color="000000"/>
-              <w:left w:val="none" w:sz="0" w:space="0" w:color="000000"/>
-              <w:right w:val="none" w:sz="0" w:space="0" w:color="000000"/>
-            </w:tcBorders>
-            <w:shd w:val="clear" w:color="auto" w:fill="FFFFFF"/>
-            <w:tcMar>
-              <w:top w:w="0" w:type="dxa"/>
-              <w:bottom w:w="0" w:type="dxa"/>
-              <w:left w:w="0" w:type="dxa"/>
-              <w:right w:w="0" w:type="dxa"/>
-            </w:tcMar>
-            <w:vAlign w:val="top"/>
-          </w:tcPr>
-          <w:p>
-            <w:pPr>
-              <w:pStyle w:val="Normal"/>
-              <w:jc w:val="center"/>
-              <w:pBdr>
-                <w:bottom w:val="none" w:sz="0" w:space="0" w:color="000000"/>
-                <w:top w:val="none" w:sz="0" w:space="0" w:color="000000"/>
-                <w:left w:val="none" w:sz="0" w:space="0" w:color="000000"/>
-                <w:right w:val="none" w:sz="0" w:space="0" w:color="000000"/>
-              </w:pBdr>
-              <w:spacing w:after="100" w:before="100" w:line="240"/>
-              <w:ind w:left="100" w:right="100" w:firstLine="0" w:firstLineChars="0"/>
-            </w:pPr>
-            <w:r>
-              <w:rPr>
-                <w:rFonts w:ascii="Helvetica" w:hAnsi="Helvetica" w:eastAsia="Helvetica" w:cs="Helvetica"/>
-                <w:i w:val="false"/>
-                <w:b w:val="false"/>
-                <w:u w:val="none"/>
-                <w:sz w:val="22"/>
-                <w:szCs w:val="22"/>
-                <w:color w:val="000000"/>
-              </w:rPr>
-              <w:t xml:space="preserve">127 (23%)</w:t>
+              <w:t xml:space="preserve">560 (47%)</w:t>
+            </w:r>
+          </w:p>
+        </w:tc>
+        <w:tc>
+          <w:tcPr>
+            <w:tcBorders>
+              <w:bottom w:val="none" w:sz="0" w:space="0" w:color="000000"/>
+              <w:top w:val="none" w:sz="0" w:space="0" w:color="000000"/>
+              <w:left w:val="none" w:sz="0" w:space="0" w:color="000000"/>
+              <w:right w:val="none" w:sz="0" w:space="0" w:color="000000"/>
+            </w:tcBorders>
+            <w:shd w:val="clear" w:color="auto" w:fill="FFFFFF"/>
+            <w:tcMar>
+              <w:top w:w="0" w:type="dxa"/>
+              <w:bottom w:w="0" w:type="dxa"/>
+              <w:left w:w="0" w:type="dxa"/>
+              <w:right w:w="0" w:type="dxa"/>
+            </w:tcMar>
+            <w:vAlign w:val="top"/>
+          </w:tcPr>
+          <w:p>
+            <w:pPr>
+              <w:pStyle w:val="Normal"/>
+              <w:jc w:val="center"/>
+              <w:pBdr>
+                <w:bottom w:val="none" w:sz="0" w:space="0" w:color="000000"/>
+                <w:top w:val="none" w:sz="0" w:space="0" w:color="000000"/>
+                <w:left w:val="none" w:sz="0" w:space="0" w:color="000000"/>
+                <w:right w:val="none" w:sz="0" w:space="0" w:color="000000"/>
+              </w:pBdr>
+              <w:spacing w:after="100" w:before="100" w:line="240"/>
+              <w:ind w:left="100" w:right="100" w:firstLine="0" w:firstLineChars="0"/>
+            </w:pPr>
+            <w:r>
+              <w:rPr>
+                <w:rFonts w:ascii="Helvetica" w:hAnsi="Helvetica" w:eastAsia="Helvetica" w:cs="Helvetica"/>
+                <w:i w:val="false"/>
+                <w:b w:val="false"/>
+                <w:u w:val="none"/>
+                <w:sz w:val="22"/>
+                <w:szCs w:val="22"/>
+                <w:color w:val="000000"/>
+              </w:rPr>
+              <w:t xml:space="preserve">8 (20%)</w:t>
+            </w:r>
+          </w:p>
+        </w:tc>
+        <w:tc>
+          <w:tcPr>
+            <w:tcBorders>
+              <w:bottom w:val="none" w:sz="0" w:space="0" w:color="000000"/>
+              <w:top w:val="none" w:sz="0" w:space="0" w:color="000000"/>
+              <w:left w:val="none" w:sz="0" w:space="0" w:color="000000"/>
+              <w:right w:val="none" w:sz="0" w:space="0" w:color="000000"/>
+            </w:tcBorders>
+            <w:shd w:val="clear" w:color="auto" w:fill="FFFFFF"/>
+            <w:tcMar>
+              <w:top w:w="0" w:type="dxa"/>
+              <w:bottom w:w="0" w:type="dxa"/>
+              <w:left w:w="0" w:type="dxa"/>
+              <w:right w:w="0" w:type="dxa"/>
+            </w:tcMar>
+            <w:vAlign w:val="top"/>
+          </w:tcPr>
+          <w:p>
+            <w:pPr>
+              <w:pStyle w:val="Normal"/>
+              <w:jc w:val="center"/>
+              <w:pBdr>
+                <w:bottom w:val="none" w:sz="0" w:space="0" w:color="000000"/>
+                <w:top w:val="none" w:sz="0" w:space="0" w:color="000000"/>
+                <w:left w:val="none" w:sz="0" w:space="0" w:color="000000"/>
+                <w:right w:val="none" w:sz="0" w:space="0" w:color="000000"/>
+              </w:pBdr>
+              <w:spacing w:after="100" w:before="100" w:line="240"/>
+              <w:ind w:left="100" w:right="100" w:firstLine="0" w:firstLineChars="0"/>
+            </w:pPr>
+            <w:r>
+              <w:rPr>
+                <w:rFonts w:ascii="Helvetica" w:hAnsi="Helvetica" w:eastAsia="Helvetica" w:cs="Helvetica"/>
+                <w:i w:val="false"/>
+                <w:b w:val="false"/>
+                <w:u w:val="none"/>
+                <w:sz w:val="22"/>
+                <w:szCs w:val="22"/>
+                <w:color w:val="000000"/>
+              </w:rPr>
+              <w:t xml:space="preserve">425 (46%)</w:t>
+            </w:r>
+          </w:p>
+        </w:tc>
+        <w:tc>
+          <w:tcPr>
+            <w:tcBorders>
+              <w:bottom w:val="none" w:sz="0" w:space="0" w:color="000000"/>
+              <w:top w:val="none" w:sz="0" w:space="0" w:color="000000"/>
+              <w:left w:val="none" w:sz="0" w:space="0" w:color="000000"/>
+              <w:right w:val="none" w:sz="0" w:space="0" w:color="000000"/>
+            </w:tcBorders>
+            <w:shd w:val="clear" w:color="auto" w:fill="FFFFFF"/>
+            <w:tcMar>
+              <w:top w:w="0" w:type="dxa"/>
+              <w:bottom w:w="0" w:type="dxa"/>
+              <w:left w:w="0" w:type="dxa"/>
+              <w:right w:w="0" w:type="dxa"/>
+            </w:tcMar>
+            <w:vAlign w:val="top"/>
+          </w:tcPr>
+          <w:p>
+            <w:pPr>
+              <w:pStyle w:val="Normal"/>
+              <w:jc w:val="center"/>
+              <w:pBdr>
+                <w:bottom w:val="none" w:sz="0" w:space="0" w:color="000000"/>
+                <w:top w:val="none" w:sz="0" w:space="0" w:color="000000"/>
+                <w:left w:val="none" w:sz="0" w:space="0" w:color="000000"/>
+                <w:right w:val="none" w:sz="0" w:space="0" w:color="000000"/>
+              </w:pBdr>
+              <w:spacing w:after="100" w:before="100" w:line="240"/>
+              <w:ind w:left="100" w:right="100" w:firstLine="0" w:firstLineChars="0"/>
+            </w:pPr>
+            <w:r>
+              <w:rPr>
+                <w:rFonts w:ascii="Helvetica" w:hAnsi="Helvetica" w:eastAsia="Helvetica" w:cs="Helvetica"/>
+                <w:i w:val="false"/>
+                <w:b w:val="false"/>
+                <w:u w:val="none"/>
+                <w:sz w:val="22"/>
+                <w:szCs w:val="22"/>
+                <w:color w:val="000000"/>
+              </w:rPr>
+              <w:t xml:space="preserve">127 (52%)</w:t>
             </w:r>
           </w:p>
         </w:tc>
@@ -1795,139 +1795,139 @@
                 <w:szCs w:val="22"/>
                 <w:color w:val="000000"/>
               </w:rPr>
-              <w:t xml:space="preserve">989 (100%)</w:t>
-            </w:r>
-          </w:p>
-        </w:tc>
-        <w:tc>
-          <w:tcPr>
-            <w:tcBorders>
-              <w:bottom w:val="none" w:sz="0" w:space="0" w:color="000000"/>
-              <w:top w:val="none" w:sz="0" w:space="0" w:color="000000"/>
-              <w:left w:val="none" w:sz="0" w:space="0" w:color="000000"/>
-              <w:right w:val="none" w:sz="0" w:space="0" w:color="000000"/>
-            </w:tcBorders>
-            <w:shd w:val="clear" w:color="auto" w:fill="FFFFFF"/>
-            <w:tcMar>
-              <w:top w:w="0" w:type="dxa"/>
-              <w:bottom w:w="0" w:type="dxa"/>
-              <w:left w:w="0" w:type="dxa"/>
-              <w:right w:w="0" w:type="dxa"/>
-            </w:tcMar>
-            <w:vAlign w:val="top"/>
-          </w:tcPr>
-          <w:p>
-            <w:pPr>
-              <w:pStyle w:val="Normal"/>
-              <w:jc w:val="center"/>
-              <w:pBdr>
-                <w:bottom w:val="none" w:sz="0" w:space="0" w:color="000000"/>
-                <w:top w:val="none" w:sz="0" w:space="0" w:color="000000"/>
-                <w:left w:val="none" w:sz="0" w:space="0" w:color="000000"/>
-                <w:right w:val="none" w:sz="0" w:space="0" w:color="000000"/>
-              </w:pBdr>
-              <w:spacing w:after="100" w:before="100" w:line="240"/>
-              <w:ind w:left="100" w:right="100" w:firstLine="0" w:firstLineChars="0"/>
-            </w:pPr>
-            <w:r>
-              <w:rPr>
-                <w:rFonts w:ascii="Helvetica" w:hAnsi="Helvetica" w:eastAsia="Helvetica" w:cs="Helvetica"/>
-                <w:i w:val="false"/>
-                <w:b w:val="false"/>
-                <w:u w:val="none"/>
-                <w:sz w:val="22"/>
-                <w:szCs w:val="22"/>
-                <w:color w:val="000000"/>
-              </w:rPr>
-              <w:t xml:space="preserve">37 (3.7%)</w:t>
-            </w:r>
-          </w:p>
-        </w:tc>
-        <w:tc>
-          <w:tcPr>
-            <w:tcBorders>
-              <w:bottom w:val="none" w:sz="0" w:space="0" w:color="000000"/>
-              <w:top w:val="none" w:sz="0" w:space="0" w:color="000000"/>
-              <w:left w:val="none" w:sz="0" w:space="0" w:color="000000"/>
-              <w:right w:val="none" w:sz="0" w:space="0" w:color="000000"/>
-            </w:tcBorders>
-            <w:shd w:val="clear" w:color="auto" w:fill="FFFFFF"/>
-            <w:tcMar>
-              <w:top w:w="0" w:type="dxa"/>
-              <w:bottom w:w="0" w:type="dxa"/>
-              <w:left w:w="0" w:type="dxa"/>
-              <w:right w:w="0" w:type="dxa"/>
-            </w:tcMar>
-            <w:vAlign w:val="top"/>
-          </w:tcPr>
-          <w:p>
-            <w:pPr>
-              <w:pStyle w:val="Normal"/>
-              <w:jc w:val="center"/>
-              <w:pBdr>
-                <w:bottom w:val="none" w:sz="0" w:space="0" w:color="000000"/>
-                <w:top w:val="none" w:sz="0" w:space="0" w:color="000000"/>
-                <w:left w:val="none" w:sz="0" w:space="0" w:color="000000"/>
-                <w:right w:val="none" w:sz="0" w:space="0" w:color="000000"/>
-              </w:pBdr>
-              <w:spacing w:after="100" w:before="100" w:line="240"/>
-              <w:ind w:left="100" w:right="100" w:firstLine="0" w:firstLineChars="0"/>
-            </w:pPr>
-            <w:r>
-              <w:rPr>
-                <w:rFonts w:ascii="Helvetica" w:hAnsi="Helvetica" w:eastAsia="Helvetica" w:cs="Helvetica"/>
-                <w:i w:val="false"/>
-                <w:b w:val="false"/>
-                <w:u w:val="none"/>
-                <w:sz w:val="22"/>
-                <w:szCs w:val="22"/>
-                <w:color w:val="000000"/>
-              </w:rPr>
-              <w:t xml:space="preserve">757 (77%)</w:t>
-            </w:r>
-          </w:p>
-        </w:tc>
-        <w:tc>
-          <w:tcPr>
-            <w:tcBorders>
-              <w:bottom w:val="none" w:sz="0" w:space="0" w:color="000000"/>
-              <w:top w:val="none" w:sz="0" w:space="0" w:color="000000"/>
-              <w:left w:val="none" w:sz="0" w:space="0" w:color="000000"/>
-              <w:right w:val="none" w:sz="0" w:space="0" w:color="000000"/>
-            </w:tcBorders>
-            <w:shd w:val="clear" w:color="auto" w:fill="FFFFFF"/>
-            <w:tcMar>
-              <w:top w:w="0" w:type="dxa"/>
-              <w:bottom w:w="0" w:type="dxa"/>
-              <w:left w:w="0" w:type="dxa"/>
-              <w:right w:w="0" w:type="dxa"/>
-            </w:tcMar>
-            <w:vAlign w:val="top"/>
-          </w:tcPr>
-          <w:p>
-            <w:pPr>
-              <w:pStyle w:val="Normal"/>
-              <w:jc w:val="center"/>
-              <w:pBdr>
-                <w:bottom w:val="none" w:sz="0" w:space="0" w:color="000000"/>
-                <w:top w:val="none" w:sz="0" w:space="0" w:color="000000"/>
-                <w:left w:val="none" w:sz="0" w:space="0" w:color="000000"/>
-                <w:right w:val="none" w:sz="0" w:space="0" w:color="000000"/>
-              </w:pBdr>
-              <w:spacing w:after="100" w:before="100" w:line="240"/>
-              <w:ind w:left="100" w:right="100" w:firstLine="0" w:firstLineChars="0"/>
-            </w:pPr>
-            <w:r>
-              <w:rPr>
-                <w:rFonts w:ascii="Helvetica" w:hAnsi="Helvetica" w:eastAsia="Helvetica" w:cs="Helvetica"/>
-                <w:i w:val="false"/>
-                <w:b w:val="false"/>
-                <w:u w:val="none"/>
-                <w:sz w:val="22"/>
-                <w:szCs w:val="22"/>
-                <w:color w:val="000000"/>
-              </w:rPr>
-              <w:t xml:space="preserve">195 (20%)</w:t>
+              <w:t xml:space="preserve">989 (82%)</w:t>
+            </w:r>
+          </w:p>
+        </w:tc>
+        <w:tc>
+          <w:tcPr>
+            <w:tcBorders>
+              <w:bottom w:val="none" w:sz="0" w:space="0" w:color="000000"/>
+              <w:top w:val="none" w:sz="0" w:space="0" w:color="000000"/>
+              <w:left w:val="none" w:sz="0" w:space="0" w:color="000000"/>
+              <w:right w:val="none" w:sz="0" w:space="0" w:color="000000"/>
+            </w:tcBorders>
+            <w:shd w:val="clear" w:color="auto" w:fill="FFFFFF"/>
+            <w:tcMar>
+              <w:top w:w="0" w:type="dxa"/>
+              <w:bottom w:w="0" w:type="dxa"/>
+              <w:left w:w="0" w:type="dxa"/>
+              <w:right w:w="0" w:type="dxa"/>
+            </w:tcMar>
+            <w:vAlign w:val="top"/>
+          </w:tcPr>
+          <w:p>
+            <w:pPr>
+              <w:pStyle w:val="Normal"/>
+              <w:jc w:val="center"/>
+              <w:pBdr>
+                <w:bottom w:val="none" w:sz="0" w:space="0" w:color="000000"/>
+                <w:top w:val="none" w:sz="0" w:space="0" w:color="000000"/>
+                <w:left w:val="none" w:sz="0" w:space="0" w:color="000000"/>
+                <w:right w:val="none" w:sz="0" w:space="0" w:color="000000"/>
+              </w:pBdr>
+              <w:spacing w:after="100" w:before="100" w:line="240"/>
+              <w:ind w:left="100" w:right="100" w:firstLine="0" w:firstLineChars="0"/>
+            </w:pPr>
+            <w:r>
+              <w:rPr>
+                <w:rFonts w:ascii="Helvetica" w:hAnsi="Helvetica" w:eastAsia="Helvetica" w:cs="Helvetica"/>
+                <w:i w:val="false"/>
+                <w:b w:val="false"/>
+                <w:u w:val="none"/>
+                <w:sz w:val="22"/>
+                <w:szCs w:val="22"/>
+                <w:color w:val="000000"/>
+              </w:rPr>
+              <w:t xml:space="preserve">37 (90%)</w:t>
+            </w:r>
+          </w:p>
+        </w:tc>
+        <w:tc>
+          <w:tcPr>
+            <w:tcBorders>
+              <w:bottom w:val="none" w:sz="0" w:space="0" w:color="000000"/>
+              <w:top w:val="none" w:sz="0" w:space="0" w:color="000000"/>
+              <w:left w:val="none" w:sz="0" w:space="0" w:color="000000"/>
+              <w:right w:val="none" w:sz="0" w:space="0" w:color="000000"/>
+            </w:tcBorders>
+            <w:shd w:val="clear" w:color="auto" w:fill="FFFFFF"/>
+            <w:tcMar>
+              <w:top w:w="0" w:type="dxa"/>
+              <w:bottom w:w="0" w:type="dxa"/>
+              <w:left w:w="0" w:type="dxa"/>
+              <w:right w:w="0" w:type="dxa"/>
+            </w:tcMar>
+            <w:vAlign w:val="top"/>
+          </w:tcPr>
+          <w:p>
+            <w:pPr>
+              <w:pStyle w:val="Normal"/>
+              <w:jc w:val="center"/>
+              <w:pBdr>
+                <w:bottom w:val="none" w:sz="0" w:space="0" w:color="000000"/>
+                <w:top w:val="none" w:sz="0" w:space="0" w:color="000000"/>
+                <w:left w:val="none" w:sz="0" w:space="0" w:color="000000"/>
+                <w:right w:val="none" w:sz="0" w:space="0" w:color="000000"/>
+              </w:pBdr>
+              <w:spacing w:after="100" w:before="100" w:line="240"/>
+              <w:ind w:left="100" w:right="100" w:firstLine="0" w:firstLineChars="0"/>
+            </w:pPr>
+            <w:r>
+              <w:rPr>
+                <w:rFonts w:ascii="Helvetica" w:hAnsi="Helvetica" w:eastAsia="Helvetica" w:cs="Helvetica"/>
+                <w:i w:val="false"/>
+                <w:b w:val="false"/>
+                <w:u w:val="none"/>
+                <w:sz w:val="22"/>
+                <w:szCs w:val="22"/>
+                <w:color w:val="000000"/>
+              </w:rPr>
+              <w:t xml:space="preserve">757 (83%)</w:t>
+            </w:r>
+          </w:p>
+        </w:tc>
+        <w:tc>
+          <w:tcPr>
+            <w:tcBorders>
+              <w:bottom w:val="none" w:sz="0" w:space="0" w:color="000000"/>
+              <w:top w:val="none" w:sz="0" w:space="0" w:color="000000"/>
+              <w:left w:val="none" w:sz="0" w:space="0" w:color="000000"/>
+              <w:right w:val="none" w:sz="0" w:space="0" w:color="000000"/>
+            </w:tcBorders>
+            <w:shd w:val="clear" w:color="auto" w:fill="FFFFFF"/>
+            <w:tcMar>
+              <w:top w:w="0" w:type="dxa"/>
+              <w:bottom w:w="0" w:type="dxa"/>
+              <w:left w:w="0" w:type="dxa"/>
+              <w:right w:w="0" w:type="dxa"/>
+            </w:tcMar>
+            <w:vAlign w:val="top"/>
+          </w:tcPr>
+          <w:p>
+            <w:pPr>
+              <w:pStyle w:val="Normal"/>
+              <w:jc w:val="center"/>
+              <w:pBdr>
+                <w:bottom w:val="none" w:sz="0" w:space="0" w:color="000000"/>
+                <w:top w:val="none" w:sz="0" w:space="0" w:color="000000"/>
+                <w:left w:val="none" w:sz="0" w:space="0" w:color="000000"/>
+                <w:right w:val="none" w:sz="0" w:space="0" w:color="000000"/>
+              </w:pBdr>
+              <w:spacing w:after="100" w:before="100" w:line="240"/>
+              <w:ind w:left="100" w:right="100" w:firstLine="0" w:firstLineChars="0"/>
+            </w:pPr>
+            <w:r>
+              <w:rPr>
+                <w:rFonts w:ascii="Helvetica" w:hAnsi="Helvetica" w:eastAsia="Helvetica" w:cs="Helvetica"/>
+                <w:i w:val="false"/>
+                <w:b w:val="false"/>
+                <w:u w:val="none"/>
+                <w:sz w:val="22"/>
+                <w:szCs w:val="22"/>
+                <w:color w:val="000000"/>
+              </w:rPr>
+              <w:t xml:space="preserve">195 (80%)</w:t>
             </w:r>
           </w:p>
         </w:tc>
@@ -2247,139 +2247,139 @@
                 <w:szCs w:val="22"/>
                 <w:color w:val="000000"/>
               </w:rPr>
-              <w:t xml:space="preserve">341 (100%)</w:t>
-            </w:r>
-          </w:p>
-        </w:tc>
-        <w:tc>
-          <w:tcPr>
-            <w:tcBorders>
-              <w:bottom w:val="none" w:sz="0" w:space="0" w:color="000000"/>
-              <w:top w:val="none" w:sz="0" w:space="0" w:color="000000"/>
-              <w:left w:val="none" w:sz="0" w:space="0" w:color="000000"/>
-              <w:right w:val="none" w:sz="0" w:space="0" w:color="000000"/>
-            </w:tcBorders>
-            <w:shd w:val="clear" w:color="auto" w:fill="FFFFFF"/>
-            <w:tcMar>
-              <w:top w:w="0" w:type="dxa"/>
-              <w:bottom w:w="0" w:type="dxa"/>
-              <w:left w:w="0" w:type="dxa"/>
-              <w:right w:w="0" w:type="dxa"/>
-            </w:tcMar>
-            <w:vAlign w:val="top"/>
-          </w:tcPr>
-          <w:p>
-            <w:pPr>
-              <w:pStyle w:val="Normal"/>
-              <w:jc w:val="center"/>
-              <w:pBdr>
-                <w:bottom w:val="none" w:sz="0" w:space="0" w:color="000000"/>
-                <w:top w:val="none" w:sz="0" w:space="0" w:color="000000"/>
-                <w:left w:val="none" w:sz="0" w:space="0" w:color="000000"/>
-                <w:right w:val="none" w:sz="0" w:space="0" w:color="000000"/>
-              </w:pBdr>
-              <w:spacing w:after="100" w:before="100" w:line="240"/>
-              <w:ind w:left="100" w:right="100" w:firstLine="0" w:firstLineChars="0"/>
-            </w:pPr>
-            <w:r>
-              <w:rPr>
-                <w:rFonts w:ascii="Helvetica" w:hAnsi="Helvetica" w:eastAsia="Helvetica" w:cs="Helvetica"/>
-                <w:i w:val="false"/>
-                <w:b w:val="false"/>
-                <w:u w:val="none"/>
-                <w:sz w:val="22"/>
-                <w:szCs w:val="22"/>
-                <w:color w:val="000000"/>
-              </w:rPr>
-              <w:t xml:space="preserve">8 (2.3%)</w:t>
-            </w:r>
-          </w:p>
-        </w:tc>
-        <w:tc>
-          <w:tcPr>
-            <w:tcBorders>
-              <w:bottom w:val="none" w:sz="0" w:space="0" w:color="000000"/>
-              <w:top w:val="none" w:sz="0" w:space="0" w:color="000000"/>
-              <w:left w:val="none" w:sz="0" w:space="0" w:color="000000"/>
-              <w:right w:val="none" w:sz="0" w:space="0" w:color="000000"/>
-            </w:tcBorders>
-            <w:shd w:val="clear" w:color="auto" w:fill="FFFFFF"/>
-            <w:tcMar>
-              <w:top w:w="0" w:type="dxa"/>
-              <w:bottom w:w="0" w:type="dxa"/>
-              <w:left w:w="0" w:type="dxa"/>
-              <w:right w:w="0" w:type="dxa"/>
-            </w:tcMar>
-            <w:vAlign w:val="top"/>
-          </w:tcPr>
-          <w:p>
-            <w:pPr>
-              <w:pStyle w:val="Normal"/>
-              <w:jc w:val="center"/>
-              <w:pBdr>
-                <w:bottom w:val="none" w:sz="0" w:space="0" w:color="000000"/>
-                <w:top w:val="none" w:sz="0" w:space="0" w:color="000000"/>
-                <w:left w:val="none" w:sz="0" w:space="0" w:color="000000"/>
-                <w:right w:val="none" w:sz="0" w:space="0" w:color="000000"/>
-              </w:pBdr>
-              <w:spacing w:after="100" w:before="100" w:line="240"/>
-              <w:ind w:left="100" w:right="100" w:firstLine="0" w:firstLineChars="0"/>
-            </w:pPr>
-            <w:r>
-              <w:rPr>
-                <w:rFonts w:ascii="Helvetica" w:hAnsi="Helvetica" w:eastAsia="Helvetica" w:cs="Helvetica"/>
-                <w:i w:val="false"/>
-                <w:b w:val="false"/>
-                <w:u w:val="none"/>
-                <w:sz w:val="22"/>
-                <w:szCs w:val="22"/>
-                <w:color w:val="000000"/>
-              </w:rPr>
-              <w:t xml:space="preserve">262 (77%)</w:t>
-            </w:r>
-          </w:p>
-        </w:tc>
-        <w:tc>
-          <w:tcPr>
-            <w:tcBorders>
-              <w:bottom w:val="none" w:sz="0" w:space="0" w:color="000000"/>
-              <w:top w:val="none" w:sz="0" w:space="0" w:color="000000"/>
-              <w:left w:val="none" w:sz="0" w:space="0" w:color="000000"/>
-              <w:right w:val="none" w:sz="0" w:space="0" w:color="000000"/>
-            </w:tcBorders>
-            <w:shd w:val="clear" w:color="auto" w:fill="FFFFFF"/>
-            <w:tcMar>
-              <w:top w:w="0" w:type="dxa"/>
-              <w:bottom w:w="0" w:type="dxa"/>
-              <w:left w:w="0" w:type="dxa"/>
-              <w:right w:w="0" w:type="dxa"/>
-            </w:tcMar>
-            <w:vAlign w:val="top"/>
-          </w:tcPr>
-          <w:p>
-            <w:pPr>
-              <w:pStyle w:val="Normal"/>
-              <w:jc w:val="center"/>
-              <w:pBdr>
-                <w:bottom w:val="none" w:sz="0" w:space="0" w:color="000000"/>
-                <w:top w:val="none" w:sz="0" w:space="0" w:color="000000"/>
-                <w:left w:val="none" w:sz="0" w:space="0" w:color="000000"/>
-                <w:right w:val="none" w:sz="0" w:space="0" w:color="000000"/>
-              </w:pBdr>
-              <w:spacing w:after="100" w:before="100" w:line="240"/>
-              <w:ind w:left="100" w:right="100" w:firstLine="0" w:firstLineChars="0"/>
-            </w:pPr>
-            <w:r>
-              <w:rPr>
-                <w:rFonts w:ascii="Helvetica" w:hAnsi="Helvetica" w:eastAsia="Helvetica" w:cs="Helvetica"/>
-                <w:i w:val="false"/>
-                <w:b w:val="false"/>
-                <w:u w:val="none"/>
-                <w:sz w:val="22"/>
-                <w:szCs w:val="22"/>
-                <w:color w:val="000000"/>
-              </w:rPr>
-              <w:t xml:space="preserve">71 (21%)</w:t>
+              <w:t xml:space="preserve">341 (28%)</w:t>
+            </w:r>
+          </w:p>
+        </w:tc>
+        <w:tc>
+          <w:tcPr>
+            <w:tcBorders>
+              <w:bottom w:val="none" w:sz="0" w:space="0" w:color="000000"/>
+              <w:top w:val="none" w:sz="0" w:space="0" w:color="000000"/>
+              <w:left w:val="none" w:sz="0" w:space="0" w:color="000000"/>
+              <w:right w:val="none" w:sz="0" w:space="0" w:color="000000"/>
+            </w:tcBorders>
+            <w:shd w:val="clear" w:color="auto" w:fill="FFFFFF"/>
+            <w:tcMar>
+              <w:top w:w="0" w:type="dxa"/>
+              <w:bottom w:w="0" w:type="dxa"/>
+              <w:left w:w="0" w:type="dxa"/>
+              <w:right w:w="0" w:type="dxa"/>
+            </w:tcMar>
+            <w:vAlign w:val="top"/>
+          </w:tcPr>
+          <w:p>
+            <w:pPr>
+              <w:pStyle w:val="Normal"/>
+              <w:jc w:val="center"/>
+              <w:pBdr>
+                <w:bottom w:val="none" w:sz="0" w:space="0" w:color="000000"/>
+                <w:top w:val="none" w:sz="0" w:space="0" w:color="000000"/>
+                <w:left w:val="none" w:sz="0" w:space="0" w:color="000000"/>
+                <w:right w:val="none" w:sz="0" w:space="0" w:color="000000"/>
+              </w:pBdr>
+              <w:spacing w:after="100" w:before="100" w:line="240"/>
+              <w:ind w:left="100" w:right="100" w:firstLine="0" w:firstLineChars="0"/>
+            </w:pPr>
+            <w:r>
+              <w:rPr>
+                <w:rFonts w:ascii="Helvetica" w:hAnsi="Helvetica" w:eastAsia="Helvetica" w:cs="Helvetica"/>
+                <w:i w:val="false"/>
+                <w:b w:val="false"/>
+                <w:u w:val="none"/>
+                <w:sz w:val="22"/>
+                <w:szCs w:val="22"/>
+                <w:color w:val="000000"/>
+              </w:rPr>
+              <w:t xml:space="preserve">8 (20%)</w:t>
+            </w:r>
+          </w:p>
+        </w:tc>
+        <w:tc>
+          <w:tcPr>
+            <w:tcBorders>
+              <w:bottom w:val="none" w:sz="0" w:space="0" w:color="000000"/>
+              <w:top w:val="none" w:sz="0" w:space="0" w:color="000000"/>
+              <w:left w:val="none" w:sz="0" w:space="0" w:color="000000"/>
+              <w:right w:val="none" w:sz="0" w:space="0" w:color="000000"/>
+            </w:tcBorders>
+            <w:shd w:val="clear" w:color="auto" w:fill="FFFFFF"/>
+            <w:tcMar>
+              <w:top w:w="0" w:type="dxa"/>
+              <w:bottom w:w="0" w:type="dxa"/>
+              <w:left w:w="0" w:type="dxa"/>
+              <w:right w:w="0" w:type="dxa"/>
+            </w:tcMar>
+            <w:vAlign w:val="top"/>
+          </w:tcPr>
+          <w:p>
+            <w:pPr>
+              <w:pStyle w:val="Normal"/>
+              <w:jc w:val="center"/>
+              <w:pBdr>
+                <w:bottom w:val="none" w:sz="0" w:space="0" w:color="000000"/>
+                <w:top w:val="none" w:sz="0" w:space="0" w:color="000000"/>
+                <w:left w:val="none" w:sz="0" w:space="0" w:color="000000"/>
+                <w:right w:val="none" w:sz="0" w:space="0" w:color="000000"/>
+              </w:pBdr>
+              <w:spacing w:after="100" w:before="100" w:line="240"/>
+              <w:ind w:left="100" w:right="100" w:firstLine="0" w:firstLineChars="0"/>
+            </w:pPr>
+            <w:r>
+              <w:rPr>
+                <w:rFonts w:ascii="Helvetica" w:hAnsi="Helvetica" w:eastAsia="Helvetica" w:cs="Helvetica"/>
+                <w:i w:val="false"/>
+                <w:b w:val="false"/>
+                <w:u w:val="none"/>
+                <w:sz w:val="22"/>
+                <w:szCs w:val="22"/>
+                <w:color w:val="000000"/>
+              </w:rPr>
+              <w:t xml:space="preserve">262 (29%)</w:t>
+            </w:r>
+          </w:p>
+        </w:tc>
+        <w:tc>
+          <w:tcPr>
+            <w:tcBorders>
+              <w:bottom w:val="none" w:sz="0" w:space="0" w:color="000000"/>
+              <w:top w:val="none" w:sz="0" w:space="0" w:color="000000"/>
+              <w:left w:val="none" w:sz="0" w:space="0" w:color="000000"/>
+              <w:right w:val="none" w:sz="0" w:space="0" w:color="000000"/>
+            </w:tcBorders>
+            <w:shd w:val="clear" w:color="auto" w:fill="FFFFFF"/>
+            <w:tcMar>
+              <w:top w:w="0" w:type="dxa"/>
+              <w:bottom w:w="0" w:type="dxa"/>
+              <w:left w:w="0" w:type="dxa"/>
+              <w:right w:w="0" w:type="dxa"/>
+            </w:tcMar>
+            <w:vAlign w:val="top"/>
+          </w:tcPr>
+          <w:p>
+            <w:pPr>
+              <w:pStyle w:val="Normal"/>
+              <w:jc w:val="center"/>
+              <w:pBdr>
+                <w:bottom w:val="none" w:sz="0" w:space="0" w:color="000000"/>
+                <w:top w:val="none" w:sz="0" w:space="0" w:color="000000"/>
+                <w:left w:val="none" w:sz="0" w:space="0" w:color="000000"/>
+                <w:right w:val="none" w:sz="0" w:space="0" w:color="000000"/>
+              </w:pBdr>
+              <w:spacing w:after="100" w:before="100" w:line="240"/>
+              <w:ind w:left="100" w:right="100" w:firstLine="0" w:firstLineChars="0"/>
+            </w:pPr>
+            <w:r>
+              <w:rPr>
+                <w:rFonts w:ascii="Helvetica" w:hAnsi="Helvetica" w:eastAsia="Helvetica" w:cs="Helvetica"/>
+                <w:i w:val="false"/>
+                <w:b w:val="false"/>
+                <w:u w:val="none"/>
+                <w:sz w:val="22"/>
+                <w:szCs w:val="22"/>
+                <w:color w:val="000000"/>
+              </w:rPr>
+              <w:t xml:space="preserve">71 (29%)</w:t>
             </w:r>
           </w:p>
         </w:tc>
@@ -2473,139 +2473,139 @@
                 <w:szCs w:val="22"/>
                 <w:color w:val="000000"/>
               </w:rPr>
-              <w:t xml:space="preserve">860 (100%)</w:t>
-            </w:r>
-          </w:p>
-        </w:tc>
-        <w:tc>
-          <w:tcPr>
-            <w:tcBorders>
-              <w:bottom w:val="none" w:sz="0" w:space="0" w:color="000000"/>
-              <w:top w:val="none" w:sz="0" w:space="0" w:color="000000"/>
-              <w:left w:val="none" w:sz="0" w:space="0" w:color="000000"/>
-              <w:right w:val="none" w:sz="0" w:space="0" w:color="000000"/>
-            </w:tcBorders>
-            <w:shd w:val="clear" w:color="auto" w:fill="FFFFFF"/>
-            <w:tcMar>
-              <w:top w:w="0" w:type="dxa"/>
-              <w:bottom w:w="0" w:type="dxa"/>
-              <w:left w:w="0" w:type="dxa"/>
-              <w:right w:w="0" w:type="dxa"/>
-            </w:tcMar>
-            <w:vAlign w:val="top"/>
-          </w:tcPr>
-          <w:p>
-            <w:pPr>
-              <w:pStyle w:val="Normal"/>
-              <w:jc w:val="center"/>
-              <w:pBdr>
-                <w:bottom w:val="none" w:sz="0" w:space="0" w:color="000000"/>
-                <w:top w:val="none" w:sz="0" w:space="0" w:color="000000"/>
-                <w:left w:val="none" w:sz="0" w:space="0" w:color="000000"/>
-                <w:right w:val="none" w:sz="0" w:space="0" w:color="000000"/>
-              </w:pBdr>
-              <w:spacing w:after="100" w:before="100" w:line="240"/>
-              <w:ind w:left="100" w:right="100" w:firstLine="0" w:firstLineChars="0"/>
-            </w:pPr>
-            <w:r>
-              <w:rPr>
-                <w:rFonts w:ascii="Helvetica" w:hAnsi="Helvetica" w:eastAsia="Helvetica" w:cs="Helvetica"/>
-                <w:i w:val="false"/>
-                <w:b w:val="false"/>
-                <w:u w:val="none"/>
-                <w:sz w:val="22"/>
-                <w:szCs w:val="22"/>
-                <w:color w:val="000000"/>
-              </w:rPr>
-              <w:t xml:space="preserve">33 (3.8%)</w:t>
-            </w:r>
-          </w:p>
-        </w:tc>
-        <w:tc>
-          <w:tcPr>
-            <w:tcBorders>
-              <w:bottom w:val="none" w:sz="0" w:space="0" w:color="000000"/>
-              <w:top w:val="none" w:sz="0" w:space="0" w:color="000000"/>
-              <w:left w:val="none" w:sz="0" w:space="0" w:color="000000"/>
-              <w:right w:val="none" w:sz="0" w:space="0" w:color="000000"/>
-            </w:tcBorders>
-            <w:shd w:val="clear" w:color="auto" w:fill="FFFFFF"/>
-            <w:tcMar>
-              <w:top w:w="0" w:type="dxa"/>
-              <w:bottom w:w="0" w:type="dxa"/>
-              <w:left w:w="0" w:type="dxa"/>
-              <w:right w:w="0" w:type="dxa"/>
-            </w:tcMar>
-            <w:vAlign w:val="top"/>
-          </w:tcPr>
-          <w:p>
-            <w:pPr>
-              <w:pStyle w:val="Normal"/>
-              <w:jc w:val="center"/>
-              <w:pBdr>
-                <w:bottom w:val="none" w:sz="0" w:space="0" w:color="000000"/>
-                <w:top w:val="none" w:sz="0" w:space="0" w:color="000000"/>
-                <w:left w:val="none" w:sz="0" w:space="0" w:color="000000"/>
-                <w:right w:val="none" w:sz="0" w:space="0" w:color="000000"/>
-              </w:pBdr>
-              <w:spacing w:after="100" w:before="100" w:line="240"/>
-              <w:ind w:left="100" w:right="100" w:firstLine="0" w:firstLineChars="0"/>
-            </w:pPr>
-            <w:r>
-              <w:rPr>
-                <w:rFonts w:ascii="Helvetica" w:hAnsi="Helvetica" w:eastAsia="Helvetica" w:cs="Helvetica"/>
-                <w:i w:val="false"/>
-                <w:b w:val="false"/>
-                <w:u w:val="none"/>
-                <w:sz w:val="22"/>
-                <w:szCs w:val="22"/>
-                <w:color w:val="000000"/>
-              </w:rPr>
-              <w:t xml:space="preserve">654 (76%)</w:t>
-            </w:r>
-          </w:p>
-        </w:tc>
-        <w:tc>
-          <w:tcPr>
-            <w:tcBorders>
-              <w:bottom w:val="none" w:sz="0" w:space="0" w:color="000000"/>
-              <w:top w:val="none" w:sz="0" w:space="0" w:color="000000"/>
-              <w:left w:val="none" w:sz="0" w:space="0" w:color="000000"/>
-              <w:right w:val="none" w:sz="0" w:space="0" w:color="000000"/>
-            </w:tcBorders>
-            <w:shd w:val="clear" w:color="auto" w:fill="FFFFFF"/>
-            <w:tcMar>
-              <w:top w:w="0" w:type="dxa"/>
-              <w:bottom w:w="0" w:type="dxa"/>
-              <w:left w:w="0" w:type="dxa"/>
-              <w:right w:w="0" w:type="dxa"/>
-            </w:tcMar>
-            <w:vAlign w:val="top"/>
-          </w:tcPr>
-          <w:p>
-            <w:pPr>
-              <w:pStyle w:val="Normal"/>
-              <w:jc w:val="center"/>
-              <w:pBdr>
-                <w:bottom w:val="none" w:sz="0" w:space="0" w:color="000000"/>
-                <w:top w:val="none" w:sz="0" w:space="0" w:color="000000"/>
-                <w:left w:val="none" w:sz="0" w:space="0" w:color="000000"/>
-                <w:right w:val="none" w:sz="0" w:space="0" w:color="000000"/>
-              </w:pBdr>
-              <w:spacing w:after="100" w:before="100" w:line="240"/>
-              <w:ind w:left="100" w:right="100" w:firstLine="0" w:firstLineChars="0"/>
-            </w:pPr>
-            <w:r>
-              <w:rPr>
-                <w:rFonts w:ascii="Helvetica" w:hAnsi="Helvetica" w:eastAsia="Helvetica" w:cs="Helvetica"/>
-                <w:i w:val="false"/>
-                <w:b w:val="false"/>
-                <w:u w:val="none"/>
-                <w:sz w:val="22"/>
-                <w:szCs w:val="22"/>
-                <w:color w:val="000000"/>
-              </w:rPr>
-              <w:t xml:space="preserve">173 (20%)</w:t>
+              <w:t xml:space="preserve">860 (72%)</w:t>
+            </w:r>
+          </w:p>
+        </w:tc>
+        <w:tc>
+          <w:tcPr>
+            <w:tcBorders>
+              <w:bottom w:val="none" w:sz="0" w:space="0" w:color="000000"/>
+              <w:top w:val="none" w:sz="0" w:space="0" w:color="000000"/>
+              <w:left w:val="none" w:sz="0" w:space="0" w:color="000000"/>
+              <w:right w:val="none" w:sz="0" w:space="0" w:color="000000"/>
+            </w:tcBorders>
+            <w:shd w:val="clear" w:color="auto" w:fill="FFFFFF"/>
+            <w:tcMar>
+              <w:top w:w="0" w:type="dxa"/>
+              <w:bottom w:w="0" w:type="dxa"/>
+              <w:left w:w="0" w:type="dxa"/>
+              <w:right w:w="0" w:type="dxa"/>
+            </w:tcMar>
+            <w:vAlign w:val="top"/>
+          </w:tcPr>
+          <w:p>
+            <w:pPr>
+              <w:pStyle w:val="Normal"/>
+              <w:jc w:val="center"/>
+              <w:pBdr>
+                <w:bottom w:val="none" w:sz="0" w:space="0" w:color="000000"/>
+                <w:top w:val="none" w:sz="0" w:space="0" w:color="000000"/>
+                <w:left w:val="none" w:sz="0" w:space="0" w:color="000000"/>
+                <w:right w:val="none" w:sz="0" w:space="0" w:color="000000"/>
+              </w:pBdr>
+              <w:spacing w:after="100" w:before="100" w:line="240"/>
+              <w:ind w:left="100" w:right="100" w:firstLine="0" w:firstLineChars="0"/>
+            </w:pPr>
+            <w:r>
+              <w:rPr>
+                <w:rFonts w:ascii="Helvetica" w:hAnsi="Helvetica" w:eastAsia="Helvetica" w:cs="Helvetica"/>
+                <w:i w:val="false"/>
+                <w:b w:val="false"/>
+                <w:u w:val="none"/>
+                <w:sz w:val="22"/>
+                <w:szCs w:val="22"/>
+                <w:color w:val="000000"/>
+              </w:rPr>
+              <w:t xml:space="preserve">33 (80%)</w:t>
+            </w:r>
+          </w:p>
+        </w:tc>
+        <w:tc>
+          <w:tcPr>
+            <w:tcBorders>
+              <w:bottom w:val="none" w:sz="0" w:space="0" w:color="000000"/>
+              <w:top w:val="none" w:sz="0" w:space="0" w:color="000000"/>
+              <w:left w:val="none" w:sz="0" w:space="0" w:color="000000"/>
+              <w:right w:val="none" w:sz="0" w:space="0" w:color="000000"/>
+            </w:tcBorders>
+            <w:shd w:val="clear" w:color="auto" w:fill="FFFFFF"/>
+            <w:tcMar>
+              <w:top w:w="0" w:type="dxa"/>
+              <w:bottom w:w="0" w:type="dxa"/>
+              <w:left w:w="0" w:type="dxa"/>
+              <w:right w:w="0" w:type="dxa"/>
+            </w:tcMar>
+            <w:vAlign w:val="top"/>
+          </w:tcPr>
+          <w:p>
+            <w:pPr>
+              <w:pStyle w:val="Normal"/>
+              <w:jc w:val="center"/>
+              <w:pBdr>
+                <w:bottom w:val="none" w:sz="0" w:space="0" w:color="000000"/>
+                <w:top w:val="none" w:sz="0" w:space="0" w:color="000000"/>
+                <w:left w:val="none" w:sz="0" w:space="0" w:color="000000"/>
+                <w:right w:val="none" w:sz="0" w:space="0" w:color="000000"/>
+              </w:pBdr>
+              <w:spacing w:after="100" w:before="100" w:line="240"/>
+              <w:ind w:left="100" w:right="100" w:firstLine="0" w:firstLineChars="0"/>
+            </w:pPr>
+            <w:r>
+              <w:rPr>
+                <w:rFonts w:ascii="Helvetica" w:hAnsi="Helvetica" w:eastAsia="Helvetica" w:cs="Helvetica"/>
+                <w:i w:val="false"/>
+                <w:b w:val="false"/>
+                <w:u w:val="none"/>
+                <w:sz w:val="22"/>
+                <w:szCs w:val="22"/>
+                <w:color w:val="000000"/>
+              </w:rPr>
+              <w:t xml:space="preserve">654 (71%)</w:t>
+            </w:r>
+          </w:p>
+        </w:tc>
+        <w:tc>
+          <w:tcPr>
+            <w:tcBorders>
+              <w:bottom w:val="none" w:sz="0" w:space="0" w:color="000000"/>
+              <w:top w:val="none" w:sz="0" w:space="0" w:color="000000"/>
+              <w:left w:val="none" w:sz="0" w:space="0" w:color="000000"/>
+              <w:right w:val="none" w:sz="0" w:space="0" w:color="000000"/>
+            </w:tcBorders>
+            <w:shd w:val="clear" w:color="auto" w:fill="FFFFFF"/>
+            <w:tcMar>
+              <w:top w:w="0" w:type="dxa"/>
+              <w:bottom w:w="0" w:type="dxa"/>
+              <w:left w:w="0" w:type="dxa"/>
+              <w:right w:w="0" w:type="dxa"/>
+            </w:tcMar>
+            <w:vAlign w:val="top"/>
+          </w:tcPr>
+          <w:p>
+            <w:pPr>
+              <w:pStyle w:val="Normal"/>
+              <w:jc w:val="center"/>
+              <w:pBdr>
+                <w:bottom w:val="none" w:sz="0" w:space="0" w:color="000000"/>
+                <w:top w:val="none" w:sz="0" w:space="0" w:color="000000"/>
+                <w:left w:val="none" w:sz="0" w:space="0" w:color="000000"/>
+                <w:right w:val="none" w:sz="0" w:space="0" w:color="000000"/>
+              </w:pBdr>
+              <w:spacing w:after="100" w:before="100" w:line="240"/>
+              <w:ind w:left="100" w:right="100" w:firstLine="0" w:firstLineChars="0"/>
+            </w:pPr>
+            <w:r>
+              <w:rPr>
+                <w:rFonts w:ascii="Helvetica" w:hAnsi="Helvetica" w:eastAsia="Helvetica" w:cs="Helvetica"/>
+                <w:i w:val="false"/>
+                <w:b w:val="false"/>
+                <w:u w:val="none"/>
+                <w:sz w:val="22"/>
+                <w:szCs w:val="22"/>
+                <w:color w:val="000000"/>
+              </w:rPr>
+              <w:t xml:space="preserve">173 (71%)</w:t>
             </w:r>
           </w:p>
         </w:tc>
@@ -2699,139 +2699,139 @@
                 <w:szCs w:val="22"/>
                 <w:color w:val="000000"/>
               </w:rPr>
-              <w:t xml:space="preserve">1,032 (100%)</w:t>
-            </w:r>
-          </w:p>
-        </w:tc>
-        <w:tc>
-          <w:tcPr>
-            <w:tcBorders>
-              <w:bottom w:val="none" w:sz="0" w:space="0" w:color="000000"/>
-              <w:top w:val="none" w:sz="0" w:space="0" w:color="000000"/>
-              <w:left w:val="none" w:sz="0" w:space="0" w:color="000000"/>
-              <w:right w:val="none" w:sz="0" w:space="0" w:color="000000"/>
-            </w:tcBorders>
-            <w:shd w:val="clear" w:color="auto" w:fill="FFFFFF"/>
-            <w:tcMar>
-              <w:top w:w="0" w:type="dxa"/>
-              <w:bottom w:w="0" w:type="dxa"/>
-              <w:left w:w="0" w:type="dxa"/>
-              <w:right w:w="0" w:type="dxa"/>
-            </w:tcMar>
-            <w:vAlign w:val="top"/>
-          </w:tcPr>
-          <w:p>
-            <w:pPr>
-              <w:pStyle w:val="Normal"/>
-              <w:jc w:val="center"/>
-              <w:pBdr>
-                <w:bottom w:val="none" w:sz="0" w:space="0" w:color="000000"/>
-                <w:top w:val="none" w:sz="0" w:space="0" w:color="000000"/>
-                <w:left w:val="none" w:sz="0" w:space="0" w:color="000000"/>
-                <w:right w:val="none" w:sz="0" w:space="0" w:color="000000"/>
-              </w:pBdr>
-              <w:spacing w:after="100" w:before="100" w:line="240"/>
-              <w:ind w:left="100" w:right="100" w:firstLine="0" w:firstLineChars="0"/>
-            </w:pPr>
-            <w:r>
-              <w:rPr>
-                <w:rFonts w:ascii="Helvetica" w:hAnsi="Helvetica" w:eastAsia="Helvetica" w:cs="Helvetica"/>
-                <w:i w:val="false"/>
-                <w:b w:val="false"/>
-                <w:u w:val="none"/>
-                <w:sz w:val="22"/>
-                <w:szCs w:val="22"/>
-                <w:color w:val="000000"/>
-              </w:rPr>
-              <w:t xml:space="preserve">38 (3.7%)</w:t>
-            </w:r>
-          </w:p>
-        </w:tc>
-        <w:tc>
-          <w:tcPr>
-            <w:tcBorders>
-              <w:bottom w:val="none" w:sz="0" w:space="0" w:color="000000"/>
-              <w:top w:val="none" w:sz="0" w:space="0" w:color="000000"/>
-              <w:left w:val="none" w:sz="0" w:space="0" w:color="000000"/>
-              <w:right w:val="none" w:sz="0" w:space="0" w:color="000000"/>
-            </w:tcBorders>
-            <w:shd w:val="clear" w:color="auto" w:fill="FFFFFF"/>
-            <w:tcMar>
-              <w:top w:w="0" w:type="dxa"/>
-              <w:bottom w:w="0" w:type="dxa"/>
-              <w:left w:w="0" w:type="dxa"/>
-              <w:right w:w="0" w:type="dxa"/>
-            </w:tcMar>
-            <w:vAlign w:val="top"/>
-          </w:tcPr>
-          <w:p>
-            <w:pPr>
-              <w:pStyle w:val="Normal"/>
-              <w:jc w:val="center"/>
-              <w:pBdr>
-                <w:bottom w:val="none" w:sz="0" w:space="0" w:color="000000"/>
-                <w:top w:val="none" w:sz="0" w:space="0" w:color="000000"/>
-                <w:left w:val="none" w:sz="0" w:space="0" w:color="000000"/>
-                <w:right w:val="none" w:sz="0" w:space="0" w:color="000000"/>
-              </w:pBdr>
-              <w:spacing w:after="100" w:before="100" w:line="240"/>
-              <w:ind w:left="100" w:right="100" w:firstLine="0" w:firstLineChars="0"/>
-            </w:pPr>
-            <w:r>
-              <w:rPr>
-                <w:rFonts w:ascii="Helvetica" w:hAnsi="Helvetica" w:eastAsia="Helvetica" w:cs="Helvetica"/>
-                <w:i w:val="false"/>
-                <w:b w:val="false"/>
-                <w:u w:val="none"/>
-                <w:sz w:val="22"/>
-                <w:szCs w:val="22"/>
-                <w:color w:val="000000"/>
-              </w:rPr>
-              <w:t xml:space="preserve">781 (76%)</w:t>
-            </w:r>
-          </w:p>
-        </w:tc>
-        <w:tc>
-          <w:tcPr>
-            <w:tcBorders>
-              <w:bottom w:val="none" w:sz="0" w:space="0" w:color="000000"/>
-              <w:top w:val="none" w:sz="0" w:space="0" w:color="000000"/>
-              <w:left w:val="none" w:sz="0" w:space="0" w:color="000000"/>
-              <w:right w:val="none" w:sz="0" w:space="0" w:color="000000"/>
-            </w:tcBorders>
-            <w:shd w:val="clear" w:color="auto" w:fill="FFFFFF"/>
-            <w:tcMar>
-              <w:top w:w="0" w:type="dxa"/>
-              <w:bottom w:w="0" w:type="dxa"/>
-              <w:left w:w="0" w:type="dxa"/>
-              <w:right w:w="0" w:type="dxa"/>
-            </w:tcMar>
-            <w:vAlign w:val="top"/>
-          </w:tcPr>
-          <w:p>
-            <w:pPr>
-              <w:pStyle w:val="Normal"/>
-              <w:jc w:val="center"/>
-              <w:pBdr>
-                <w:bottom w:val="none" w:sz="0" w:space="0" w:color="000000"/>
-                <w:top w:val="none" w:sz="0" w:space="0" w:color="000000"/>
-                <w:left w:val="none" w:sz="0" w:space="0" w:color="000000"/>
-                <w:right w:val="none" w:sz="0" w:space="0" w:color="000000"/>
-              </w:pBdr>
-              <w:spacing w:after="100" w:before="100" w:line="240"/>
-              <w:ind w:left="100" w:right="100" w:firstLine="0" w:firstLineChars="0"/>
-            </w:pPr>
-            <w:r>
-              <w:rPr>
-                <w:rFonts w:ascii="Helvetica" w:hAnsi="Helvetica" w:eastAsia="Helvetica" w:cs="Helvetica"/>
-                <w:i w:val="false"/>
-                <w:b w:val="false"/>
-                <w:u w:val="none"/>
-                <w:sz w:val="22"/>
-                <w:szCs w:val="22"/>
-                <w:color w:val="000000"/>
-              </w:rPr>
-              <w:t xml:space="preserve">213 (21%)</w:t>
+              <w:t xml:space="preserve">1,032 (86%)</w:t>
+            </w:r>
+          </w:p>
+        </w:tc>
+        <w:tc>
+          <w:tcPr>
+            <w:tcBorders>
+              <w:bottom w:val="none" w:sz="0" w:space="0" w:color="000000"/>
+              <w:top w:val="none" w:sz="0" w:space="0" w:color="000000"/>
+              <w:left w:val="none" w:sz="0" w:space="0" w:color="000000"/>
+              <w:right w:val="none" w:sz="0" w:space="0" w:color="000000"/>
+            </w:tcBorders>
+            <w:shd w:val="clear" w:color="auto" w:fill="FFFFFF"/>
+            <w:tcMar>
+              <w:top w:w="0" w:type="dxa"/>
+              <w:bottom w:w="0" w:type="dxa"/>
+              <w:left w:w="0" w:type="dxa"/>
+              <w:right w:w="0" w:type="dxa"/>
+            </w:tcMar>
+            <w:vAlign w:val="top"/>
+          </w:tcPr>
+          <w:p>
+            <w:pPr>
+              <w:pStyle w:val="Normal"/>
+              <w:jc w:val="center"/>
+              <w:pBdr>
+                <w:bottom w:val="none" w:sz="0" w:space="0" w:color="000000"/>
+                <w:top w:val="none" w:sz="0" w:space="0" w:color="000000"/>
+                <w:left w:val="none" w:sz="0" w:space="0" w:color="000000"/>
+                <w:right w:val="none" w:sz="0" w:space="0" w:color="000000"/>
+              </w:pBdr>
+              <w:spacing w:after="100" w:before="100" w:line="240"/>
+              <w:ind w:left="100" w:right="100" w:firstLine="0" w:firstLineChars="0"/>
+            </w:pPr>
+            <w:r>
+              <w:rPr>
+                <w:rFonts w:ascii="Helvetica" w:hAnsi="Helvetica" w:eastAsia="Helvetica" w:cs="Helvetica"/>
+                <w:i w:val="false"/>
+                <w:b w:val="false"/>
+                <w:u w:val="none"/>
+                <w:sz w:val="22"/>
+                <w:szCs w:val="22"/>
+                <w:color w:val="000000"/>
+              </w:rPr>
+              <w:t xml:space="preserve">38 (93%)</w:t>
+            </w:r>
+          </w:p>
+        </w:tc>
+        <w:tc>
+          <w:tcPr>
+            <w:tcBorders>
+              <w:bottom w:val="none" w:sz="0" w:space="0" w:color="000000"/>
+              <w:top w:val="none" w:sz="0" w:space="0" w:color="000000"/>
+              <w:left w:val="none" w:sz="0" w:space="0" w:color="000000"/>
+              <w:right w:val="none" w:sz="0" w:space="0" w:color="000000"/>
+            </w:tcBorders>
+            <w:shd w:val="clear" w:color="auto" w:fill="FFFFFF"/>
+            <w:tcMar>
+              <w:top w:w="0" w:type="dxa"/>
+              <w:bottom w:w="0" w:type="dxa"/>
+              <w:left w:w="0" w:type="dxa"/>
+              <w:right w:w="0" w:type="dxa"/>
+            </w:tcMar>
+            <w:vAlign w:val="top"/>
+          </w:tcPr>
+          <w:p>
+            <w:pPr>
+              <w:pStyle w:val="Normal"/>
+              <w:jc w:val="center"/>
+              <w:pBdr>
+                <w:bottom w:val="none" w:sz="0" w:space="0" w:color="000000"/>
+                <w:top w:val="none" w:sz="0" w:space="0" w:color="000000"/>
+                <w:left w:val="none" w:sz="0" w:space="0" w:color="000000"/>
+                <w:right w:val="none" w:sz="0" w:space="0" w:color="000000"/>
+              </w:pBdr>
+              <w:spacing w:after="100" w:before="100" w:line="240"/>
+              <w:ind w:left="100" w:right="100" w:firstLine="0" w:firstLineChars="0"/>
+            </w:pPr>
+            <w:r>
+              <w:rPr>
+                <w:rFonts w:ascii="Helvetica" w:hAnsi="Helvetica" w:eastAsia="Helvetica" w:cs="Helvetica"/>
+                <w:i w:val="false"/>
+                <w:b w:val="false"/>
+                <w:u w:val="none"/>
+                <w:sz w:val="22"/>
+                <w:szCs w:val="22"/>
+                <w:color w:val="000000"/>
+              </w:rPr>
+              <w:t xml:space="preserve">781 (85%)</w:t>
+            </w:r>
+          </w:p>
+        </w:tc>
+        <w:tc>
+          <w:tcPr>
+            <w:tcBorders>
+              <w:bottom w:val="none" w:sz="0" w:space="0" w:color="000000"/>
+              <w:top w:val="none" w:sz="0" w:space="0" w:color="000000"/>
+              <w:left w:val="none" w:sz="0" w:space="0" w:color="000000"/>
+              <w:right w:val="none" w:sz="0" w:space="0" w:color="000000"/>
+            </w:tcBorders>
+            <w:shd w:val="clear" w:color="auto" w:fill="FFFFFF"/>
+            <w:tcMar>
+              <w:top w:w="0" w:type="dxa"/>
+              <w:bottom w:w="0" w:type="dxa"/>
+              <w:left w:w="0" w:type="dxa"/>
+              <w:right w:w="0" w:type="dxa"/>
+            </w:tcMar>
+            <w:vAlign w:val="top"/>
+          </w:tcPr>
+          <w:p>
+            <w:pPr>
+              <w:pStyle w:val="Normal"/>
+              <w:jc w:val="center"/>
+              <w:pBdr>
+                <w:bottom w:val="none" w:sz="0" w:space="0" w:color="000000"/>
+                <w:top w:val="none" w:sz="0" w:space="0" w:color="000000"/>
+                <w:left w:val="none" w:sz="0" w:space="0" w:color="000000"/>
+                <w:right w:val="none" w:sz="0" w:space="0" w:color="000000"/>
+              </w:pBdr>
+              <w:spacing w:after="100" w:before="100" w:line="240"/>
+              <w:ind w:left="100" w:right="100" w:firstLine="0" w:firstLineChars="0"/>
+            </w:pPr>
+            <w:r>
+              <w:rPr>
+                <w:rFonts w:ascii="Helvetica" w:hAnsi="Helvetica" w:eastAsia="Helvetica" w:cs="Helvetica"/>
+                <w:i w:val="false"/>
+                <w:b w:val="false"/>
+                <w:u w:val="none"/>
+                <w:sz w:val="22"/>
+                <w:szCs w:val="22"/>
+                <w:color w:val="000000"/>
+              </w:rPr>
+              <w:t xml:space="preserve">213 (87%)</w:t>
             </w:r>
           </w:p>
         </w:tc>
@@ -3151,139 +3151,139 @@
                 <w:szCs w:val="22"/>
                 <w:color w:val="000000"/>
               </w:rPr>
-              <w:t xml:space="preserve">540 (100%)</w:t>
-            </w:r>
-          </w:p>
-        </w:tc>
-        <w:tc>
-          <w:tcPr>
-            <w:tcBorders>
-              <w:bottom w:val="none" w:sz="0" w:space="0" w:color="000000"/>
-              <w:top w:val="none" w:sz="0" w:space="0" w:color="000000"/>
-              <w:left w:val="none" w:sz="0" w:space="0" w:color="000000"/>
-              <w:right w:val="none" w:sz="0" w:space="0" w:color="000000"/>
-            </w:tcBorders>
-            <w:shd w:val="clear" w:color="auto" w:fill="FFFFFF"/>
-            <w:tcMar>
-              <w:top w:w="0" w:type="dxa"/>
-              <w:bottom w:w="0" w:type="dxa"/>
-              <w:left w:w="0" w:type="dxa"/>
-              <w:right w:w="0" w:type="dxa"/>
-            </w:tcMar>
-            <w:vAlign w:val="top"/>
-          </w:tcPr>
-          <w:p>
-            <w:pPr>
-              <w:pStyle w:val="Normal"/>
-              <w:jc w:val="center"/>
-              <w:pBdr>
-                <w:bottom w:val="none" w:sz="0" w:space="0" w:color="000000"/>
-                <w:top w:val="none" w:sz="0" w:space="0" w:color="000000"/>
-                <w:left w:val="none" w:sz="0" w:space="0" w:color="000000"/>
-                <w:right w:val="none" w:sz="0" w:space="0" w:color="000000"/>
-              </w:pBdr>
-              <w:spacing w:after="100" w:before="100" w:line="240"/>
-              <w:ind w:left="100" w:right="100" w:firstLine="0" w:firstLineChars="0"/>
-            </w:pPr>
-            <w:r>
-              <w:rPr>
-                <w:rFonts w:ascii="Helvetica" w:hAnsi="Helvetica" w:eastAsia="Helvetica" w:cs="Helvetica"/>
-                <w:i w:val="false"/>
-                <w:b w:val="false"/>
-                <w:u w:val="none"/>
-                <w:sz w:val="22"/>
-                <w:szCs w:val="22"/>
-                <w:color w:val="000000"/>
-              </w:rPr>
-              <w:t xml:space="preserve">24 (4.4%)</w:t>
-            </w:r>
-          </w:p>
-        </w:tc>
-        <w:tc>
-          <w:tcPr>
-            <w:tcBorders>
-              <w:bottom w:val="none" w:sz="0" w:space="0" w:color="000000"/>
-              <w:top w:val="none" w:sz="0" w:space="0" w:color="000000"/>
-              <w:left w:val="none" w:sz="0" w:space="0" w:color="000000"/>
-              <w:right w:val="none" w:sz="0" w:space="0" w:color="000000"/>
-            </w:tcBorders>
-            <w:shd w:val="clear" w:color="auto" w:fill="FFFFFF"/>
-            <w:tcMar>
-              <w:top w:w="0" w:type="dxa"/>
-              <w:bottom w:w="0" w:type="dxa"/>
-              <w:left w:w="0" w:type="dxa"/>
-              <w:right w:w="0" w:type="dxa"/>
-            </w:tcMar>
-            <w:vAlign w:val="top"/>
-          </w:tcPr>
-          <w:p>
-            <w:pPr>
-              <w:pStyle w:val="Normal"/>
-              <w:jc w:val="center"/>
-              <w:pBdr>
-                <w:bottom w:val="none" w:sz="0" w:space="0" w:color="000000"/>
-                <w:top w:val="none" w:sz="0" w:space="0" w:color="000000"/>
-                <w:left w:val="none" w:sz="0" w:space="0" w:color="000000"/>
-                <w:right w:val="none" w:sz="0" w:space="0" w:color="000000"/>
-              </w:pBdr>
-              <w:spacing w:after="100" w:before="100" w:line="240"/>
-              <w:ind w:left="100" w:right="100" w:firstLine="0" w:firstLineChars="0"/>
-            </w:pPr>
-            <w:r>
-              <w:rPr>
-                <w:rFonts w:ascii="Helvetica" w:hAnsi="Helvetica" w:eastAsia="Helvetica" w:cs="Helvetica"/>
-                <w:i w:val="false"/>
-                <w:b w:val="false"/>
-                <w:u w:val="none"/>
-                <w:sz w:val="22"/>
-                <w:szCs w:val="22"/>
-                <w:color w:val="000000"/>
-              </w:rPr>
-              <w:t xml:space="preserve">424 (79%)</w:t>
-            </w:r>
-          </w:p>
-        </w:tc>
-        <w:tc>
-          <w:tcPr>
-            <w:tcBorders>
-              <w:bottom w:val="none" w:sz="0" w:space="0" w:color="000000"/>
-              <w:top w:val="none" w:sz="0" w:space="0" w:color="000000"/>
-              <w:left w:val="none" w:sz="0" w:space="0" w:color="000000"/>
-              <w:right w:val="none" w:sz="0" w:space="0" w:color="000000"/>
-            </w:tcBorders>
-            <w:shd w:val="clear" w:color="auto" w:fill="FFFFFF"/>
-            <w:tcMar>
-              <w:top w:w="0" w:type="dxa"/>
-              <w:bottom w:w="0" w:type="dxa"/>
-              <w:left w:w="0" w:type="dxa"/>
-              <w:right w:w="0" w:type="dxa"/>
-            </w:tcMar>
-            <w:vAlign w:val="top"/>
-          </w:tcPr>
-          <w:p>
-            <w:pPr>
-              <w:pStyle w:val="Normal"/>
-              <w:jc w:val="center"/>
-              <w:pBdr>
-                <w:bottom w:val="none" w:sz="0" w:space="0" w:color="000000"/>
-                <w:top w:val="none" w:sz="0" w:space="0" w:color="000000"/>
-                <w:left w:val="none" w:sz="0" w:space="0" w:color="000000"/>
-                <w:right w:val="none" w:sz="0" w:space="0" w:color="000000"/>
-              </w:pBdr>
-              <w:spacing w:after="100" w:before="100" w:line="240"/>
-              <w:ind w:left="100" w:right="100" w:firstLine="0" w:firstLineChars="0"/>
-            </w:pPr>
-            <w:r>
-              <w:rPr>
-                <w:rFonts w:ascii="Helvetica" w:hAnsi="Helvetica" w:eastAsia="Helvetica" w:cs="Helvetica"/>
-                <w:i w:val="false"/>
-                <w:b w:val="false"/>
-                <w:u w:val="none"/>
-                <w:sz w:val="22"/>
-                <w:szCs w:val="22"/>
-                <w:color w:val="000000"/>
-              </w:rPr>
-              <w:t xml:space="preserve">92 (17%)</w:t>
+              <w:t xml:space="preserve">540 (45%)</w:t>
+            </w:r>
+          </w:p>
+        </w:tc>
+        <w:tc>
+          <w:tcPr>
+            <w:tcBorders>
+              <w:bottom w:val="none" w:sz="0" w:space="0" w:color="000000"/>
+              <w:top w:val="none" w:sz="0" w:space="0" w:color="000000"/>
+              <w:left w:val="none" w:sz="0" w:space="0" w:color="000000"/>
+              <w:right w:val="none" w:sz="0" w:space="0" w:color="000000"/>
+            </w:tcBorders>
+            <w:shd w:val="clear" w:color="auto" w:fill="FFFFFF"/>
+            <w:tcMar>
+              <w:top w:w="0" w:type="dxa"/>
+              <w:bottom w:w="0" w:type="dxa"/>
+              <w:left w:w="0" w:type="dxa"/>
+              <w:right w:w="0" w:type="dxa"/>
+            </w:tcMar>
+            <w:vAlign w:val="top"/>
+          </w:tcPr>
+          <w:p>
+            <w:pPr>
+              <w:pStyle w:val="Normal"/>
+              <w:jc w:val="center"/>
+              <w:pBdr>
+                <w:bottom w:val="none" w:sz="0" w:space="0" w:color="000000"/>
+                <w:top w:val="none" w:sz="0" w:space="0" w:color="000000"/>
+                <w:left w:val="none" w:sz="0" w:space="0" w:color="000000"/>
+                <w:right w:val="none" w:sz="0" w:space="0" w:color="000000"/>
+              </w:pBdr>
+              <w:spacing w:after="100" w:before="100" w:line="240"/>
+              <w:ind w:left="100" w:right="100" w:firstLine="0" w:firstLineChars="0"/>
+            </w:pPr>
+            <w:r>
+              <w:rPr>
+                <w:rFonts w:ascii="Helvetica" w:hAnsi="Helvetica" w:eastAsia="Helvetica" w:cs="Helvetica"/>
+                <w:i w:val="false"/>
+                <w:b w:val="false"/>
+                <w:u w:val="none"/>
+                <w:sz w:val="22"/>
+                <w:szCs w:val="22"/>
+                <w:color w:val="000000"/>
+              </w:rPr>
+              <w:t xml:space="preserve">24 (59%)</w:t>
+            </w:r>
+          </w:p>
+        </w:tc>
+        <w:tc>
+          <w:tcPr>
+            <w:tcBorders>
+              <w:bottom w:val="none" w:sz="0" w:space="0" w:color="000000"/>
+              <w:top w:val="none" w:sz="0" w:space="0" w:color="000000"/>
+              <w:left w:val="none" w:sz="0" w:space="0" w:color="000000"/>
+              <w:right w:val="none" w:sz="0" w:space="0" w:color="000000"/>
+            </w:tcBorders>
+            <w:shd w:val="clear" w:color="auto" w:fill="FFFFFF"/>
+            <w:tcMar>
+              <w:top w:w="0" w:type="dxa"/>
+              <w:bottom w:w="0" w:type="dxa"/>
+              <w:left w:w="0" w:type="dxa"/>
+              <w:right w:w="0" w:type="dxa"/>
+            </w:tcMar>
+            <w:vAlign w:val="top"/>
+          </w:tcPr>
+          <w:p>
+            <w:pPr>
+              <w:pStyle w:val="Normal"/>
+              <w:jc w:val="center"/>
+              <w:pBdr>
+                <w:bottom w:val="none" w:sz="0" w:space="0" w:color="000000"/>
+                <w:top w:val="none" w:sz="0" w:space="0" w:color="000000"/>
+                <w:left w:val="none" w:sz="0" w:space="0" w:color="000000"/>
+                <w:right w:val="none" w:sz="0" w:space="0" w:color="000000"/>
+              </w:pBdr>
+              <w:spacing w:after="100" w:before="100" w:line="240"/>
+              <w:ind w:left="100" w:right="100" w:firstLine="0" w:firstLineChars="0"/>
+            </w:pPr>
+            <w:r>
+              <w:rPr>
+                <w:rFonts w:ascii="Helvetica" w:hAnsi="Helvetica" w:eastAsia="Helvetica" w:cs="Helvetica"/>
+                <w:i w:val="false"/>
+                <w:b w:val="false"/>
+                <w:u w:val="none"/>
+                <w:sz w:val="22"/>
+                <w:szCs w:val="22"/>
+                <w:color w:val="000000"/>
+              </w:rPr>
+              <w:t xml:space="preserve">424 (46%)</w:t>
+            </w:r>
+          </w:p>
+        </w:tc>
+        <w:tc>
+          <w:tcPr>
+            <w:tcBorders>
+              <w:bottom w:val="none" w:sz="0" w:space="0" w:color="000000"/>
+              <w:top w:val="none" w:sz="0" w:space="0" w:color="000000"/>
+              <w:left w:val="none" w:sz="0" w:space="0" w:color="000000"/>
+              <w:right w:val="none" w:sz="0" w:space="0" w:color="000000"/>
+            </w:tcBorders>
+            <w:shd w:val="clear" w:color="auto" w:fill="FFFFFF"/>
+            <w:tcMar>
+              <w:top w:w="0" w:type="dxa"/>
+              <w:bottom w:w="0" w:type="dxa"/>
+              <w:left w:w="0" w:type="dxa"/>
+              <w:right w:w="0" w:type="dxa"/>
+            </w:tcMar>
+            <w:vAlign w:val="top"/>
+          </w:tcPr>
+          <w:p>
+            <w:pPr>
+              <w:pStyle w:val="Normal"/>
+              <w:jc w:val="center"/>
+              <w:pBdr>
+                <w:bottom w:val="none" w:sz="0" w:space="0" w:color="000000"/>
+                <w:top w:val="none" w:sz="0" w:space="0" w:color="000000"/>
+                <w:left w:val="none" w:sz="0" w:space="0" w:color="000000"/>
+                <w:right w:val="none" w:sz="0" w:space="0" w:color="000000"/>
+              </w:pBdr>
+              <w:spacing w:after="100" w:before="100" w:line="240"/>
+              <w:ind w:left="100" w:right="100" w:firstLine="0" w:firstLineChars="0"/>
+            </w:pPr>
+            <w:r>
+              <w:rPr>
+                <w:rFonts w:ascii="Helvetica" w:hAnsi="Helvetica" w:eastAsia="Helvetica" w:cs="Helvetica"/>
+                <w:i w:val="false"/>
+                <w:b w:val="false"/>
+                <w:u w:val="none"/>
+                <w:sz w:val="22"/>
+                <w:szCs w:val="22"/>
+                <w:color w:val="000000"/>
+              </w:rPr>
+              <w:t xml:space="preserve">92 (38%)</w:t>
             </w:r>
           </w:p>
         </w:tc>
@@ -3377,139 +3377,139 @@
                 <w:szCs w:val="22"/>
                 <w:color w:val="000000"/>
               </w:rPr>
-              <w:t xml:space="preserve">661 (100%)</w:t>
-            </w:r>
-          </w:p>
-        </w:tc>
-        <w:tc>
-          <w:tcPr>
-            <w:tcBorders>
-              <w:bottom w:val="none" w:sz="0" w:space="0" w:color="000000"/>
-              <w:top w:val="none" w:sz="0" w:space="0" w:color="000000"/>
-              <w:left w:val="none" w:sz="0" w:space="0" w:color="000000"/>
-              <w:right w:val="none" w:sz="0" w:space="0" w:color="000000"/>
-            </w:tcBorders>
-            <w:shd w:val="clear" w:color="auto" w:fill="FFFFFF"/>
-            <w:tcMar>
-              <w:top w:w="0" w:type="dxa"/>
-              <w:bottom w:w="0" w:type="dxa"/>
-              <w:left w:w="0" w:type="dxa"/>
-              <w:right w:w="0" w:type="dxa"/>
-            </w:tcMar>
-            <w:vAlign w:val="top"/>
-          </w:tcPr>
-          <w:p>
-            <w:pPr>
-              <w:pStyle w:val="Normal"/>
-              <w:jc w:val="center"/>
-              <w:pBdr>
-                <w:bottom w:val="none" w:sz="0" w:space="0" w:color="000000"/>
-                <w:top w:val="none" w:sz="0" w:space="0" w:color="000000"/>
-                <w:left w:val="none" w:sz="0" w:space="0" w:color="000000"/>
-                <w:right w:val="none" w:sz="0" w:space="0" w:color="000000"/>
-              </w:pBdr>
-              <w:spacing w:after="100" w:before="100" w:line="240"/>
-              <w:ind w:left="100" w:right="100" w:firstLine="0" w:firstLineChars="0"/>
-            </w:pPr>
-            <w:r>
-              <w:rPr>
-                <w:rFonts w:ascii="Helvetica" w:hAnsi="Helvetica" w:eastAsia="Helvetica" w:cs="Helvetica"/>
-                <w:i w:val="false"/>
-                <w:b w:val="false"/>
-                <w:u w:val="none"/>
-                <w:sz w:val="22"/>
-                <w:szCs w:val="22"/>
-                <w:color w:val="000000"/>
-              </w:rPr>
-              <w:t xml:space="preserve">17 (2.6%)</w:t>
-            </w:r>
-          </w:p>
-        </w:tc>
-        <w:tc>
-          <w:tcPr>
-            <w:tcBorders>
-              <w:bottom w:val="none" w:sz="0" w:space="0" w:color="000000"/>
-              <w:top w:val="none" w:sz="0" w:space="0" w:color="000000"/>
-              <w:left w:val="none" w:sz="0" w:space="0" w:color="000000"/>
-              <w:right w:val="none" w:sz="0" w:space="0" w:color="000000"/>
-            </w:tcBorders>
-            <w:shd w:val="clear" w:color="auto" w:fill="FFFFFF"/>
-            <w:tcMar>
-              <w:top w:w="0" w:type="dxa"/>
-              <w:bottom w:w="0" w:type="dxa"/>
-              <w:left w:w="0" w:type="dxa"/>
-              <w:right w:w="0" w:type="dxa"/>
-            </w:tcMar>
-            <w:vAlign w:val="top"/>
-          </w:tcPr>
-          <w:p>
-            <w:pPr>
-              <w:pStyle w:val="Normal"/>
-              <w:jc w:val="center"/>
-              <w:pBdr>
-                <w:bottom w:val="none" w:sz="0" w:space="0" w:color="000000"/>
-                <w:top w:val="none" w:sz="0" w:space="0" w:color="000000"/>
-                <w:left w:val="none" w:sz="0" w:space="0" w:color="000000"/>
-                <w:right w:val="none" w:sz="0" w:space="0" w:color="000000"/>
-              </w:pBdr>
-              <w:spacing w:after="100" w:before="100" w:line="240"/>
-              <w:ind w:left="100" w:right="100" w:firstLine="0" w:firstLineChars="0"/>
-            </w:pPr>
-            <w:r>
-              <w:rPr>
-                <w:rFonts w:ascii="Helvetica" w:hAnsi="Helvetica" w:eastAsia="Helvetica" w:cs="Helvetica"/>
-                <w:i w:val="false"/>
-                <w:b w:val="false"/>
-                <w:u w:val="none"/>
-                <w:sz w:val="22"/>
-                <w:szCs w:val="22"/>
-                <w:color w:val="000000"/>
-              </w:rPr>
-              <w:t xml:space="preserve">492 (74%)</w:t>
-            </w:r>
-          </w:p>
-        </w:tc>
-        <w:tc>
-          <w:tcPr>
-            <w:tcBorders>
-              <w:bottom w:val="none" w:sz="0" w:space="0" w:color="000000"/>
-              <w:top w:val="none" w:sz="0" w:space="0" w:color="000000"/>
-              <w:left w:val="none" w:sz="0" w:space="0" w:color="000000"/>
-              <w:right w:val="none" w:sz="0" w:space="0" w:color="000000"/>
-            </w:tcBorders>
-            <w:shd w:val="clear" w:color="auto" w:fill="FFFFFF"/>
-            <w:tcMar>
-              <w:top w:w="0" w:type="dxa"/>
-              <w:bottom w:w="0" w:type="dxa"/>
-              <w:left w:w="0" w:type="dxa"/>
-              <w:right w:w="0" w:type="dxa"/>
-            </w:tcMar>
-            <w:vAlign w:val="top"/>
-          </w:tcPr>
-          <w:p>
-            <w:pPr>
-              <w:pStyle w:val="Normal"/>
-              <w:jc w:val="center"/>
-              <w:pBdr>
-                <w:bottom w:val="none" w:sz="0" w:space="0" w:color="000000"/>
-                <w:top w:val="none" w:sz="0" w:space="0" w:color="000000"/>
-                <w:left w:val="none" w:sz="0" w:space="0" w:color="000000"/>
-                <w:right w:val="none" w:sz="0" w:space="0" w:color="000000"/>
-              </w:pBdr>
-              <w:spacing w:after="100" w:before="100" w:line="240"/>
-              <w:ind w:left="100" w:right="100" w:firstLine="0" w:firstLineChars="0"/>
-            </w:pPr>
-            <w:r>
-              <w:rPr>
-                <w:rFonts w:ascii="Helvetica" w:hAnsi="Helvetica" w:eastAsia="Helvetica" w:cs="Helvetica"/>
-                <w:i w:val="false"/>
-                <w:b w:val="false"/>
-                <w:u w:val="none"/>
-                <w:sz w:val="22"/>
-                <w:szCs w:val="22"/>
-                <w:color w:val="000000"/>
-              </w:rPr>
-              <w:t xml:space="preserve">152 (23%)</w:t>
+              <w:t xml:space="preserve">661 (55%)</w:t>
+            </w:r>
+          </w:p>
+        </w:tc>
+        <w:tc>
+          <w:tcPr>
+            <w:tcBorders>
+              <w:bottom w:val="none" w:sz="0" w:space="0" w:color="000000"/>
+              <w:top w:val="none" w:sz="0" w:space="0" w:color="000000"/>
+              <w:left w:val="none" w:sz="0" w:space="0" w:color="000000"/>
+              <w:right w:val="none" w:sz="0" w:space="0" w:color="000000"/>
+            </w:tcBorders>
+            <w:shd w:val="clear" w:color="auto" w:fill="FFFFFF"/>
+            <w:tcMar>
+              <w:top w:w="0" w:type="dxa"/>
+              <w:bottom w:w="0" w:type="dxa"/>
+              <w:left w:w="0" w:type="dxa"/>
+              <w:right w:w="0" w:type="dxa"/>
+            </w:tcMar>
+            <w:vAlign w:val="top"/>
+          </w:tcPr>
+          <w:p>
+            <w:pPr>
+              <w:pStyle w:val="Normal"/>
+              <w:jc w:val="center"/>
+              <w:pBdr>
+                <w:bottom w:val="none" w:sz="0" w:space="0" w:color="000000"/>
+                <w:top w:val="none" w:sz="0" w:space="0" w:color="000000"/>
+                <w:left w:val="none" w:sz="0" w:space="0" w:color="000000"/>
+                <w:right w:val="none" w:sz="0" w:space="0" w:color="000000"/>
+              </w:pBdr>
+              <w:spacing w:after="100" w:before="100" w:line="240"/>
+              <w:ind w:left="100" w:right="100" w:firstLine="0" w:firstLineChars="0"/>
+            </w:pPr>
+            <w:r>
+              <w:rPr>
+                <w:rFonts w:ascii="Helvetica" w:hAnsi="Helvetica" w:eastAsia="Helvetica" w:cs="Helvetica"/>
+                <w:i w:val="false"/>
+                <w:b w:val="false"/>
+                <w:u w:val="none"/>
+                <w:sz w:val="22"/>
+                <w:szCs w:val="22"/>
+                <w:color w:val="000000"/>
+              </w:rPr>
+              <w:t xml:space="preserve">17 (41%)</w:t>
+            </w:r>
+          </w:p>
+        </w:tc>
+        <w:tc>
+          <w:tcPr>
+            <w:tcBorders>
+              <w:bottom w:val="none" w:sz="0" w:space="0" w:color="000000"/>
+              <w:top w:val="none" w:sz="0" w:space="0" w:color="000000"/>
+              <w:left w:val="none" w:sz="0" w:space="0" w:color="000000"/>
+              <w:right w:val="none" w:sz="0" w:space="0" w:color="000000"/>
+            </w:tcBorders>
+            <w:shd w:val="clear" w:color="auto" w:fill="FFFFFF"/>
+            <w:tcMar>
+              <w:top w:w="0" w:type="dxa"/>
+              <w:bottom w:w="0" w:type="dxa"/>
+              <w:left w:w="0" w:type="dxa"/>
+              <w:right w:w="0" w:type="dxa"/>
+            </w:tcMar>
+            <w:vAlign w:val="top"/>
+          </w:tcPr>
+          <w:p>
+            <w:pPr>
+              <w:pStyle w:val="Normal"/>
+              <w:jc w:val="center"/>
+              <w:pBdr>
+                <w:bottom w:val="none" w:sz="0" w:space="0" w:color="000000"/>
+                <w:top w:val="none" w:sz="0" w:space="0" w:color="000000"/>
+                <w:left w:val="none" w:sz="0" w:space="0" w:color="000000"/>
+                <w:right w:val="none" w:sz="0" w:space="0" w:color="000000"/>
+              </w:pBdr>
+              <w:spacing w:after="100" w:before="100" w:line="240"/>
+              <w:ind w:left="100" w:right="100" w:firstLine="0" w:firstLineChars="0"/>
+            </w:pPr>
+            <w:r>
+              <w:rPr>
+                <w:rFonts w:ascii="Helvetica" w:hAnsi="Helvetica" w:eastAsia="Helvetica" w:cs="Helvetica"/>
+                <w:i w:val="false"/>
+                <w:b w:val="false"/>
+                <w:u w:val="none"/>
+                <w:sz w:val="22"/>
+                <w:szCs w:val="22"/>
+                <w:color w:val="000000"/>
+              </w:rPr>
+              <w:t xml:space="preserve">492 (54%)</w:t>
+            </w:r>
+          </w:p>
+        </w:tc>
+        <w:tc>
+          <w:tcPr>
+            <w:tcBorders>
+              <w:bottom w:val="none" w:sz="0" w:space="0" w:color="000000"/>
+              <w:top w:val="none" w:sz="0" w:space="0" w:color="000000"/>
+              <w:left w:val="none" w:sz="0" w:space="0" w:color="000000"/>
+              <w:right w:val="none" w:sz="0" w:space="0" w:color="000000"/>
+            </w:tcBorders>
+            <w:shd w:val="clear" w:color="auto" w:fill="FFFFFF"/>
+            <w:tcMar>
+              <w:top w:w="0" w:type="dxa"/>
+              <w:bottom w:w="0" w:type="dxa"/>
+              <w:left w:w="0" w:type="dxa"/>
+              <w:right w:w="0" w:type="dxa"/>
+            </w:tcMar>
+            <w:vAlign w:val="top"/>
+          </w:tcPr>
+          <w:p>
+            <w:pPr>
+              <w:pStyle w:val="Normal"/>
+              <w:jc w:val="center"/>
+              <w:pBdr>
+                <w:bottom w:val="none" w:sz="0" w:space="0" w:color="000000"/>
+                <w:top w:val="none" w:sz="0" w:space="0" w:color="000000"/>
+                <w:left w:val="none" w:sz="0" w:space="0" w:color="000000"/>
+                <w:right w:val="none" w:sz="0" w:space="0" w:color="000000"/>
+              </w:pBdr>
+              <w:spacing w:after="100" w:before="100" w:line="240"/>
+              <w:ind w:left="100" w:right="100" w:firstLine="0" w:firstLineChars="0"/>
+            </w:pPr>
+            <w:r>
+              <w:rPr>
+                <w:rFonts w:ascii="Helvetica" w:hAnsi="Helvetica" w:eastAsia="Helvetica" w:cs="Helvetica"/>
+                <w:i w:val="false"/>
+                <w:b w:val="false"/>
+                <w:u w:val="none"/>
+                <w:sz w:val="22"/>
+                <w:szCs w:val="22"/>
+                <w:color w:val="000000"/>
+              </w:rPr>
+              <w:t xml:space="preserve">152 (62%)</w:t>
             </w:r>
           </w:p>
         </w:tc>
@@ -3829,139 +3829,139 @@
                 <w:szCs w:val="22"/>
                 <w:color w:val="000000"/>
               </w:rPr>
-              <w:t xml:space="preserve">397 (100%)</w:t>
-            </w:r>
-          </w:p>
-        </w:tc>
-        <w:tc>
-          <w:tcPr>
-            <w:tcBorders>
-              <w:bottom w:val="none" w:sz="0" w:space="0" w:color="000000"/>
-              <w:top w:val="none" w:sz="0" w:space="0" w:color="000000"/>
-              <w:left w:val="none" w:sz="0" w:space="0" w:color="000000"/>
-              <w:right w:val="none" w:sz="0" w:space="0" w:color="000000"/>
-            </w:tcBorders>
-            <w:shd w:val="clear" w:color="auto" w:fill="FFFFFF"/>
-            <w:tcMar>
-              <w:top w:w="0" w:type="dxa"/>
-              <w:bottom w:w="0" w:type="dxa"/>
-              <w:left w:w="0" w:type="dxa"/>
-              <w:right w:w="0" w:type="dxa"/>
-            </w:tcMar>
-            <w:vAlign w:val="top"/>
-          </w:tcPr>
-          <w:p>
-            <w:pPr>
-              <w:pStyle w:val="Normal"/>
-              <w:jc w:val="center"/>
-              <w:pBdr>
-                <w:bottom w:val="none" w:sz="0" w:space="0" w:color="000000"/>
-                <w:top w:val="none" w:sz="0" w:space="0" w:color="000000"/>
-                <w:left w:val="none" w:sz="0" w:space="0" w:color="000000"/>
-                <w:right w:val="none" w:sz="0" w:space="0" w:color="000000"/>
-              </w:pBdr>
-              <w:spacing w:after="100" w:before="100" w:line="240"/>
-              <w:ind w:left="100" w:right="100" w:firstLine="0" w:firstLineChars="0"/>
-            </w:pPr>
-            <w:r>
-              <w:rPr>
-                <w:rFonts w:ascii="Helvetica" w:hAnsi="Helvetica" w:eastAsia="Helvetica" w:cs="Helvetica"/>
-                <w:i w:val="false"/>
-                <w:b w:val="false"/>
-                <w:u w:val="none"/>
-                <w:sz w:val="22"/>
-                <w:szCs w:val="22"/>
-                <w:color w:val="000000"/>
-              </w:rPr>
-              <w:t xml:space="preserve">18 (4.5%)</w:t>
-            </w:r>
-          </w:p>
-        </w:tc>
-        <w:tc>
-          <w:tcPr>
-            <w:tcBorders>
-              <w:bottom w:val="none" w:sz="0" w:space="0" w:color="000000"/>
-              <w:top w:val="none" w:sz="0" w:space="0" w:color="000000"/>
-              <w:left w:val="none" w:sz="0" w:space="0" w:color="000000"/>
-              <w:right w:val="none" w:sz="0" w:space="0" w:color="000000"/>
-            </w:tcBorders>
-            <w:shd w:val="clear" w:color="auto" w:fill="FFFFFF"/>
-            <w:tcMar>
-              <w:top w:w="0" w:type="dxa"/>
-              <w:bottom w:w="0" w:type="dxa"/>
-              <w:left w:w="0" w:type="dxa"/>
-              <w:right w:w="0" w:type="dxa"/>
-            </w:tcMar>
-            <w:vAlign w:val="top"/>
-          </w:tcPr>
-          <w:p>
-            <w:pPr>
-              <w:pStyle w:val="Normal"/>
-              <w:jc w:val="center"/>
-              <w:pBdr>
-                <w:bottom w:val="none" w:sz="0" w:space="0" w:color="000000"/>
-                <w:top w:val="none" w:sz="0" w:space="0" w:color="000000"/>
-                <w:left w:val="none" w:sz="0" w:space="0" w:color="000000"/>
-                <w:right w:val="none" w:sz="0" w:space="0" w:color="000000"/>
-              </w:pBdr>
-              <w:spacing w:after="100" w:before="100" w:line="240"/>
-              <w:ind w:left="100" w:right="100" w:firstLine="0" w:firstLineChars="0"/>
-            </w:pPr>
-            <w:r>
-              <w:rPr>
-                <w:rFonts w:ascii="Helvetica" w:hAnsi="Helvetica" w:eastAsia="Helvetica" w:cs="Helvetica"/>
-                <w:i w:val="false"/>
-                <w:b w:val="false"/>
-                <w:u w:val="none"/>
-                <w:sz w:val="22"/>
-                <w:szCs w:val="22"/>
-                <w:color w:val="000000"/>
-              </w:rPr>
-              <w:t xml:space="preserve">305 (77%)</w:t>
-            </w:r>
-          </w:p>
-        </w:tc>
-        <w:tc>
-          <w:tcPr>
-            <w:tcBorders>
-              <w:bottom w:val="none" w:sz="0" w:space="0" w:color="000000"/>
-              <w:top w:val="none" w:sz="0" w:space="0" w:color="000000"/>
-              <w:left w:val="none" w:sz="0" w:space="0" w:color="000000"/>
-              <w:right w:val="none" w:sz="0" w:space="0" w:color="000000"/>
-            </w:tcBorders>
-            <w:shd w:val="clear" w:color="auto" w:fill="FFFFFF"/>
-            <w:tcMar>
-              <w:top w:w="0" w:type="dxa"/>
-              <w:bottom w:w="0" w:type="dxa"/>
-              <w:left w:w="0" w:type="dxa"/>
-              <w:right w:w="0" w:type="dxa"/>
-            </w:tcMar>
-            <w:vAlign w:val="top"/>
-          </w:tcPr>
-          <w:p>
-            <w:pPr>
-              <w:pStyle w:val="Normal"/>
-              <w:jc w:val="center"/>
-              <w:pBdr>
-                <w:bottom w:val="none" w:sz="0" w:space="0" w:color="000000"/>
-                <w:top w:val="none" w:sz="0" w:space="0" w:color="000000"/>
-                <w:left w:val="none" w:sz="0" w:space="0" w:color="000000"/>
-                <w:right w:val="none" w:sz="0" w:space="0" w:color="000000"/>
-              </w:pBdr>
-              <w:spacing w:after="100" w:before="100" w:line="240"/>
-              <w:ind w:left="100" w:right="100" w:firstLine="0" w:firstLineChars="0"/>
-            </w:pPr>
-            <w:r>
-              <w:rPr>
-                <w:rFonts w:ascii="Helvetica" w:hAnsi="Helvetica" w:eastAsia="Helvetica" w:cs="Helvetica"/>
-                <w:i w:val="false"/>
-                <w:b w:val="false"/>
-                <w:u w:val="none"/>
-                <w:sz w:val="22"/>
-                <w:szCs w:val="22"/>
-                <w:color w:val="000000"/>
-              </w:rPr>
-              <w:t xml:space="preserve">74 (19%)</w:t>
+              <w:t xml:space="preserve">397 (33%)</w:t>
+            </w:r>
+          </w:p>
+        </w:tc>
+        <w:tc>
+          <w:tcPr>
+            <w:tcBorders>
+              <w:bottom w:val="none" w:sz="0" w:space="0" w:color="000000"/>
+              <w:top w:val="none" w:sz="0" w:space="0" w:color="000000"/>
+              <w:left w:val="none" w:sz="0" w:space="0" w:color="000000"/>
+              <w:right w:val="none" w:sz="0" w:space="0" w:color="000000"/>
+            </w:tcBorders>
+            <w:shd w:val="clear" w:color="auto" w:fill="FFFFFF"/>
+            <w:tcMar>
+              <w:top w:w="0" w:type="dxa"/>
+              <w:bottom w:w="0" w:type="dxa"/>
+              <w:left w:w="0" w:type="dxa"/>
+              <w:right w:w="0" w:type="dxa"/>
+            </w:tcMar>
+            <w:vAlign w:val="top"/>
+          </w:tcPr>
+          <w:p>
+            <w:pPr>
+              <w:pStyle w:val="Normal"/>
+              <w:jc w:val="center"/>
+              <w:pBdr>
+                <w:bottom w:val="none" w:sz="0" w:space="0" w:color="000000"/>
+                <w:top w:val="none" w:sz="0" w:space="0" w:color="000000"/>
+                <w:left w:val="none" w:sz="0" w:space="0" w:color="000000"/>
+                <w:right w:val="none" w:sz="0" w:space="0" w:color="000000"/>
+              </w:pBdr>
+              <w:spacing w:after="100" w:before="100" w:line="240"/>
+              <w:ind w:left="100" w:right="100" w:firstLine="0" w:firstLineChars="0"/>
+            </w:pPr>
+            <w:r>
+              <w:rPr>
+                <w:rFonts w:ascii="Helvetica" w:hAnsi="Helvetica" w:eastAsia="Helvetica" w:cs="Helvetica"/>
+                <w:i w:val="false"/>
+                <w:b w:val="false"/>
+                <w:u w:val="none"/>
+                <w:sz w:val="22"/>
+                <w:szCs w:val="22"/>
+                <w:color w:val="000000"/>
+              </w:rPr>
+              <w:t xml:space="preserve">18 (44%)</w:t>
+            </w:r>
+          </w:p>
+        </w:tc>
+        <w:tc>
+          <w:tcPr>
+            <w:tcBorders>
+              <w:bottom w:val="none" w:sz="0" w:space="0" w:color="000000"/>
+              <w:top w:val="none" w:sz="0" w:space="0" w:color="000000"/>
+              <w:left w:val="none" w:sz="0" w:space="0" w:color="000000"/>
+              <w:right w:val="none" w:sz="0" w:space="0" w:color="000000"/>
+            </w:tcBorders>
+            <w:shd w:val="clear" w:color="auto" w:fill="FFFFFF"/>
+            <w:tcMar>
+              <w:top w:w="0" w:type="dxa"/>
+              <w:bottom w:w="0" w:type="dxa"/>
+              <w:left w:w="0" w:type="dxa"/>
+              <w:right w:w="0" w:type="dxa"/>
+            </w:tcMar>
+            <w:vAlign w:val="top"/>
+          </w:tcPr>
+          <w:p>
+            <w:pPr>
+              <w:pStyle w:val="Normal"/>
+              <w:jc w:val="center"/>
+              <w:pBdr>
+                <w:bottom w:val="none" w:sz="0" w:space="0" w:color="000000"/>
+                <w:top w:val="none" w:sz="0" w:space="0" w:color="000000"/>
+                <w:left w:val="none" w:sz="0" w:space="0" w:color="000000"/>
+                <w:right w:val="none" w:sz="0" w:space="0" w:color="000000"/>
+              </w:pBdr>
+              <w:spacing w:after="100" w:before="100" w:line="240"/>
+              <w:ind w:left="100" w:right="100" w:firstLine="0" w:firstLineChars="0"/>
+            </w:pPr>
+            <w:r>
+              <w:rPr>
+                <w:rFonts w:ascii="Helvetica" w:hAnsi="Helvetica" w:eastAsia="Helvetica" w:cs="Helvetica"/>
+                <w:i w:val="false"/>
+                <w:b w:val="false"/>
+                <w:u w:val="none"/>
+                <w:sz w:val="22"/>
+                <w:szCs w:val="22"/>
+                <w:color w:val="000000"/>
+              </w:rPr>
+              <w:t xml:space="preserve">305 (33%)</w:t>
+            </w:r>
+          </w:p>
+        </w:tc>
+        <w:tc>
+          <w:tcPr>
+            <w:tcBorders>
+              <w:bottom w:val="none" w:sz="0" w:space="0" w:color="000000"/>
+              <w:top w:val="none" w:sz="0" w:space="0" w:color="000000"/>
+              <w:left w:val="none" w:sz="0" w:space="0" w:color="000000"/>
+              <w:right w:val="none" w:sz="0" w:space="0" w:color="000000"/>
+            </w:tcBorders>
+            <w:shd w:val="clear" w:color="auto" w:fill="FFFFFF"/>
+            <w:tcMar>
+              <w:top w:w="0" w:type="dxa"/>
+              <w:bottom w:w="0" w:type="dxa"/>
+              <w:left w:w="0" w:type="dxa"/>
+              <w:right w:w="0" w:type="dxa"/>
+            </w:tcMar>
+            <w:vAlign w:val="top"/>
+          </w:tcPr>
+          <w:p>
+            <w:pPr>
+              <w:pStyle w:val="Normal"/>
+              <w:jc w:val="center"/>
+              <w:pBdr>
+                <w:bottom w:val="none" w:sz="0" w:space="0" w:color="000000"/>
+                <w:top w:val="none" w:sz="0" w:space="0" w:color="000000"/>
+                <w:left w:val="none" w:sz="0" w:space="0" w:color="000000"/>
+                <w:right w:val="none" w:sz="0" w:space="0" w:color="000000"/>
+              </w:pBdr>
+              <w:spacing w:after="100" w:before="100" w:line="240"/>
+              <w:ind w:left="100" w:right="100" w:firstLine="0" w:firstLineChars="0"/>
+            </w:pPr>
+            <w:r>
+              <w:rPr>
+                <w:rFonts w:ascii="Helvetica" w:hAnsi="Helvetica" w:eastAsia="Helvetica" w:cs="Helvetica"/>
+                <w:i w:val="false"/>
+                <w:b w:val="false"/>
+                <w:u w:val="none"/>
+                <w:sz w:val="22"/>
+                <w:szCs w:val="22"/>
+                <w:color w:val="000000"/>
+              </w:rPr>
+              <w:t xml:space="preserve">74 (30%)</w:t>
             </w:r>
           </w:p>
         </w:tc>
@@ -4055,139 +4055,139 @@
                 <w:szCs w:val="22"/>
                 <w:color w:val="000000"/>
               </w:rPr>
-              <w:t xml:space="preserve">804 (100%)</w:t>
-            </w:r>
-          </w:p>
-        </w:tc>
-        <w:tc>
-          <w:tcPr>
-            <w:tcBorders>
-              <w:bottom w:val="none" w:sz="0" w:space="0" w:color="000000"/>
-              <w:top w:val="none" w:sz="0" w:space="0" w:color="000000"/>
-              <w:left w:val="none" w:sz="0" w:space="0" w:color="000000"/>
-              <w:right w:val="none" w:sz="0" w:space="0" w:color="000000"/>
-            </w:tcBorders>
-            <w:shd w:val="clear" w:color="auto" w:fill="FFFFFF"/>
-            <w:tcMar>
-              <w:top w:w="0" w:type="dxa"/>
-              <w:bottom w:w="0" w:type="dxa"/>
-              <w:left w:w="0" w:type="dxa"/>
-              <w:right w:w="0" w:type="dxa"/>
-            </w:tcMar>
-            <w:vAlign w:val="top"/>
-          </w:tcPr>
-          <w:p>
-            <w:pPr>
-              <w:pStyle w:val="Normal"/>
-              <w:jc w:val="center"/>
-              <w:pBdr>
-                <w:bottom w:val="none" w:sz="0" w:space="0" w:color="000000"/>
-                <w:top w:val="none" w:sz="0" w:space="0" w:color="000000"/>
-                <w:left w:val="none" w:sz="0" w:space="0" w:color="000000"/>
-                <w:right w:val="none" w:sz="0" w:space="0" w:color="000000"/>
-              </w:pBdr>
-              <w:spacing w:after="100" w:before="100" w:line="240"/>
-              <w:ind w:left="100" w:right="100" w:firstLine="0" w:firstLineChars="0"/>
-            </w:pPr>
-            <w:r>
-              <w:rPr>
-                <w:rFonts w:ascii="Helvetica" w:hAnsi="Helvetica" w:eastAsia="Helvetica" w:cs="Helvetica"/>
-                <w:i w:val="false"/>
-                <w:b w:val="false"/>
-                <w:u w:val="none"/>
-                <w:sz w:val="22"/>
-                <w:szCs w:val="22"/>
-                <w:color w:val="000000"/>
-              </w:rPr>
-              <w:t xml:space="preserve">23 (2.9%)</w:t>
-            </w:r>
-          </w:p>
-        </w:tc>
-        <w:tc>
-          <w:tcPr>
-            <w:tcBorders>
-              <w:bottom w:val="none" w:sz="0" w:space="0" w:color="000000"/>
-              <w:top w:val="none" w:sz="0" w:space="0" w:color="000000"/>
-              <w:left w:val="none" w:sz="0" w:space="0" w:color="000000"/>
-              <w:right w:val="none" w:sz="0" w:space="0" w:color="000000"/>
-            </w:tcBorders>
-            <w:shd w:val="clear" w:color="auto" w:fill="FFFFFF"/>
-            <w:tcMar>
-              <w:top w:w="0" w:type="dxa"/>
-              <w:bottom w:w="0" w:type="dxa"/>
-              <w:left w:w="0" w:type="dxa"/>
-              <w:right w:w="0" w:type="dxa"/>
-            </w:tcMar>
-            <w:vAlign w:val="top"/>
-          </w:tcPr>
-          <w:p>
-            <w:pPr>
-              <w:pStyle w:val="Normal"/>
-              <w:jc w:val="center"/>
-              <w:pBdr>
-                <w:bottom w:val="none" w:sz="0" w:space="0" w:color="000000"/>
-                <w:top w:val="none" w:sz="0" w:space="0" w:color="000000"/>
-                <w:left w:val="none" w:sz="0" w:space="0" w:color="000000"/>
-                <w:right w:val="none" w:sz="0" w:space="0" w:color="000000"/>
-              </w:pBdr>
-              <w:spacing w:after="100" w:before="100" w:line="240"/>
-              <w:ind w:left="100" w:right="100" w:firstLine="0" w:firstLineChars="0"/>
-            </w:pPr>
-            <w:r>
-              <w:rPr>
-                <w:rFonts w:ascii="Helvetica" w:hAnsi="Helvetica" w:eastAsia="Helvetica" w:cs="Helvetica"/>
-                <w:i w:val="false"/>
-                <w:b w:val="false"/>
-                <w:u w:val="none"/>
-                <w:sz w:val="22"/>
-                <w:szCs w:val="22"/>
-                <w:color w:val="000000"/>
-              </w:rPr>
-              <w:t xml:space="preserve">611 (76%)</w:t>
-            </w:r>
-          </w:p>
-        </w:tc>
-        <w:tc>
-          <w:tcPr>
-            <w:tcBorders>
-              <w:bottom w:val="none" w:sz="0" w:space="0" w:color="000000"/>
-              <w:top w:val="none" w:sz="0" w:space="0" w:color="000000"/>
-              <w:left w:val="none" w:sz="0" w:space="0" w:color="000000"/>
-              <w:right w:val="none" w:sz="0" w:space="0" w:color="000000"/>
-            </w:tcBorders>
-            <w:shd w:val="clear" w:color="auto" w:fill="FFFFFF"/>
-            <w:tcMar>
-              <w:top w:w="0" w:type="dxa"/>
-              <w:bottom w:w="0" w:type="dxa"/>
-              <w:left w:w="0" w:type="dxa"/>
-              <w:right w:w="0" w:type="dxa"/>
-            </w:tcMar>
-            <w:vAlign w:val="top"/>
-          </w:tcPr>
-          <w:p>
-            <w:pPr>
-              <w:pStyle w:val="Normal"/>
-              <w:jc w:val="center"/>
-              <w:pBdr>
-                <w:bottom w:val="none" w:sz="0" w:space="0" w:color="000000"/>
-                <w:top w:val="none" w:sz="0" w:space="0" w:color="000000"/>
-                <w:left w:val="none" w:sz="0" w:space="0" w:color="000000"/>
-                <w:right w:val="none" w:sz="0" w:space="0" w:color="000000"/>
-              </w:pBdr>
-              <w:spacing w:after="100" w:before="100" w:line="240"/>
-              <w:ind w:left="100" w:right="100" w:firstLine="0" w:firstLineChars="0"/>
-            </w:pPr>
-            <w:r>
-              <w:rPr>
-                <w:rFonts w:ascii="Helvetica" w:hAnsi="Helvetica" w:eastAsia="Helvetica" w:cs="Helvetica"/>
-                <w:i w:val="false"/>
-                <w:b w:val="false"/>
-                <w:u w:val="none"/>
-                <w:sz w:val="22"/>
-                <w:szCs w:val="22"/>
-                <w:color w:val="000000"/>
-              </w:rPr>
-              <w:t xml:space="preserve">170 (21%)</w:t>
+              <w:t xml:space="preserve">804 (67%)</w:t>
+            </w:r>
+          </w:p>
+        </w:tc>
+        <w:tc>
+          <w:tcPr>
+            <w:tcBorders>
+              <w:bottom w:val="none" w:sz="0" w:space="0" w:color="000000"/>
+              <w:top w:val="none" w:sz="0" w:space="0" w:color="000000"/>
+              <w:left w:val="none" w:sz="0" w:space="0" w:color="000000"/>
+              <w:right w:val="none" w:sz="0" w:space="0" w:color="000000"/>
+            </w:tcBorders>
+            <w:shd w:val="clear" w:color="auto" w:fill="FFFFFF"/>
+            <w:tcMar>
+              <w:top w:w="0" w:type="dxa"/>
+              <w:bottom w:w="0" w:type="dxa"/>
+              <w:left w:w="0" w:type="dxa"/>
+              <w:right w:w="0" w:type="dxa"/>
+            </w:tcMar>
+            <w:vAlign w:val="top"/>
+          </w:tcPr>
+          <w:p>
+            <w:pPr>
+              <w:pStyle w:val="Normal"/>
+              <w:jc w:val="center"/>
+              <w:pBdr>
+                <w:bottom w:val="none" w:sz="0" w:space="0" w:color="000000"/>
+                <w:top w:val="none" w:sz="0" w:space="0" w:color="000000"/>
+                <w:left w:val="none" w:sz="0" w:space="0" w:color="000000"/>
+                <w:right w:val="none" w:sz="0" w:space="0" w:color="000000"/>
+              </w:pBdr>
+              <w:spacing w:after="100" w:before="100" w:line="240"/>
+              <w:ind w:left="100" w:right="100" w:firstLine="0" w:firstLineChars="0"/>
+            </w:pPr>
+            <w:r>
+              <w:rPr>
+                <w:rFonts w:ascii="Helvetica" w:hAnsi="Helvetica" w:eastAsia="Helvetica" w:cs="Helvetica"/>
+                <w:i w:val="false"/>
+                <w:b w:val="false"/>
+                <w:u w:val="none"/>
+                <w:sz w:val="22"/>
+                <w:szCs w:val="22"/>
+                <w:color w:val="000000"/>
+              </w:rPr>
+              <w:t xml:space="preserve">23 (56%)</w:t>
+            </w:r>
+          </w:p>
+        </w:tc>
+        <w:tc>
+          <w:tcPr>
+            <w:tcBorders>
+              <w:bottom w:val="none" w:sz="0" w:space="0" w:color="000000"/>
+              <w:top w:val="none" w:sz="0" w:space="0" w:color="000000"/>
+              <w:left w:val="none" w:sz="0" w:space="0" w:color="000000"/>
+              <w:right w:val="none" w:sz="0" w:space="0" w:color="000000"/>
+            </w:tcBorders>
+            <w:shd w:val="clear" w:color="auto" w:fill="FFFFFF"/>
+            <w:tcMar>
+              <w:top w:w="0" w:type="dxa"/>
+              <w:bottom w:w="0" w:type="dxa"/>
+              <w:left w:w="0" w:type="dxa"/>
+              <w:right w:w="0" w:type="dxa"/>
+            </w:tcMar>
+            <w:vAlign w:val="top"/>
+          </w:tcPr>
+          <w:p>
+            <w:pPr>
+              <w:pStyle w:val="Normal"/>
+              <w:jc w:val="center"/>
+              <w:pBdr>
+                <w:bottom w:val="none" w:sz="0" w:space="0" w:color="000000"/>
+                <w:top w:val="none" w:sz="0" w:space="0" w:color="000000"/>
+                <w:left w:val="none" w:sz="0" w:space="0" w:color="000000"/>
+                <w:right w:val="none" w:sz="0" w:space="0" w:color="000000"/>
+              </w:pBdr>
+              <w:spacing w:after="100" w:before="100" w:line="240"/>
+              <w:ind w:left="100" w:right="100" w:firstLine="0" w:firstLineChars="0"/>
+            </w:pPr>
+            <w:r>
+              <w:rPr>
+                <w:rFonts w:ascii="Helvetica" w:hAnsi="Helvetica" w:eastAsia="Helvetica" w:cs="Helvetica"/>
+                <w:i w:val="false"/>
+                <w:b w:val="false"/>
+                <w:u w:val="none"/>
+                <w:sz w:val="22"/>
+                <w:szCs w:val="22"/>
+                <w:color w:val="000000"/>
+              </w:rPr>
+              <w:t xml:space="preserve">611 (67%)</w:t>
+            </w:r>
+          </w:p>
+        </w:tc>
+        <w:tc>
+          <w:tcPr>
+            <w:tcBorders>
+              <w:bottom w:val="none" w:sz="0" w:space="0" w:color="000000"/>
+              <w:top w:val="none" w:sz="0" w:space="0" w:color="000000"/>
+              <w:left w:val="none" w:sz="0" w:space="0" w:color="000000"/>
+              <w:right w:val="none" w:sz="0" w:space="0" w:color="000000"/>
+            </w:tcBorders>
+            <w:shd w:val="clear" w:color="auto" w:fill="FFFFFF"/>
+            <w:tcMar>
+              <w:top w:w="0" w:type="dxa"/>
+              <w:bottom w:w="0" w:type="dxa"/>
+              <w:left w:w="0" w:type="dxa"/>
+              <w:right w:w="0" w:type="dxa"/>
+            </w:tcMar>
+            <w:vAlign w:val="top"/>
+          </w:tcPr>
+          <w:p>
+            <w:pPr>
+              <w:pStyle w:val="Normal"/>
+              <w:jc w:val="center"/>
+              <w:pBdr>
+                <w:bottom w:val="none" w:sz="0" w:space="0" w:color="000000"/>
+                <w:top w:val="none" w:sz="0" w:space="0" w:color="000000"/>
+                <w:left w:val="none" w:sz="0" w:space="0" w:color="000000"/>
+                <w:right w:val="none" w:sz="0" w:space="0" w:color="000000"/>
+              </w:pBdr>
+              <w:spacing w:after="100" w:before="100" w:line="240"/>
+              <w:ind w:left="100" w:right="100" w:firstLine="0" w:firstLineChars="0"/>
+            </w:pPr>
+            <w:r>
+              <w:rPr>
+                <w:rFonts w:ascii="Helvetica" w:hAnsi="Helvetica" w:eastAsia="Helvetica" w:cs="Helvetica"/>
+                <w:i w:val="false"/>
+                <w:b w:val="false"/>
+                <w:u w:val="none"/>
+                <w:sz w:val="22"/>
+                <w:szCs w:val="22"/>
+                <w:color w:val="000000"/>
+              </w:rPr>
+              <w:t xml:space="preserve">170 (70%)</w:t>
             </w:r>
           </w:p>
         </w:tc>
@@ -4507,95 +4507,95 @@
                 <w:szCs w:val="22"/>
                 <w:color w:val="000000"/>
               </w:rPr>
-              <w:t xml:space="preserve">239 (100%)</w:t>
-            </w:r>
-          </w:p>
-        </w:tc>
-        <w:tc>
-          <w:tcPr>
-            <w:tcBorders>
-              <w:bottom w:val="none" w:sz="0" w:space="0" w:color="000000"/>
-              <w:top w:val="none" w:sz="0" w:space="0" w:color="000000"/>
-              <w:left w:val="none" w:sz="0" w:space="0" w:color="000000"/>
-              <w:right w:val="none" w:sz="0" w:space="0" w:color="000000"/>
-            </w:tcBorders>
-            <w:shd w:val="clear" w:color="auto" w:fill="FFFFFF"/>
-            <w:tcMar>
-              <w:top w:w="0" w:type="dxa"/>
-              <w:bottom w:w="0" w:type="dxa"/>
-              <w:left w:w="0" w:type="dxa"/>
-              <w:right w:w="0" w:type="dxa"/>
-            </w:tcMar>
-            <w:vAlign w:val="top"/>
-          </w:tcPr>
-          <w:p>
-            <w:pPr>
-              <w:pStyle w:val="Normal"/>
-              <w:jc w:val="center"/>
-              <w:pBdr>
-                <w:bottom w:val="none" w:sz="0" w:space="0" w:color="000000"/>
-                <w:top w:val="none" w:sz="0" w:space="0" w:color="000000"/>
-                <w:left w:val="none" w:sz="0" w:space="0" w:color="000000"/>
-                <w:right w:val="none" w:sz="0" w:space="0" w:color="000000"/>
-              </w:pBdr>
-              <w:spacing w:after="100" w:before="100" w:line="240"/>
-              <w:ind w:left="100" w:right="100" w:firstLine="0" w:firstLineChars="0"/>
-            </w:pPr>
-            <w:r>
-              <w:rPr>
-                <w:rFonts w:ascii="Helvetica" w:hAnsi="Helvetica" w:eastAsia="Helvetica" w:cs="Helvetica"/>
-                <w:i w:val="false"/>
-                <w:b w:val="false"/>
-                <w:u w:val="none"/>
-                <w:sz w:val="22"/>
-                <w:szCs w:val="22"/>
-                <w:color w:val="000000"/>
-              </w:rPr>
-              <w:t xml:space="preserve">11 (4.6%)</w:t>
-            </w:r>
-          </w:p>
-        </w:tc>
-        <w:tc>
-          <w:tcPr>
-            <w:tcBorders>
-              <w:bottom w:val="none" w:sz="0" w:space="0" w:color="000000"/>
-              <w:top w:val="none" w:sz="0" w:space="0" w:color="000000"/>
-              <w:left w:val="none" w:sz="0" w:space="0" w:color="000000"/>
-              <w:right w:val="none" w:sz="0" w:space="0" w:color="000000"/>
-            </w:tcBorders>
-            <w:shd w:val="clear" w:color="auto" w:fill="FFFFFF"/>
-            <w:tcMar>
-              <w:top w:w="0" w:type="dxa"/>
-              <w:bottom w:w="0" w:type="dxa"/>
-              <w:left w:w="0" w:type="dxa"/>
-              <w:right w:w="0" w:type="dxa"/>
-            </w:tcMar>
-            <w:vAlign w:val="top"/>
-          </w:tcPr>
-          <w:p>
-            <w:pPr>
-              <w:pStyle w:val="Normal"/>
-              <w:jc w:val="center"/>
-              <w:pBdr>
-                <w:bottom w:val="none" w:sz="0" w:space="0" w:color="000000"/>
-                <w:top w:val="none" w:sz="0" w:space="0" w:color="000000"/>
-                <w:left w:val="none" w:sz="0" w:space="0" w:color="000000"/>
-                <w:right w:val="none" w:sz="0" w:space="0" w:color="000000"/>
-              </w:pBdr>
-              <w:spacing w:after="100" w:before="100" w:line="240"/>
-              <w:ind w:left="100" w:right="100" w:firstLine="0" w:firstLineChars="0"/>
-            </w:pPr>
-            <w:r>
-              <w:rPr>
-                <w:rFonts w:ascii="Helvetica" w:hAnsi="Helvetica" w:eastAsia="Helvetica" w:cs="Helvetica"/>
-                <w:i w:val="false"/>
-                <w:b w:val="false"/>
-                <w:u w:val="none"/>
-                <w:sz w:val="22"/>
-                <w:szCs w:val="22"/>
-                <w:color w:val="000000"/>
-              </w:rPr>
-              <w:t xml:space="preserve">197 (82%)</w:t>
+              <w:t xml:space="preserve">239 (20%)</w:t>
+            </w:r>
+          </w:p>
+        </w:tc>
+        <w:tc>
+          <w:tcPr>
+            <w:tcBorders>
+              <w:bottom w:val="none" w:sz="0" w:space="0" w:color="000000"/>
+              <w:top w:val="none" w:sz="0" w:space="0" w:color="000000"/>
+              <w:left w:val="none" w:sz="0" w:space="0" w:color="000000"/>
+              <w:right w:val="none" w:sz="0" w:space="0" w:color="000000"/>
+            </w:tcBorders>
+            <w:shd w:val="clear" w:color="auto" w:fill="FFFFFF"/>
+            <w:tcMar>
+              <w:top w:w="0" w:type="dxa"/>
+              <w:bottom w:w="0" w:type="dxa"/>
+              <w:left w:w="0" w:type="dxa"/>
+              <w:right w:w="0" w:type="dxa"/>
+            </w:tcMar>
+            <w:vAlign w:val="top"/>
+          </w:tcPr>
+          <w:p>
+            <w:pPr>
+              <w:pStyle w:val="Normal"/>
+              <w:jc w:val="center"/>
+              <w:pBdr>
+                <w:bottom w:val="none" w:sz="0" w:space="0" w:color="000000"/>
+                <w:top w:val="none" w:sz="0" w:space="0" w:color="000000"/>
+                <w:left w:val="none" w:sz="0" w:space="0" w:color="000000"/>
+                <w:right w:val="none" w:sz="0" w:space="0" w:color="000000"/>
+              </w:pBdr>
+              <w:spacing w:after="100" w:before="100" w:line="240"/>
+              <w:ind w:left="100" w:right="100" w:firstLine="0" w:firstLineChars="0"/>
+            </w:pPr>
+            <w:r>
+              <w:rPr>
+                <w:rFonts w:ascii="Helvetica" w:hAnsi="Helvetica" w:eastAsia="Helvetica" w:cs="Helvetica"/>
+                <w:i w:val="false"/>
+                <w:b w:val="false"/>
+                <w:u w:val="none"/>
+                <w:sz w:val="22"/>
+                <w:szCs w:val="22"/>
+                <w:color w:val="000000"/>
+              </w:rPr>
+              <w:t xml:space="preserve">11 (27%)</w:t>
+            </w:r>
+          </w:p>
+        </w:tc>
+        <w:tc>
+          <w:tcPr>
+            <w:tcBorders>
+              <w:bottom w:val="none" w:sz="0" w:space="0" w:color="000000"/>
+              <w:top w:val="none" w:sz="0" w:space="0" w:color="000000"/>
+              <w:left w:val="none" w:sz="0" w:space="0" w:color="000000"/>
+              <w:right w:val="none" w:sz="0" w:space="0" w:color="000000"/>
+            </w:tcBorders>
+            <w:shd w:val="clear" w:color="auto" w:fill="FFFFFF"/>
+            <w:tcMar>
+              <w:top w:w="0" w:type="dxa"/>
+              <w:bottom w:w="0" w:type="dxa"/>
+              <w:left w:w="0" w:type="dxa"/>
+              <w:right w:w="0" w:type="dxa"/>
+            </w:tcMar>
+            <w:vAlign w:val="top"/>
+          </w:tcPr>
+          <w:p>
+            <w:pPr>
+              <w:pStyle w:val="Normal"/>
+              <w:jc w:val="center"/>
+              <w:pBdr>
+                <w:bottom w:val="none" w:sz="0" w:space="0" w:color="000000"/>
+                <w:top w:val="none" w:sz="0" w:space="0" w:color="000000"/>
+                <w:left w:val="none" w:sz="0" w:space="0" w:color="000000"/>
+                <w:right w:val="none" w:sz="0" w:space="0" w:color="000000"/>
+              </w:pBdr>
+              <w:spacing w:after="100" w:before="100" w:line="240"/>
+              <w:ind w:left="100" w:right="100" w:firstLine="0" w:firstLineChars="0"/>
+            </w:pPr>
+            <w:r>
+              <w:rPr>
+                <w:rFonts w:ascii="Helvetica" w:hAnsi="Helvetica" w:eastAsia="Helvetica" w:cs="Helvetica"/>
+                <w:i w:val="false"/>
+                <w:b w:val="false"/>
+                <w:u w:val="none"/>
+                <w:sz w:val="22"/>
+                <w:szCs w:val="22"/>
+                <w:color w:val="000000"/>
+              </w:rPr>
+              <w:t xml:space="preserve">197 (22%)</w:t>
             </w:r>
           </w:p>
         </w:tc>
@@ -4733,139 +4733,139 @@
                 <w:szCs w:val="22"/>
                 <w:color w:val="000000"/>
               </w:rPr>
-              <w:t xml:space="preserve">962 (100%)</w:t>
-            </w:r>
-          </w:p>
-        </w:tc>
-        <w:tc>
-          <w:tcPr>
-            <w:tcBorders>
-              <w:bottom w:val="none" w:sz="0" w:space="0" w:color="000000"/>
-              <w:top w:val="none" w:sz="0" w:space="0" w:color="000000"/>
-              <w:left w:val="none" w:sz="0" w:space="0" w:color="000000"/>
-              <w:right w:val="none" w:sz="0" w:space="0" w:color="000000"/>
-            </w:tcBorders>
-            <w:shd w:val="clear" w:color="auto" w:fill="FFFFFF"/>
-            <w:tcMar>
-              <w:top w:w="0" w:type="dxa"/>
-              <w:bottom w:w="0" w:type="dxa"/>
-              <w:left w:w="0" w:type="dxa"/>
-              <w:right w:w="0" w:type="dxa"/>
-            </w:tcMar>
-            <w:vAlign w:val="top"/>
-          </w:tcPr>
-          <w:p>
-            <w:pPr>
-              <w:pStyle w:val="Normal"/>
-              <w:jc w:val="center"/>
-              <w:pBdr>
-                <w:bottom w:val="none" w:sz="0" w:space="0" w:color="000000"/>
-                <w:top w:val="none" w:sz="0" w:space="0" w:color="000000"/>
-                <w:left w:val="none" w:sz="0" w:space="0" w:color="000000"/>
-                <w:right w:val="none" w:sz="0" w:space="0" w:color="000000"/>
-              </w:pBdr>
-              <w:spacing w:after="100" w:before="100" w:line="240"/>
-              <w:ind w:left="100" w:right="100" w:firstLine="0" w:firstLineChars="0"/>
-            </w:pPr>
-            <w:r>
-              <w:rPr>
-                <w:rFonts w:ascii="Helvetica" w:hAnsi="Helvetica" w:eastAsia="Helvetica" w:cs="Helvetica"/>
-                <w:i w:val="false"/>
-                <w:b w:val="false"/>
-                <w:u w:val="none"/>
-                <w:sz w:val="22"/>
-                <w:szCs w:val="22"/>
-                <w:color w:val="000000"/>
-              </w:rPr>
-              <w:t xml:space="preserve">30 (3.1%)</w:t>
-            </w:r>
-          </w:p>
-        </w:tc>
-        <w:tc>
-          <w:tcPr>
-            <w:tcBorders>
-              <w:bottom w:val="none" w:sz="0" w:space="0" w:color="000000"/>
-              <w:top w:val="none" w:sz="0" w:space="0" w:color="000000"/>
-              <w:left w:val="none" w:sz="0" w:space="0" w:color="000000"/>
-              <w:right w:val="none" w:sz="0" w:space="0" w:color="000000"/>
-            </w:tcBorders>
-            <w:shd w:val="clear" w:color="auto" w:fill="FFFFFF"/>
-            <w:tcMar>
-              <w:top w:w="0" w:type="dxa"/>
-              <w:bottom w:w="0" w:type="dxa"/>
-              <w:left w:w="0" w:type="dxa"/>
-              <w:right w:w="0" w:type="dxa"/>
-            </w:tcMar>
-            <w:vAlign w:val="top"/>
-          </w:tcPr>
-          <w:p>
-            <w:pPr>
-              <w:pStyle w:val="Normal"/>
-              <w:jc w:val="center"/>
-              <w:pBdr>
-                <w:bottom w:val="none" w:sz="0" w:space="0" w:color="000000"/>
-                <w:top w:val="none" w:sz="0" w:space="0" w:color="000000"/>
-                <w:left w:val="none" w:sz="0" w:space="0" w:color="000000"/>
-                <w:right w:val="none" w:sz="0" w:space="0" w:color="000000"/>
-              </w:pBdr>
-              <w:spacing w:after="100" w:before="100" w:line="240"/>
-              <w:ind w:left="100" w:right="100" w:firstLine="0" w:firstLineChars="0"/>
-            </w:pPr>
-            <w:r>
-              <w:rPr>
-                <w:rFonts w:ascii="Helvetica" w:hAnsi="Helvetica" w:eastAsia="Helvetica" w:cs="Helvetica"/>
-                <w:i w:val="false"/>
-                <w:b w:val="false"/>
-                <w:u w:val="none"/>
-                <w:sz w:val="22"/>
-                <w:szCs w:val="22"/>
-                <w:color w:val="000000"/>
-              </w:rPr>
-              <w:t xml:space="preserve">719 (75%)</w:t>
-            </w:r>
-          </w:p>
-        </w:tc>
-        <w:tc>
-          <w:tcPr>
-            <w:tcBorders>
-              <w:bottom w:val="none" w:sz="0" w:space="0" w:color="000000"/>
-              <w:top w:val="none" w:sz="0" w:space="0" w:color="000000"/>
-              <w:left w:val="none" w:sz="0" w:space="0" w:color="000000"/>
-              <w:right w:val="none" w:sz="0" w:space="0" w:color="000000"/>
-            </w:tcBorders>
-            <w:shd w:val="clear" w:color="auto" w:fill="FFFFFF"/>
-            <w:tcMar>
-              <w:top w:w="0" w:type="dxa"/>
-              <w:bottom w:w="0" w:type="dxa"/>
-              <w:left w:w="0" w:type="dxa"/>
-              <w:right w:w="0" w:type="dxa"/>
-            </w:tcMar>
-            <w:vAlign w:val="top"/>
-          </w:tcPr>
-          <w:p>
-            <w:pPr>
-              <w:pStyle w:val="Normal"/>
-              <w:jc w:val="center"/>
-              <w:pBdr>
-                <w:bottom w:val="none" w:sz="0" w:space="0" w:color="000000"/>
-                <w:top w:val="none" w:sz="0" w:space="0" w:color="000000"/>
-                <w:left w:val="none" w:sz="0" w:space="0" w:color="000000"/>
-                <w:right w:val="none" w:sz="0" w:space="0" w:color="000000"/>
-              </w:pBdr>
-              <w:spacing w:after="100" w:before="100" w:line="240"/>
-              <w:ind w:left="100" w:right="100" w:firstLine="0" w:firstLineChars="0"/>
-            </w:pPr>
-            <w:r>
-              <w:rPr>
-                <w:rFonts w:ascii="Helvetica" w:hAnsi="Helvetica" w:eastAsia="Helvetica" w:cs="Helvetica"/>
-                <w:i w:val="false"/>
-                <w:b w:val="false"/>
-                <w:u w:val="none"/>
-                <w:sz w:val="22"/>
-                <w:szCs w:val="22"/>
-                <w:color w:val="000000"/>
-              </w:rPr>
-              <w:t xml:space="preserve">213 (22%)</w:t>
+              <w:t xml:space="preserve">962 (80%)</w:t>
+            </w:r>
+          </w:p>
+        </w:tc>
+        <w:tc>
+          <w:tcPr>
+            <w:tcBorders>
+              <w:bottom w:val="none" w:sz="0" w:space="0" w:color="000000"/>
+              <w:top w:val="none" w:sz="0" w:space="0" w:color="000000"/>
+              <w:left w:val="none" w:sz="0" w:space="0" w:color="000000"/>
+              <w:right w:val="none" w:sz="0" w:space="0" w:color="000000"/>
+            </w:tcBorders>
+            <w:shd w:val="clear" w:color="auto" w:fill="FFFFFF"/>
+            <w:tcMar>
+              <w:top w:w="0" w:type="dxa"/>
+              <w:bottom w:w="0" w:type="dxa"/>
+              <w:left w:w="0" w:type="dxa"/>
+              <w:right w:w="0" w:type="dxa"/>
+            </w:tcMar>
+            <w:vAlign w:val="top"/>
+          </w:tcPr>
+          <w:p>
+            <w:pPr>
+              <w:pStyle w:val="Normal"/>
+              <w:jc w:val="center"/>
+              <w:pBdr>
+                <w:bottom w:val="none" w:sz="0" w:space="0" w:color="000000"/>
+                <w:top w:val="none" w:sz="0" w:space="0" w:color="000000"/>
+                <w:left w:val="none" w:sz="0" w:space="0" w:color="000000"/>
+                <w:right w:val="none" w:sz="0" w:space="0" w:color="000000"/>
+              </w:pBdr>
+              <w:spacing w:after="100" w:before="100" w:line="240"/>
+              <w:ind w:left="100" w:right="100" w:firstLine="0" w:firstLineChars="0"/>
+            </w:pPr>
+            <w:r>
+              <w:rPr>
+                <w:rFonts w:ascii="Helvetica" w:hAnsi="Helvetica" w:eastAsia="Helvetica" w:cs="Helvetica"/>
+                <w:i w:val="false"/>
+                <w:b w:val="false"/>
+                <w:u w:val="none"/>
+                <w:sz w:val="22"/>
+                <w:szCs w:val="22"/>
+                <w:color w:val="000000"/>
+              </w:rPr>
+              <w:t xml:space="preserve">30 (73%)</w:t>
+            </w:r>
+          </w:p>
+        </w:tc>
+        <w:tc>
+          <w:tcPr>
+            <w:tcBorders>
+              <w:bottom w:val="none" w:sz="0" w:space="0" w:color="000000"/>
+              <w:top w:val="none" w:sz="0" w:space="0" w:color="000000"/>
+              <w:left w:val="none" w:sz="0" w:space="0" w:color="000000"/>
+              <w:right w:val="none" w:sz="0" w:space="0" w:color="000000"/>
+            </w:tcBorders>
+            <w:shd w:val="clear" w:color="auto" w:fill="FFFFFF"/>
+            <w:tcMar>
+              <w:top w:w="0" w:type="dxa"/>
+              <w:bottom w:w="0" w:type="dxa"/>
+              <w:left w:w="0" w:type="dxa"/>
+              <w:right w:w="0" w:type="dxa"/>
+            </w:tcMar>
+            <w:vAlign w:val="top"/>
+          </w:tcPr>
+          <w:p>
+            <w:pPr>
+              <w:pStyle w:val="Normal"/>
+              <w:jc w:val="center"/>
+              <w:pBdr>
+                <w:bottom w:val="none" w:sz="0" w:space="0" w:color="000000"/>
+                <w:top w:val="none" w:sz="0" w:space="0" w:color="000000"/>
+                <w:left w:val="none" w:sz="0" w:space="0" w:color="000000"/>
+                <w:right w:val="none" w:sz="0" w:space="0" w:color="000000"/>
+              </w:pBdr>
+              <w:spacing w:after="100" w:before="100" w:line="240"/>
+              <w:ind w:left="100" w:right="100" w:firstLine="0" w:firstLineChars="0"/>
+            </w:pPr>
+            <w:r>
+              <w:rPr>
+                <w:rFonts w:ascii="Helvetica" w:hAnsi="Helvetica" w:eastAsia="Helvetica" w:cs="Helvetica"/>
+                <w:i w:val="false"/>
+                <w:b w:val="false"/>
+                <w:u w:val="none"/>
+                <w:sz w:val="22"/>
+                <w:szCs w:val="22"/>
+                <w:color w:val="000000"/>
+              </w:rPr>
+              <w:t xml:space="preserve">719 (78%)</w:t>
+            </w:r>
+          </w:p>
+        </w:tc>
+        <w:tc>
+          <w:tcPr>
+            <w:tcBorders>
+              <w:bottom w:val="none" w:sz="0" w:space="0" w:color="000000"/>
+              <w:top w:val="none" w:sz="0" w:space="0" w:color="000000"/>
+              <w:left w:val="none" w:sz="0" w:space="0" w:color="000000"/>
+              <w:right w:val="none" w:sz="0" w:space="0" w:color="000000"/>
+            </w:tcBorders>
+            <w:shd w:val="clear" w:color="auto" w:fill="FFFFFF"/>
+            <w:tcMar>
+              <w:top w:w="0" w:type="dxa"/>
+              <w:bottom w:w="0" w:type="dxa"/>
+              <w:left w:w="0" w:type="dxa"/>
+              <w:right w:w="0" w:type="dxa"/>
+            </w:tcMar>
+            <w:vAlign w:val="top"/>
+          </w:tcPr>
+          <w:p>
+            <w:pPr>
+              <w:pStyle w:val="Normal"/>
+              <w:jc w:val="center"/>
+              <w:pBdr>
+                <w:bottom w:val="none" w:sz="0" w:space="0" w:color="000000"/>
+                <w:top w:val="none" w:sz="0" w:space="0" w:color="000000"/>
+                <w:left w:val="none" w:sz="0" w:space="0" w:color="000000"/>
+                <w:right w:val="none" w:sz="0" w:space="0" w:color="000000"/>
+              </w:pBdr>
+              <w:spacing w:after="100" w:before="100" w:line="240"/>
+              <w:ind w:left="100" w:right="100" w:firstLine="0" w:firstLineChars="0"/>
+            </w:pPr>
+            <w:r>
+              <w:rPr>
+                <w:rFonts w:ascii="Helvetica" w:hAnsi="Helvetica" w:eastAsia="Helvetica" w:cs="Helvetica"/>
+                <w:i w:val="false"/>
+                <w:b w:val="false"/>
+                <w:u w:val="none"/>
+                <w:sz w:val="22"/>
+                <w:szCs w:val="22"/>
+                <w:color w:val="000000"/>
+              </w:rPr>
+              <w:t xml:space="preserve">213 (87%)</w:t>
             </w:r>
           </w:p>
         </w:tc>
@@ -5185,139 +5185,139 @@
                 <w:szCs w:val="22"/>
                 <w:color w:val="000000"/>
               </w:rPr>
-              <w:t xml:space="preserve">32 (100%)</w:t>
-            </w:r>
-          </w:p>
-        </w:tc>
-        <w:tc>
-          <w:tcPr>
-            <w:tcBorders>
-              <w:bottom w:val="none" w:sz="0" w:space="0" w:color="000000"/>
-              <w:top w:val="none" w:sz="0" w:space="0" w:color="000000"/>
-              <w:left w:val="none" w:sz="0" w:space="0" w:color="000000"/>
-              <w:right w:val="none" w:sz="0" w:space="0" w:color="000000"/>
-            </w:tcBorders>
-            <w:shd w:val="clear" w:color="auto" w:fill="FFFFFF"/>
-            <w:tcMar>
-              <w:top w:w="0" w:type="dxa"/>
-              <w:bottom w:w="0" w:type="dxa"/>
-              <w:left w:w="0" w:type="dxa"/>
-              <w:right w:w="0" w:type="dxa"/>
-            </w:tcMar>
-            <w:vAlign w:val="top"/>
-          </w:tcPr>
-          <w:p>
-            <w:pPr>
-              <w:pStyle w:val="Normal"/>
-              <w:jc w:val="center"/>
-              <w:pBdr>
-                <w:bottom w:val="none" w:sz="0" w:space="0" w:color="000000"/>
-                <w:top w:val="none" w:sz="0" w:space="0" w:color="000000"/>
-                <w:left w:val="none" w:sz="0" w:space="0" w:color="000000"/>
-                <w:right w:val="none" w:sz="0" w:space="0" w:color="000000"/>
-              </w:pBdr>
-              <w:spacing w:after="100" w:before="100" w:line="240"/>
-              <w:ind w:left="100" w:right="100" w:firstLine="0" w:firstLineChars="0"/>
-            </w:pPr>
-            <w:r>
-              <w:rPr>
-                <w:rFonts w:ascii="Helvetica" w:hAnsi="Helvetica" w:eastAsia="Helvetica" w:cs="Helvetica"/>
-                <w:i w:val="false"/>
-                <w:b w:val="false"/>
-                <w:u w:val="none"/>
-                <w:sz w:val="22"/>
-                <w:szCs w:val="22"/>
-                <w:color w:val="000000"/>
-              </w:rPr>
-              <w:t xml:space="preserve">3 (9.4%)</w:t>
-            </w:r>
-          </w:p>
-        </w:tc>
-        <w:tc>
-          <w:tcPr>
-            <w:tcBorders>
-              <w:bottom w:val="none" w:sz="0" w:space="0" w:color="000000"/>
-              <w:top w:val="none" w:sz="0" w:space="0" w:color="000000"/>
-              <w:left w:val="none" w:sz="0" w:space="0" w:color="000000"/>
-              <w:right w:val="none" w:sz="0" w:space="0" w:color="000000"/>
-            </w:tcBorders>
-            <w:shd w:val="clear" w:color="auto" w:fill="FFFFFF"/>
-            <w:tcMar>
-              <w:top w:w="0" w:type="dxa"/>
-              <w:bottom w:w="0" w:type="dxa"/>
-              <w:left w:w="0" w:type="dxa"/>
-              <w:right w:w="0" w:type="dxa"/>
-            </w:tcMar>
-            <w:vAlign w:val="top"/>
-          </w:tcPr>
-          <w:p>
-            <w:pPr>
-              <w:pStyle w:val="Normal"/>
-              <w:jc w:val="center"/>
-              <w:pBdr>
-                <w:bottom w:val="none" w:sz="0" w:space="0" w:color="000000"/>
-                <w:top w:val="none" w:sz="0" w:space="0" w:color="000000"/>
-                <w:left w:val="none" w:sz="0" w:space="0" w:color="000000"/>
-                <w:right w:val="none" w:sz="0" w:space="0" w:color="000000"/>
-              </w:pBdr>
-              <w:spacing w:after="100" w:before="100" w:line="240"/>
-              <w:ind w:left="100" w:right="100" w:firstLine="0" w:firstLineChars="0"/>
-            </w:pPr>
-            <w:r>
-              <w:rPr>
-                <w:rFonts w:ascii="Helvetica" w:hAnsi="Helvetica" w:eastAsia="Helvetica" w:cs="Helvetica"/>
-                <w:i w:val="false"/>
-                <w:b w:val="false"/>
-                <w:u w:val="none"/>
-                <w:sz w:val="22"/>
-                <w:szCs w:val="22"/>
-                <w:color w:val="000000"/>
-              </w:rPr>
-              <w:t xml:space="preserve">25 (78%)</w:t>
-            </w:r>
-          </w:p>
-        </w:tc>
-        <w:tc>
-          <w:tcPr>
-            <w:tcBorders>
-              <w:bottom w:val="none" w:sz="0" w:space="0" w:color="000000"/>
-              <w:top w:val="none" w:sz="0" w:space="0" w:color="000000"/>
-              <w:left w:val="none" w:sz="0" w:space="0" w:color="000000"/>
-              <w:right w:val="none" w:sz="0" w:space="0" w:color="000000"/>
-            </w:tcBorders>
-            <w:shd w:val="clear" w:color="auto" w:fill="FFFFFF"/>
-            <w:tcMar>
-              <w:top w:w="0" w:type="dxa"/>
-              <w:bottom w:w="0" w:type="dxa"/>
-              <w:left w:w="0" w:type="dxa"/>
-              <w:right w:w="0" w:type="dxa"/>
-            </w:tcMar>
-            <w:vAlign w:val="top"/>
-          </w:tcPr>
-          <w:p>
-            <w:pPr>
-              <w:pStyle w:val="Normal"/>
-              <w:jc w:val="center"/>
-              <w:pBdr>
-                <w:bottom w:val="none" w:sz="0" w:space="0" w:color="000000"/>
-                <w:top w:val="none" w:sz="0" w:space="0" w:color="000000"/>
-                <w:left w:val="none" w:sz="0" w:space="0" w:color="000000"/>
-                <w:right w:val="none" w:sz="0" w:space="0" w:color="000000"/>
-              </w:pBdr>
-              <w:spacing w:after="100" w:before="100" w:line="240"/>
-              <w:ind w:left="100" w:right="100" w:firstLine="0" w:firstLineChars="0"/>
-            </w:pPr>
-            <w:r>
-              <w:rPr>
-                <w:rFonts w:ascii="Helvetica" w:hAnsi="Helvetica" w:eastAsia="Helvetica" w:cs="Helvetica"/>
-                <w:i w:val="false"/>
-                <w:b w:val="false"/>
-                <w:u w:val="none"/>
-                <w:sz w:val="22"/>
-                <w:szCs w:val="22"/>
-                <w:color w:val="000000"/>
-              </w:rPr>
-              <w:t xml:space="preserve">4 (13%)</w:t>
+              <w:t xml:space="preserve">32 (2.7%)</w:t>
+            </w:r>
+          </w:p>
+        </w:tc>
+        <w:tc>
+          <w:tcPr>
+            <w:tcBorders>
+              <w:bottom w:val="none" w:sz="0" w:space="0" w:color="000000"/>
+              <w:top w:val="none" w:sz="0" w:space="0" w:color="000000"/>
+              <w:left w:val="none" w:sz="0" w:space="0" w:color="000000"/>
+              <w:right w:val="none" w:sz="0" w:space="0" w:color="000000"/>
+            </w:tcBorders>
+            <w:shd w:val="clear" w:color="auto" w:fill="FFFFFF"/>
+            <w:tcMar>
+              <w:top w:w="0" w:type="dxa"/>
+              <w:bottom w:w="0" w:type="dxa"/>
+              <w:left w:w="0" w:type="dxa"/>
+              <w:right w:w="0" w:type="dxa"/>
+            </w:tcMar>
+            <w:vAlign w:val="top"/>
+          </w:tcPr>
+          <w:p>
+            <w:pPr>
+              <w:pStyle w:val="Normal"/>
+              <w:jc w:val="center"/>
+              <w:pBdr>
+                <w:bottom w:val="none" w:sz="0" w:space="0" w:color="000000"/>
+                <w:top w:val="none" w:sz="0" w:space="0" w:color="000000"/>
+                <w:left w:val="none" w:sz="0" w:space="0" w:color="000000"/>
+                <w:right w:val="none" w:sz="0" w:space="0" w:color="000000"/>
+              </w:pBdr>
+              <w:spacing w:after="100" w:before="100" w:line="240"/>
+              <w:ind w:left="100" w:right="100" w:firstLine="0" w:firstLineChars="0"/>
+            </w:pPr>
+            <w:r>
+              <w:rPr>
+                <w:rFonts w:ascii="Helvetica" w:hAnsi="Helvetica" w:eastAsia="Helvetica" w:cs="Helvetica"/>
+                <w:i w:val="false"/>
+                <w:b w:val="false"/>
+                <w:u w:val="none"/>
+                <w:sz w:val="22"/>
+                <w:szCs w:val="22"/>
+                <w:color w:val="000000"/>
+              </w:rPr>
+              <w:t xml:space="preserve">3 (7.3%)</w:t>
+            </w:r>
+          </w:p>
+        </w:tc>
+        <w:tc>
+          <w:tcPr>
+            <w:tcBorders>
+              <w:bottom w:val="none" w:sz="0" w:space="0" w:color="000000"/>
+              <w:top w:val="none" w:sz="0" w:space="0" w:color="000000"/>
+              <w:left w:val="none" w:sz="0" w:space="0" w:color="000000"/>
+              <w:right w:val="none" w:sz="0" w:space="0" w:color="000000"/>
+            </w:tcBorders>
+            <w:shd w:val="clear" w:color="auto" w:fill="FFFFFF"/>
+            <w:tcMar>
+              <w:top w:w="0" w:type="dxa"/>
+              <w:bottom w:w="0" w:type="dxa"/>
+              <w:left w:w="0" w:type="dxa"/>
+              <w:right w:w="0" w:type="dxa"/>
+            </w:tcMar>
+            <w:vAlign w:val="top"/>
+          </w:tcPr>
+          <w:p>
+            <w:pPr>
+              <w:pStyle w:val="Normal"/>
+              <w:jc w:val="center"/>
+              <w:pBdr>
+                <w:bottom w:val="none" w:sz="0" w:space="0" w:color="000000"/>
+                <w:top w:val="none" w:sz="0" w:space="0" w:color="000000"/>
+                <w:left w:val="none" w:sz="0" w:space="0" w:color="000000"/>
+                <w:right w:val="none" w:sz="0" w:space="0" w:color="000000"/>
+              </w:pBdr>
+              <w:spacing w:after="100" w:before="100" w:line="240"/>
+              <w:ind w:left="100" w:right="100" w:firstLine="0" w:firstLineChars="0"/>
+            </w:pPr>
+            <w:r>
+              <w:rPr>
+                <w:rFonts w:ascii="Helvetica" w:hAnsi="Helvetica" w:eastAsia="Helvetica" w:cs="Helvetica"/>
+                <w:i w:val="false"/>
+                <w:b w:val="false"/>
+                <w:u w:val="none"/>
+                <w:sz w:val="22"/>
+                <w:szCs w:val="22"/>
+                <w:color w:val="000000"/>
+              </w:rPr>
+              <w:t xml:space="preserve">25 (2.7%)</w:t>
+            </w:r>
+          </w:p>
+        </w:tc>
+        <w:tc>
+          <w:tcPr>
+            <w:tcBorders>
+              <w:bottom w:val="none" w:sz="0" w:space="0" w:color="000000"/>
+              <w:top w:val="none" w:sz="0" w:space="0" w:color="000000"/>
+              <w:left w:val="none" w:sz="0" w:space="0" w:color="000000"/>
+              <w:right w:val="none" w:sz="0" w:space="0" w:color="000000"/>
+            </w:tcBorders>
+            <w:shd w:val="clear" w:color="auto" w:fill="FFFFFF"/>
+            <w:tcMar>
+              <w:top w:w="0" w:type="dxa"/>
+              <w:bottom w:w="0" w:type="dxa"/>
+              <w:left w:w="0" w:type="dxa"/>
+              <w:right w:w="0" w:type="dxa"/>
+            </w:tcMar>
+            <w:vAlign w:val="top"/>
+          </w:tcPr>
+          <w:p>
+            <w:pPr>
+              <w:pStyle w:val="Normal"/>
+              <w:jc w:val="center"/>
+              <w:pBdr>
+                <w:bottom w:val="none" w:sz="0" w:space="0" w:color="000000"/>
+                <w:top w:val="none" w:sz="0" w:space="0" w:color="000000"/>
+                <w:left w:val="none" w:sz="0" w:space="0" w:color="000000"/>
+                <w:right w:val="none" w:sz="0" w:space="0" w:color="000000"/>
+              </w:pBdr>
+              <w:spacing w:after="100" w:before="100" w:line="240"/>
+              <w:ind w:left="100" w:right="100" w:firstLine="0" w:firstLineChars="0"/>
+            </w:pPr>
+            <w:r>
+              <w:rPr>
+                <w:rFonts w:ascii="Helvetica" w:hAnsi="Helvetica" w:eastAsia="Helvetica" w:cs="Helvetica"/>
+                <w:i w:val="false"/>
+                <w:b w:val="false"/>
+                <w:u w:val="none"/>
+                <w:sz w:val="22"/>
+                <w:szCs w:val="22"/>
+                <w:color w:val="000000"/>
+              </w:rPr>
+              <w:t xml:space="preserve">4 (1.6%)</w:t>
             </w:r>
           </w:p>
         </w:tc>
@@ -5411,139 +5411,139 @@
                 <w:szCs w:val="22"/>
                 <w:color w:val="000000"/>
               </w:rPr>
-              <w:t xml:space="preserve">93 (100%)</w:t>
-            </w:r>
-          </w:p>
-        </w:tc>
-        <w:tc>
-          <w:tcPr>
-            <w:tcBorders>
-              <w:bottom w:val="none" w:sz="0" w:space="0" w:color="000000"/>
-              <w:top w:val="none" w:sz="0" w:space="0" w:color="000000"/>
-              <w:left w:val="none" w:sz="0" w:space="0" w:color="000000"/>
-              <w:right w:val="none" w:sz="0" w:space="0" w:color="000000"/>
-            </w:tcBorders>
-            <w:shd w:val="clear" w:color="auto" w:fill="FFFFFF"/>
-            <w:tcMar>
-              <w:top w:w="0" w:type="dxa"/>
-              <w:bottom w:w="0" w:type="dxa"/>
-              <w:left w:w="0" w:type="dxa"/>
-              <w:right w:w="0" w:type="dxa"/>
-            </w:tcMar>
-            <w:vAlign w:val="top"/>
-          </w:tcPr>
-          <w:p>
-            <w:pPr>
-              <w:pStyle w:val="Normal"/>
-              <w:jc w:val="center"/>
-              <w:pBdr>
-                <w:bottom w:val="none" w:sz="0" w:space="0" w:color="000000"/>
-                <w:top w:val="none" w:sz="0" w:space="0" w:color="000000"/>
-                <w:left w:val="none" w:sz="0" w:space="0" w:color="000000"/>
-                <w:right w:val="none" w:sz="0" w:space="0" w:color="000000"/>
-              </w:pBdr>
-              <w:spacing w:after="100" w:before="100" w:line="240"/>
-              <w:ind w:left="100" w:right="100" w:firstLine="0" w:firstLineChars="0"/>
-            </w:pPr>
-            <w:r>
-              <w:rPr>
-                <w:rFonts w:ascii="Helvetica" w:hAnsi="Helvetica" w:eastAsia="Helvetica" w:cs="Helvetica"/>
-                <w:i w:val="false"/>
-                <w:b w:val="false"/>
-                <w:u w:val="none"/>
-                <w:sz w:val="22"/>
-                <w:szCs w:val="22"/>
-                <w:color w:val="000000"/>
-              </w:rPr>
-              <w:t xml:space="preserve">3 (3.2%)</w:t>
-            </w:r>
-          </w:p>
-        </w:tc>
-        <w:tc>
-          <w:tcPr>
-            <w:tcBorders>
-              <w:bottom w:val="none" w:sz="0" w:space="0" w:color="000000"/>
-              <w:top w:val="none" w:sz="0" w:space="0" w:color="000000"/>
-              <w:left w:val="none" w:sz="0" w:space="0" w:color="000000"/>
-              <w:right w:val="none" w:sz="0" w:space="0" w:color="000000"/>
-            </w:tcBorders>
-            <w:shd w:val="clear" w:color="auto" w:fill="FFFFFF"/>
-            <w:tcMar>
-              <w:top w:w="0" w:type="dxa"/>
-              <w:bottom w:w="0" w:type="dxa"/>
-              <w:left w:w="0" w:type="dxa"/>
-              <w:right w:w="0" w:type="dxa"/>
-            </w:tcMar>
-            <w:vAlign w:val="top"/>
-          </w:tcPr>
-          <w:p>
-            <w:pPr>
-              <w:pStyle w:val="Normal"/>
-              <w:jc w:val="center"/>
-              <w:pBdr>
-                <w:bottom w:val="none" w:sz="0" w:space="0" w:color="000000"/>
-                <w:top w:val="none" w:sz="0" w:space="0" w:color="000000"/>
-                <w:left w:val="none" w:sz="0" w:space="0" w:color="000000"/>
-                <w:right w:val="none" w:sz="0" w:space="0" w:color="000000"/>
-              </w:pBdr>
-              <w:spacing w:after="100" w:before="100" w:line="240"/>
-              <w:ind w:left="100" w:right="100" w:firstLine="0" w:firstLineChars="0"/>
-            </w:pPr>
-            <w:r>
-              <w:rPr>
-                <w:rFonts w:ascii="Helvetica" w:hAnsi="Helvetica" w:eastAsia="Helvetica" w:cs="Helvetica"/>
-                <w:i w:val="false"/>
-                <w:b w:val="false"/>
-                <w:u w:val="none"/>
-                <w:sz w:val="22"/>
-                <w:szCs w:val="22"/>
-                <w:color w:val="000000"/>
-              </w:rPr>
-              <w:t xml:space="preserve">77 (83%)</w:t>
-            </w:r>
-          </w:p>
-        </w:tc>
-        <w:tc>
-          <w:tcPr>
-            <w:tcBorders>
-              <w:bottom w:val="none" w:sz="0" w:space="0" w:color="000000"/>
-              <w:top w:val="none" w:sz="0" w:space="0" w:color="000000"/>
-              <w:left w:val="none" w:sz="0" w:space="0" w:color="000000"/>
-              <w:right w:val="none" w:sz="0" w:space="0" w:color="000000"/>
-            </w:tcBorders>
-            <w:shd w:val="clear" w:color="auto" w:fill="FFFFFF"/>
-            <w:tcMar>
-              <w:top w:w="0" w:type="dxa"/>
-              <w:bottom w:w="0" w:type="dxa"/>
-              <w:left w:w="0" w:type="dxa"/>
-              <w:right w:w="0" w:type="dxa"/>
-            </w:tcMar>
-            <w:vAlign w:val="top"/>
-          </w:tcPr>
-          <w:p>
-            <w:pPr>
-              <w:pStyle w:val="Normal"/>
-              <w:jc w:val="center"/>
-              <w:pBdr>
-                <w:bottom w:val="none" w:sz="0" w:space="0" w:color="000000"/>
-                <w:top w:val="none" w:sz="0" w:space="0" w:color="000000"/>
-                <w:left w:val="none" w:sz="0" w:space="0" w:color="000000"/>
-                <w:right w:val="none" w:sz="0" w:space="0" w:color="000000"/>
-              </w:pBdr>
-              <w:spacing w:after="100" w:before="100" w:line="240"/>
-              <w:ind w:left="100" w:right="100" w:firstLine="0" w:firstLineChars="0"/>
-            </w:pPr>
-            <w:r>
-              <w:rPr>
-                <w:rFonts w:ascii="Helvetica" w:hAnsi="Helvetica" w:eastAsia="Helvetica" w:cs="Helvetica"/>
-                <w:i w:val="false"/>
-                <w:b w:val="false"/>
-                <w:u w:val="none"/>
-                <w:sz w:val="22"/>
-                <w:szCs w:val="22"/>
-                <w:color w:val="000000"/>
-              </w:rPr>
-              <w:t xml:space="preserve">13 (14%)</w:t>
+              <w:t xml:space="preserve">93 (7.7%)</w:t>
+            </w:r>
+          </w:p>
+        </w:tc>
+        <w:tc>
+          <w:tcPr>
+            <w:tcBorders>
+              <w:bottom w:val="none" w:sz="0" w:space="0" w:color="000000"/>
+              <w:top w:val="none" w:sz="0" w:space="0" w:color="000000"/>
+              <w:left w:val="none" w:sz="0" w:space="0" w:color="000000"/>
+              <w:right w:val="none" w:sz="0" w:space="0" w:color="000000"/>
+            </w:tcBorders>
+            <w:shd w:val="clear" w:color="auto" w:fill="FFFFFF"/>
+            <w:tcMar>
+              <w:top w:w="0" w:type="dxa"/>
+              <w:bottom w:w="0" w:type="dxa"/>
+              <w:left w:w="0" w:type="dxa"/>
+              <w:right w:w="0" w:type="dxa"/>
+            </w:tcMar>
+            <w:vAlign w:val="top"/>
+          </w:tcPr>
+          <w:p>
+            <w:pPr>
+              <w:pStyle w:val="Normal"/>
+              <w:jc w:val="center"/>
+              <w:pBdr>
+                <w:bottom w:val="none" w:sz="0" w:space="0" w:color="000000"/>
+                <w:top w:val="none" w:sz="0" w:space="0" w:color="000000"/>
+                <w:left w:val="none" w:sz="0" w:space="0" w:color="000000"/>
+                <w:right w:val="none" w:sz="0" w:space="0" w:color="000000"/>
+              </w:pBdr>
+              <w:spacing w:after="100" w:before="100" w:line="240"/>
+              <w:ind w:left="100" w:right="100" w:firstLine="0" w:firstLineChars="0"/>
+            </w:pPr>
+            <w:r>
+              <w:rPr>
+                <w:rFonts w:ascii="Helvetica" w:hAnsi="Helvetica" w:eastAsia="Helvetica" w:cs="Helvetica"/>
+                <w:i w:val="false"/>
+                <w:b w:val="false"/>
+                <w:u w:val="none"/>
+                <w:sz w:val="22"/>
+                <w:szCs w:val="22"/>
+                <w:color w:val="000000"/>
+              </w:rPr>
+              <w:t xml:space="preserve">3 (7.3%)</w:t>
+            </w:r>
+          </w:p>
+        </w:tc>
+        <w:tc>
+          <w:tcPr>
+            <w:tcBorders>
+              <w:bottom w:val="none" w:sz="0" w:space="0" w:color="000000"/>
+              <w:top w:val="none" w:sz="0" w:space="0" w:color="000000"/>
+              <w:left w:val="none" w:sz="0" w:space="0" w:color="000000"/>
+              <w:right w:val="none" w:sz="0" w:space="0" w:color="000000"/>
+            </w:tcBorders>
+            <w:shd w:val="clear" w:color="auto" w:fill="FFFFFF"/>
+            <w:tcMar>
+              <w:top w:w="0" w:type="dxa"/>
+              <w:bottom w:w="0" w:type="dxa"/>
+              <w:left w:w="0" w:type="dxa"/>
+              <w:right w:w="0" w:type="dxa"/>
+            </w:tcMar>
+            <w:vAlign w:val="top"/>
+          </w:tcPr>
+          <w:p>
+            <w:pPr>
+              <w:pStyle w:val="Normal"/>
+              <w:jc w:val="center"/>
+              <w:pBdr>
+                <w:bottom w:val="none" w:sz="0" w:space="0" w:color="000000"/>
+                <w:top w:val="none" w:sz="0" w:space="0" w:color="000000"/>
+                <w:left w:val="none" w:sz="0" w:space="0" w:color="000000"/>
+                <w:right w:val="none" w:sz="0" w:space="0" w:color="000000"/>
+              </w:pBdr>
+              <w:spacing w:after="100" w:before="100" w:line="240"/>
+              <w:ind w:left="100" w:right="100" w:firstLine="0" w:firstLineChars="0"/>
+            </w:pPr>
+            <w:r>
+              <w:rPr>
+                <w:rFonts w:ascii="Helvetica" w:hAnsi="Helvetica" w:eastAsia="Helvetica" w:cs="Helvetica"/>
+                <w:i w:val="false"/>
+                <w:b w:val="false"/>
+                <w:u w:val="none"/>
+                <w:sz w:val="22"/>
+                <w:szCs w:val="22"/>
+                <w:color w:val="000000"/>
+              </w:rPr>
+              <w:t xml:space="preserve">77 (8.4%)</w:t>
+            </w:r>
+          </w:p>
+        </w:tc>
+        <w:tc>
+          <w:tcPr>
+            <w:tcBorders>
+              <w:bottom w:val="none" w:sz="0" w:space="0" w:color="000000"/>
+              <w:top w:val="none" w:sz="0" w:space="0" w:color="000000"/>
+              <w:left w:val="none" w:sz="0" w:space="0" w:color="000000"/>
+              <w:right w:val="none" w:sz="0" w:space="0" w:color="000000"/>
+            </w:tcBorders>
+            <w:shd w:val="clear" w:color="auto" w:fill="FFFFFF"/>
+            <w:tcMar>
+              <w:top w:w="0" w:type="dxa"/>
+              <w:bottom w:w="0" w:type="dxa"/>
+              <w:left w:w="0" w:type="dxa"/>
+              <w:right w:w="0" w:type="dxa"/>
+            </w:tcMar>
+            <w:vAlign w:val="top"/>
+          </w:tcPr>
+          <w:p>
+            <w:pPr>
+              <w:pStyle w:val="Normal"/>
+              <w:jc w:val="center"/>
+              <w:pBdr>
+                <w:bottom w:val="none" w:sz="0" w:space="0" w:color="000000"/>
+                <w:top w:val="none" w:sz="0" w:space="0" w:color="000000"/>
+                <w:left w:val="none" w:sz="0" w:space="0" w:color="000000"/>
+                <w:right w:val="none" w:sz="0" w:space="0" w:color="000000"/>
+              </w:pBdr>
+              <w:spacing w:after="100" w:before="100" w:line="240"/>
+              <w:ind w:left="100" w:right="100" w:firstLine="0" w:firstLineChars="0"/>
+            </w:pPr>
+            <w:r>
+              <w:rPr>
+                <w:rFonts w:ascii="Helvetica" w:hAnsi="Helvetica" w:eastAsia="Helvetica" w:cs="Helvetica"/>
+                <w:i w:val="false"/>
+                <w:b w:val="false"/>
+                <w:u w:val="none"/>
+                <w:sz w:val="22"/>
+                <w:szCs w:val="22"/>
+                <w:color w:val="000000"/>
+              </w:rPr>
+              <w:t xml:space="preserve">13 (5.3%)</w:t>
             </w:r>
           </w:p>
         </w:tc>
@@ -5637,7 +5637,7 @@
                 <w:szCs w:val="22"/>
                 <w:color w:val="000000"/>
               </w:rPr>
-              <w:t xml:space="preserve">1,076 (100%)</w:t>
+              <w:t xml:space="preserve">1,076 (90%)</w:t>
             </w:r>
           </w:p>
         </w:tc>
@@ -5681,7 +5681,7 @@
                 <w:szCs w:val="22"/>
                 <w:color w:val="000000"/>
               </w:rPr>
-              <w:t xml:space="preserve">35 (3.3%)</w:t>
+              <w:t xml:space="preserve">35 (85%)</w:t>
             </w:r>
           </w:p>
         </w:tc>
@@ -5725,7 +5725,7 @@
                 <w:szCs w:val="22"/>
                 <w:color w:val="000000"/>
               </w:rPr>
-              <w:t xml:space="preserve">814 (76%)</w:t>
+              <w:t xml:space="preserve">814 (89%)</w:t>
             </w:r>
           </w:p>
         </w:tc>
@@ -5769,7 +5769,7 @@
                 <w:szCs w:val="22"/>
                 <w:color w:val="000000"/>
               </w:rPr>
-              <w:t xml:space="preserve">227 (21%)</w:t>
+              <w:t xml:space="preserve">227 (93%)</w:t>
             </w:r>
           </w:p>
         </w:tc>

</xml_diff>